<commit_message>
Handleidingen achter de login: docs/ afgeschermd, menu-item Instellingen > Handleidingen
De map docs/ had geen .htaccess, waardoor het runbook (met de beschrijving van de
beveiligingsmaatregelen) openbaar opvraagbaar zou zijn. Nu: Require all denied, en
admin/handleiding.php serveert de meegeleverde HTML-versie achter de beheer-login,
met een overzicht van de vijf handleidingen.

- includes/hulp.php: hulp_handleidingen() is nu de bron (titel, voor wie, bestand) en meteen
  de whitelist van de route; hulp_url() wijst naar /admin/handleiding.php?doc=...#anker.
  Uitleg toegevoegd voor Foutenlog, Importeren en Handleidingen (22 schermen).
- layout_top.php: submenu-item Handleidingen (zonder rechtencheck: uitleg is voor iedereen
  met toegang) en het dode deploy-item uit de submenufilter.
- docs/ai/harnas/handleiding_check.php: controleert dat elk anker uit hulp.php echt in de
  gegenereerde HTML staat en dat elke handleiding als md, html en docx bestaat (37 checks).
</commit_message>
<xml_diff>
--- a/docs/handleiding/word/handleiding_beheer.docx
+++ b/docs/handleiding/word/handleiding_beheer.docx
@@ -124,6 +124,41 @@
           <w:lang w:val="nl"/>
         </w:rPr>
         <w:t xml:space="preserve">er expliciet bij.</w:t>
+      </w:r>
+    </w:p>
+    <w:p>
+      <w:pPr>
+        <w:pStyle w:val="BodyText"/>
+      </w:pPr>
+      <w:r>
+        <w:rPr>
+          <w:lang w:val="nl"/>
+        </w:rPr>
+        <w:t xml:space="preserve">Je vindt deze handleiding terug onder Beheer › Instellingen › Handleidingen, samen met de uitleg</w:t>
+      </w:r>
+      <w:r>
+        <w:rPr>
+          <w:lang w:val="nl"/>
+        </w:rPr>
+        <w:t xml:space="preserve"> </w:t>
+      </w:r>
+      <w:r>
+        <w:rPr>
+          <w:lang w:val="nl"/>
+        </w:rPr>
+        <w:t xml:space="preserve">voor de penningmeester, voor sollicitanten en voor het technisch beheer. Het vraagteken rechtsboven</w:t>
+      </w:r>
+      <w:r>
+        <w:rPr>
+          <w:lang w:val="nl"/>
+        </w:rPr>
+        <w:t xml:space="preserve"> </w:t>
+      </w:r>
+      <w:r>
+        <w:rPr>
+          <w:lang w:val="nl"/>
+        </w:rPr>
+        <w:t xml:space="preserve">op elk scherm geeft de korte uitleg van dát scherm, met een link naar het bijbehorende hoofdstuk.</w:t>
       </w:r>
     </w:p>
     <w:bookmarkStart w:id="9" w:name="inhoud"/>

</xml_diff>

<commit_message>
Bewaartermijnen: afgewezen 4 weken na afwijzing, seintje max 12 maanden (2.99.0)
- includes/avg_wissen.php: wat er bij een sollicitatie en een persoon gewist wordt staat op
  één plek; portaal/gegevens.php (zelf verwijderen) en het opschonen gebruiken het allebei.
  Daarmee verdwijnen nu ook oudergegevens, afmeld-token, seintje en privacy_ip.
- Opschonen stap 1: afgewezen en afgehaakt, termijn in weken (bewaar.afgewezen_weken,
  standaard 4) vanaf gewijzigd_op in plaats van 6 maanden na aangemeld_op. Een geldig seintje
  (bewaar.seintje_mnd, max 12) stelt uit. Per persoon een transactie. Wist nu ook BLK,
  beschikbaarheid, notities, beoordelingen, documenten en mail_log-adressen.
- Instellingen › Bewaartermijnen: velden voor weken en seintje. Teksten in mail, portaal en
  seintje-pagina lezen de termijn uit de instelling.
- Handleiding beheer: Berichten (tabs, vorige seizoenen, {{aanmeld_url}}), Seintje, tabel.
- Changelog 2.99.0.
</commit_message>
<xml_diff>
--- a/docs/handleiding/word/handleiding_beheer.docx
+++ b/docs/handleiding/word/handleiding_beheer.docx
@@ -6670,63 +6670,75 @@
         <w:rPr>
           <w:lang w:val="nl"/>
         </w:rPr>
-        <w:t xml:space="preserve">(zonder mail) kan niet met een knop. Wil je bijvoorbeeld iemand</w:t>
-      </w:r>
-      <w:r>
-        <w:rPr>
-          <w:lang w:val="nl"/>
-        </w:rPr>
-        <w:t xml:space="preserve"> </w:t>
-      </w:r>
-      <w:r>
-        <w:rPr>
-          <w:lang w:val="nl"/>
-        </w:rPr>
-        <w:t xml:space="preserve">opnieuw op Uitgenodigd SD zetten zonder nieuwe uitnodiging, zet dan eerst onder Instellingen ›</w:t>
-      </w:r>
-      <w:r>
-        <w:rPr>
-          <w:lang w:val="nl"/>
-        </w:rPr>
-        <w:t xml:space="preserve"> </w:t>
-      </w:r>
-      <w:r>
-        <w:rPr>
-          <w:lang w:val="nl"/>
-        </w:rPr>
-        <w:t xml:space="preserve">SMS, WhatsApp &amp; meldingen het kanaal van dat meldingstype op</w:t>
-      </w:r>
-      <w:r>
-        <w:rPr>
-          <w:lang w:val="nl"/>
-        </w:rPr>
-        <w:t xml:space="preserve"> </w:t>
-      </w:r>
-      <w:r>
-        <w:rPr>
-          <w:b/>
-          <w:bCs/>
-          <w:lang w:val="nl"/>
-        </w:rPr>
-        <w:t xml:space="preserve">Uit</w:t>
-      </w:r>
-      <w:r>
-        <w:rPr>
-          <w:lang w:val="nl"/>
-        </w:rPr>
-        <w:t xml:space="preserve">, doe de wijziging, en zet</w:t>
-      </w:r>
-      <w:r>
-        <w:rPr>
-          <w:lang w:val="nl"/>
-        </w:rPr>
-        <w:t xml:space="preserve"> </w:t>
-      </w:r>
-      <w:r>
-        <w:rPr>
-          <w:lang w:val="nl"/>
-        </w:rPr>
-        <w:t xml:space="preserve">het kanaal daarna terug. Vergeet die laatste stap niet.</w:t>
+        <w:t xml:space="preserve">(zonder bericht) kan met een vinkje. Wijzig je de fase in het dossier,</w:t>
+      </w:r>
+      <w:r>
+        <w:rPr>
+          <w:lang w:val="nl"/>
+        </w:rPr>
+        <w:t xml:space="preserve"> </w:t>
+      </w:r>
+      <w:r>
+        <w:rPr>
+          <w:lang w:val="nl"/>
+        </w:rPr>
+        <w:t xml:space="preserve">dan staat in het bevestigingsvenster</w:t>
+      </w:r>
+      <w:r>
+        <w:rPr>
+          <w:lang w:val="nl"/>
+        </w:rPr>
+        <w:t xml:space="preserve"> </w:t>
+      </w:r>
+      <w:r>
+        <w:rPr>
+          <w:b/>
+          <w:bCs/>
+          <w:lang w:val="nl"/>
+        </w:rPr>
+        <w:t xml:space="preserve">Zonder bericht doorvoeren</w:t>
+      </w:r>
+      <w:r>
+        <w:rPr>
+          <w:lang w:val="nl"/>
+        </w:rPr>
+        <w:t xml:space="preserve">; doe je het als bulkactie vanuit</w:t>
+      </w:r>
+      <w:r>
+        <w:rPr>
+          <w:lang w:val="nl"/>
+        </w:rPr>
+        <w:t xml:space="preserve"> </w:t>
+      </w:r>
+      <w:r>
+        <w:rPr>
+          <w:lang w:val="nl"/>
+        </w:rPr>
+        <w:t xml:space="preserve">de sollicitantenlijst, dan staat hetzelfde vinkje op het tussenscherm dat eerst laat zien wat er</w:t>
+      </w:r>
+      <w:r>
+        <w:rPr>
+          <w:lang w:val="nl"/>
+        </w:rPr>
+        <w:t xml:space="preserve"> </w:t>
+      </w:r>
+      <w:r>
+        <w:rPr>
+          <w:lang w:val="nl"/>
+        </w:rPr>
+        <w:t xml:space="preserve">gaat gebeuren. De fase verandert wel, er gaat alleen niets de deur uit. Gebruik dit als je ze zelf</w:t>
+      </w:r>
+      <w:r>
+        <w:rPr>
+          <w:lang w:val="nl"/>
+        </w:rPr>
+        <w:t xml:space="preserve"> </w:t>
+      </w:r>
+      <w:r>
+        <w:rPr>
+          <w:lang w:val="nl"/>
+        </w:rPr>
+        <w:t xml:space="preserve">belt of het al besproken is. In het logboek blijft zichtbaar dát het stil ging.</w:t>
       </w:r>
     </w:p>
     <w:p>
@@ -10591,7 +10603,7 @@
         <w:rPr>
           <w:lang w:val="nl"/>
         </w:rPr>
-        <w:t xml:space="preserve">Beheer › Instellingen › Berichten</w:t>
+        <w:t xml:space="preserve">Beheer › Berichten (tabbladen Nieuw bericht, Verzonden en Gepland)</w:t>
       </w:r>
       <w:r>
         <w:br/>
@@ -11017,6 +11029,171 @@
         </w:rPr>
         <w:t xml:space="preserve">het dossier of een bulkactie, dan staan die personen al aangevinkt.</w:t>
       </w:r>
+      <w:r>
+        <w:rPr>
+          <w:lang w:val="nl"/>
+        </w:rPr>
+        <w:t xml:space="preserve"> </w:t>
+      </w:r>
+      <w:r>
+        <w:rPr>
+          <w:lang w:val="nl"/>
+        </w:rPr>
+        <w:t xml:space="preserve">Onder de fases staan twee groepen uit</w:t>
+      </w:r>
+      <w:r>
+        <w:rPr>
+          <w:lang w:val="nl"/>
+        </w:rPr>
+        <w:t xml:space="preserve"> </w:t>
+      </w:r>
+      <w:r>
+        <w:rPr>
+          <w:b/>
+          <w:bCs/>
+          <w:lang w:val="nl"/>
+        </w:rPr>
+        <w:t xml:space="preserve">vorige seizoenen</w:t>
+      </w:r>
+      <w:r>
+        <w:rPr>
+          <w:lang w:val="nl"/>
+        </w:rPr>
+        <w:t xml:space="preserve">:</w:t>
+      </w:r>
+      <w:r>
+        <w:rPr>
+          <w:lang w:val="nl"/>
+        </w:rPr>
+        <w:t xml:space="preserve"> </w:t>
+      </w:r>
+      <w:r>
+        <w:rPr>
+          <w:b/>
+          <w:bCs/>
+          <w:lang w:val="nl"/>
+        </w:rPr>
+        <w:t xml:space="preserve">Oud-strandwachten</w:t>
+      </w:r>
+      <w:r>
+        <w:rPr>
+          <w:lang w:val="nl"/>
+        </w:rPr>
+        <w:t xml:space="preserve"> </w:t>
+      </w:r>
+      <w:r>
+        <w:rPr>
+          <w:lang w:val="nl"/>
+        </w:rPr>
+        <w:t xml:space="preserve">(ooit</w:t>
+      </w:r>
+      <w:r>
+        <w:rPr>
+          <w:lang w:val="nl"/>
+        </w:rPr>
+        <w:t xml:space="preserve"> </w:t>
+      </w:r>
+      <w:r>
+        <w:rPr>
+          <w:lang w:val="nl"/>
+        </w:rPr>
+        <w:t xml:space="preserve">aangenomen) en</w:t>
+      </w:r>
+      <w:r>
+        <w:rPr>
+          <w:lang w:val="nl"/>
+        </w:rPr>
+        <w:t xml:space="preserve"> </w:t>
+      </w:r>
+      <w:r>
+        <w:rPr>
+          <w:b/>
+          <w:bCs/>
+          <w:lang w:val="nl"/>
+        </w:rPr>
+        <w:t xml:space="preserve">Seintje gevraagd</w:t>
+      </w:r>
+      <w:r>
+        <w:rPr>
+          <w:lang w:val="nl"/>
+        </w:rPr>
+        <w:t xml:space="preserve"> </w:t>
+      </w:r>
+      <w:r>
+        <w:rPr>
+          <w:lang w:val="nl"/>
+        </w:rPr>
+        <w:t xml:space="preserve">(afgewezen, maar zelf om bericht bij de volgende werving</w:t>
+      </w:r>
+      <w:r>
+        <w:rPr>
+          <w:lang w:val="nl"/>
+        </w:rPr>
+        <w:t xml:space="preserve"> </w:t>
+      </w:r>
+      <w:r>
+        <w:rPr>
+          <w:lang w:val="nl"/>
+        </w:rPr>
+        <w:t xml:space="preserve">gevraagd, zie</w:t>
+      </w:r>
+      <w:r>
+        <w:rPr>
+          <w:lang w:val="nl"/>
+        </w:rPr>
+        <w:t xml:space="preserve"> </w:t>
+      </w:r>
+      <w:hyperlink w:anchor="seintje-bij-de-volgende-werving">
+        <w:r>
+          <w:rPr>
+            <w:rStyle w:val="Hyperlink"/>
+            <w:lang w:val="nl"/>
+          </w:rPr>
+          <w:t xml:space="preserve">Seintje bij de volgende werving</w:t>
+        </w:r>
+      </w:hyperlink>
+      <w:r>
+        <w:rPr>
+          <w:lang w:val="nl"/>
+        </w:rPr>
+        <w:t xml:space="preserve">). Afgewezen</w:t>
+      </w:r>
+      <w:r>
+        <w:rPr>
+          <w:lang w:val="nl"/>
+        </w:rPr>
+        <w:t xml:space="preserve"> </w:t>
+      </w:r>
+      <w:r>
+        <w:rPr>
+          <w:lang w:val="nl"/>
+        </w:rPr>
+        <w:t xml:space="preserve">mensen zónder seintje staan er bewust niet in: die mag je geen wervingsbericht sturen. Wie zich</w:t>
+      </w:r>
+      <w:r>
+        <w:rPr>
+          <w:lang w:val="nl"/>
+        </w:rPr>
+        <w:t xml:space="preserve"> </w:t>
+      </w:r>
+      <w:r>
+        <w:rPr>
+          <w:lang w:val="nl"/>
+        </w:rPr>
+        <w:t xml:space="preserve">al voor dit seizoen heeft aangemeld of zich heeft afgemeld, staat er ook niet in. In een</w:t>
+      </w:r>
+      <w:r>
+        <w:rPr>
+          <w:lang w:val="nl"/>
+        </w:rPr>
+        <w:t xml:space="preserve"> </w:t>
+      </w:r>
+      <w:r>
+        <w:rPr>
+          <w:lang w:val="nl"/>
+        </w:rPr>
+        <w:t xml:space="preserve">bericht aan deze groepen is {{seizoen_naam}} het huidige seizoen.</w:t>
+      </w:r>
     </w:p>
     <w:p>
       <w:pPr>
@@ -11050,7 +11227,19 @@
         <w:rPr>
           <w:lang w:val="nl"/>
         </w:rPr>
-        <w:t xml:space="preserve">die in de tekst te zetten. Ze werken ook in het onderwerp en de korte tekst.</w:t>
+        <w:t xml:space="preserve">die in de tekst te zetten. Ze werken ook in het onderwerp en de korte tekst. {{aanmeld_url}}</w:t>
+      </w:r>
+      <w:r>
+        <w:rPr>
+          <w:lang w:val="nl"/>
+        </w:rPr>
+        <w:t xml:space="preserve"> </w:t>
+      </w:r>
+      <w:r>
+        <w:rPr>
+          <w:lang w:val="nl"/>
+        </w:rPr>
+        <w:t xml:space="preserve">is de link naar het aanmeldformulier, handig voor een wervingsbericht.</w:t>
       </w:r>
     </w:p>
     <w:p>
@@ -12035,7 +12224,7 @@
         <w:rPr>
           <w:lang w:val="nl"/>
         </w:rPr>
-        <w:t xml:space="preserve">Beheer › Instellingen › Geplande berichten (regels) en Beheer › Instellingen ›</w:t>
+        <w:t xml:space="preserve">Beheer › Berichten › Gepland (regels) en Beheer › Instellingen ›</w:t>
       </w:r>
       <w:r>
         <w:rPr>
@@ -14889,7 +15078,7 @@
     </w:p>
     <w:bookmarkEnd w:id="54"/>
     <w:bookmarkEnd w:id="55"/>
-    <w:bookmarkStart w:id="60" w:name="privacy-en-avg-verzoeken"/>
+    <w:bookmarkStart w:id="61" w:name="privacy-en-avg-verzoeken"/>
     <w:p>
       <w:pPr>
         <w:pStyle w:val="Heading1"/>
@@ -15505,21 +15694,21 @@
               <w:rPr>
                 <w:lang w:val="nl"/>
               </w:rPr>
-              <w:t xml:space="preserve">6 maanden</w:t>
-            </w:r>
-          </w:p>
-        </w:tc>
-        <w:tc>
-          <w:tcPr/>
-          <w:p>
-            <w:pPr>
-              <w:pStyle w:val="Compact"/>
-            </w:pPr>
-            <w:r>
-              <w:rPr>
-                <w:lang w:val="nl"/>
-              </w:rPr>
-              <w:t xml:space="preserve">Persoonsgegevens worden geanonimiseerd; de statistiek blijft.</w:t>
+              <w:t xml:space="preserve">4 weken na de afwijzing</w:t>
+            </w:r>
+          </w:p>
+        </w:tc>
+        <w:tc>
+          <w:tcPr/>
+          <w:p>
+            <w:pPr>
+              <w:pStyle w:val="Compact"/>
+            </w:pPr>
+            <w:r>
+              <w:rPr>
+                <w:lang w:val="nl"/>
+              </w:rPr>
+              <w:t xml:space="preserve">Persoonsgegevens, formulier, beschikbaarheid, notities, beoordelingen, documenten en adressen in het berichtenlog worden gewist; de statistiek blijft. Geldt ook voor afgehaakt. Wie om een seintje vroeg, blijft tot dat verloopt.</w:t>
             </w:r>
           </w:p>
         </w:tc>
@@ -15535,35 +15724,35 @@
               <w:rPr>
                 <w:lang w:val="nl"/>
               </w:rPr>
-              <w:t xml:space="preserve">Gezondheidsgegevens</w:t>
-            </w:r>
-          </w:p>
-        </w:tc>
-        <w:tc>
-          <w:tcPr/>
-          <w:p>
-            <w:pPr>
-              <w:pStyle w:val="Compact"/>
-            </w:pPr>
-            <w:r>
-              <w:rPr>
-                <w:lang w:val="nl"/>
-              </w:rPr>
-              <w:t xml:space="preserve">0</w:t>
-            </w:r>
-          </w:p>
-        </w:tc>
-        <w:tc>
-          <w:tcPr/>
-          <w:p>
-            <w:pPr>
-              <w:pStyle w:val="Compact"/>
-            </w:pPr>
-            <w:r>
-              <w:rPr>
-                <w:lang w:val="nl"/>
-              </w:rPr>
-              <w:t xml:space="preserve">0 = verwijderen zodra de sollicitatie is afgewezen; anders zoveel maanden na ondertekening. Het feit dát er getekend is blijft.</w:t>
+              <w:t xml:space="preserve">Seintje bij de volgende werving</w:t>
+            </w:r>
+          </w:p>
+        </w:tc>
+        <w:tc>
+          <w:tcPr/>
+          <w:p>
+            <w:pPr>
+              <w:pStyle w:val="Compact"/>
+            </w:pPr>
+            <w:r>
+              <w:rPr>
+                <w:lang w:val="nl"/>
+              </w:rPr>
+              <w:t xml:space="preserve">12 maanden</w:t>
+            </w:r>
+          </w:p>
+        </w:tc>
+        <w:tc>
+          <w:tcPr/>
+          <w:p>
+            <w:pPr>
+              <w:pStyle w:val="Compact"/>
+            </w:pPr>
+            <w:r>
+              <w:rPr>
+                <w:lang w:val="nl"/>
+              </w:rPr>
+              <w:t xml:space="preserve">Zo lang geldt de toestemming; daarna wordt de persoon geanonimiseerd zoals hierboven. Maximaal 12, want dat beloven de mail en het portaal.</w:t>
             </w:r>
           </w:p>
         </w:tc>
@@ -15579,35 +15768,35 @@
               <w:rPr>
                 <w:lang w:val="nl"/>
               </w:rPr>
-              <w:t xml:space="preserve">AI-invoertekst</w:t>
-            </w:r>
-          </w:p>
-        </w:tc>
-        <w:tc>
-          <w:tcPr/>
-          <w:p>
-            <w:pPr>
-              <w:pStyle w:val="Compact"/>
-            </w:pPr>
-            <w:r>
-              <w:rPr>
-                <w:lang w:val="nl"/>
-              </w:rPr>
-              <w:t xml:space="preserve">3 maanden</w:t>
-            </w:r>
-          </w:p>
-        </w:tc>
-        <w:tc>
-          <w:tcPr/>
-          <w:p>
-            <w:pPr>
-              <w:pStyle w:val="Compact"/>
-            </w:pPr>
-            <w:r>
-              <w:rPr>
-                <w:lang w:val="nl"/>
-              </w:rPr>
-              <w:t xml:space="preserve">De vrije beschikbaarheidstekst die naar de AI-dienst ging wordt gewist.</w:t>
+              <w:t xml:space="preserve">Gezondheidsgegevens</w:t>
+            </w:r>
+          </w:p>
+        </w:tc>
+        <w:tc>
+          <w:tcPr/>
+          <w:p>
+            <w:pPr>
+              <w:pStyle w:val="Compact"/>
+            </w:pPr>
+            <w:r>
+              <w:rPr>
+                <w:lang w:val="nl"/>
+              </w:rPr>
+              <w:t xml:space="preserve">0</w:t>
+            </w:r>
+          </w:p>
+        </w:tc>
+        <w:tc>
+          <w:tcPr/>
+          <w:p>
+            <w:pPr>
+              <w:pStyle w:val="Compact"/>
+            </w:pPr>
+            <w:r>
+              <w:rPr>
+                <w:lang w:val="nl"/>
+              </w:rPr>
+              <w:t xml:space="preserve">0 = verwijderen zodra de sollicitatie is afgewezen; anders zoveel maanden na ondertekening. Het feit dát er getekend is blijft.</w:t>
             </w:r>
           </w:p>
         </w:tc>
@@ -15623,7 +15812,7 @@
               <w:rPr>
                 <w:lang w:val="nl"/>
               </w:rPr>
-              <w:t xml:space="preserve">Niet-voltooide aanmeldingen</w:t>
+              <w:t xml:space="preserve">AI-invoertekst</w:t>
             </w:r>
           </w:p>
         </w:tc>
@@ -15651,7 +15840,7 @@
               <w:rPr>
                 <w:lang w:val="nl"/>
               </w:rPr>
-              <w:t xml:space="preserve">Aanmeldingen die in Aangemeld bleven staan zonder formulier of beschikbaarheid worden verwijderd.</w:t>
+              <w:t xml:space="preserve">De vrije beschikbaarheidstekst die naar de AI-dienst ging wordt gewist.</w:t>
             </w:r>
           </w:p>
         </w:tc>
@@ -15667,35 +15856,35 @@
               <w:rPr>
                 <w:lang w:val="nl"/>
               </w:rPr>
-              <w:t xml:space="preserve">Berichtenlog</w:t>
-            </w:r>
-          </w:p>
-        </w:tc>
-        <w:tc>
-          <w:tcPr/>
-          <w:p>
-            <w:pPr>
-              <w:pStyle w:val="Compact"/>
-            </w:pPr>
-            <w:r>
-              <w:rPr>
-                <w:lang w:val="nl"/>
-              </w:rPr>
-              <w:t xml:space="preserve">12 maanden</w:t>
-            </w:r>
-          </w:p>
-        </w:tc>
-        <w:tc>
-          <w:tcPr/>
-          <w:p>
-            <w:pPr>
-              <w:pStyle w:val="Compact"/>
-            </w:pPr>
-            <w:r>
-              <w:rPr>
-                <w:lang w:val="nl"/>
-              </w:rPr>
-              <w:t xml:space="preserve">Logregels verwijderen.</w:t>
+              <w:t xml:space="preserve">Niet-voltooide aanmeldingen</w:t>
+            </w:r>
+          </w:p>
+        </w:tc>
+        <w:tc>
+          <w:tcPr/>
+          <w:p>
+            <w:pPr>
+              <w:pStyle w:val="Compact"/>
+            </w:pPr>
+            <w:r>
+              <w:rPr>
+                <w:lang w:val="nl"/>
+              </w:rPr>
+              <w:t xml:space="preserve">3 maanden</w:t>
+            </w:r>
+          </w:p>
+        </w:tc>
+        <w:tc>
+          <w:tcPr/>
+          <w:p>
+            <w:pPr>
+              <w:pStyle w:val="Compact"/>
+            </w:pPr>
+            <w:r>
+              <w:rPr>
+                <w:lang w:val="nl"/>
+              </w:rPr>
+              <w:t xml:space="preserve">Aanmeldingen die in Aangemeld bleven staan zonder formulier of beschikbaarheid worden verwijderd.</w:t>
             </w:r>
           </w:p>
         </w:tc>
@@ -15711,35 +15900,35 @@
               <w:rPr>
                 <w:lang w:val="nl"/>
               </w:rPr>
-              <w:t xml:space="preserve">Inhoud van berichten</w:t>
-            </w:r>
-          </w:p>
-        </w:tc>
-        <w:tc>
-          <w:tcPr/>
-          <w:p>
-            <w:pPr>
-              <w:pStyle w:val="Compact"/>
-            </w:pPr>
-            <w:r>
-              <w:rPr>
-                <w:lang w:val="nl"/>
-              </w:rPr>
-              <w:t xml:space="preserve">3 maanden</w:t>
-            </w:r>
-          </w:p>
-        </w:tc>
-        <w:tc>
-          <w:tcPr/>
-          <w:p>
-            <w:pPr>
-              <w:pStyle w:val="Compact"/>
-            </w:pPr>
-            <w:r>
-              <w:rPr>
-                <w:lang w:val="nl"/>
-              </w:rPr>
-              <w:t xml:space="preserve">Alleen de tekst wordt leeggemaakt; onderwerp en samenvatting blijven.</w:t>
+              <w:t xml:space="preserve">Berichtenlog</w:t>
+            </w:r>
+          </w:p>
+        </w:tc>
+        <w:tc>
+          <w:tcPr/>
+          <w:p>
+            <w:pPr>
+              <w:pStyle w:val="Compact"/>
+            </w:pPr>
+            <w:r>
+              <w:rPr>
+                <w:lang w:val="nl"/>
+              </w:rPr>
+              <w:t xml:space="preserve">12 maanden</w:t>
+            </w:r>
+          </w:p>
+        </w:tc>
+        <w:tc>
+          <w:tcPr/>
+          <w:p>
+            <w:pPr>
+              <w:pStyle w:val="Compact"/>
+            </w:pPr>
+            <w:r>
+              <w:rPr>
+                <w:lang w:val="nl"/>
+              </w:rPr>
+              <w:t xml:space="preserve">Logregels verwijderen.</w:t>
             </w:r>
           </w:p>
         </w:tc>
@@ -15755,35 +15944,35 @@
               <w:rPr>
                 <w:lang w:val="nl"/>
               </w:rPr>
-              <w:t xml:space="preserve">Losse bijlagen</w:t>
-            </w:r>
-          </w:p>
-        </w:tc>
-        <w:tc>
-          <w:tcPr/>
-          <w:p>
-            <w:pPr>
-              <w:pStyle w:val="Compact"/>
-            </w:pPr>
-            <w:r>
-              <w:rPr>
-                <w:lang w:val="nl"/>
-              </w:rPr>
-              <w:t xml:space="preserve">12 maanden</w:t>
-            </w:r>
-          </w:p>
-        </w:tc>
-        <w:tc>
-          <w:tcPr/>
-          <w:p>
-            <w:pPr>
-              <w:pStyle w:val="Compact"/>
-            </w:pPr>
-            <w:r>
-              <w:rPr>
-                <w:lang w:val="nl"/>
-              </w:rPr>
-              <w:t xml:space="preserve">Bestanden die aan geen sjabloon meer hangen.</w:t>
+              <w:t xml:space="preserve">Inhoud van berichten</w:t>
+            </w:r>
+          </w:p>
+        </w:tc>
+        <w:tc>
+          <w:tcPr/>
+          <w:p>
+            <w:pPr>
+              <w:pStyle w:val="Compact"/>
+            </w:pPr>
+            <w:r>
+              <w:rPr>
+                <w:lang w:val="nl"/>
+              </w:rPr>
+              <w:t xml:space="preserve">3 maanden</w:t>
+            </w:r>
+          </w:p>
+        </w:tc>
+        <w:tc>
+          <w:tcPr/>
+          <w:p>
+            <w:pPr>
+              <w:pStyle w:val="Compact"/>
+            </w:pPr>
+            <w:r>
+              <w:rPr>
+                <w:lang w:val="nl"/>
+              </w:rPr>
+              <w:t xml:space="preserve">Alleen de tekst wordt leeggemaakt; onderwerp en samenvatting blijven.</w:t>
             </w:r>
           </w:p>
         </w:tc>
@@ -15799,35 +15988,35 @@
               <w:rPr>
                 <w:lang w:val="nl"/>
               </w:rPr>
-              <w:t xml:space="preserve">Bezoekersstatistiek landingspagina's</w:t>
-            </w:r>
-          </w:p>
-        </w:tc>
-        <w:tc>
-          <w:tcPr/>
-          <w:p>
-            <w:pPr>
-              <w:pStyle w:val="Compact"/>
-            </w:pPr>
-            <w:r>
-              <w:rPr>
-                <w:lang w:val="nl"/>
-              </w:rPr>
-              <w:t xml:space="preserve">13 maanden</w:t>
-            </w:r>
-          </w:p>
-        </w:tc>
-        <w:tc>
-          <w:tcPr/>
-          <w:p>
-            <w:pPr>
-              <w:pStyle w:val="Compact"/>
-            </w:pPr>
-            <w:r>
-              <w:rPr>
-                <w:lang w:val="nl"/>
-              </w:rPr>
-              <w:t xml:space="preserve">Aantallen verwijderen.</w:t>
+              <w:t xml:space="preserve">Losse bijlagen</w:t>
+            </w:r>
+          </w:p>
+        </w:tc>
+        <w:tc>
+          <w:tcPr/>
+          <w:p>
+            <w:pPr>
+              <w:pStyle w:val="Compact"/>
+            </w:pPr>
+            <w:r>
+              <w:rPr>
+                <w:lang w:val="nl"/>
+              </w:rPr>
+              <w:t xml:space="preserve">12 maanden</w:t>
+            </w:r>
+          </w:p>
+        </w:tc>
+        <w:tc>
+          <w:tcPr/>
+          <w:p>
+            <w:pPr>
+              <w:pStyle w:val="Compact"/>
+            </w:pPr>
+            <w:r>
+              <w:rPr>
+                <w:lang w:val="nl"/>
+              </w:rPr>
+              <w:t xml:space="preserve">Bestanden die aan geen sjabloon meer hangen.</w:t>
             </w:r>
           </w:p>
         </w:tc>
@@ -15843,35 +16032,35 @@
               <w:rPr>
                 <w:lang w:val="nl"/>
               </w:rPr>
-              <w:t xml:space="preserve">Herkenning unieke bezoekers</w:t>
-            </w:r>
-          </w:p>
-        </w:tc>
-        <w:tc>
-          <w:tcPr/>
-          <w:p>
-            <w:pPr>
-              <w:pStyle w:val="Compact"/>
-            </w:pPr>
-            <w:r>
-              <w:rPr>
-                <w:lang w:val="nl"/>
-              </w:rPr>
-              <w:t xml:space="preserve">30 dagen</w:t>
-            </w:r>
-          </w:p>
-        </w:tc>
-        <w:tc>
-          <w:tcPr/>
-          <w:p>
-            <w:pPr>
-              <w:pStyle w:val="Compact"/>
-            </w:pPr>
-            <w:r>
-              <w:rPr>
-                <w:lang w:val="nl"/>
-              </w:rPr>
-              <w:t xml:space="preserve">Het dag-pseudoniem wissen; aantallen blijven.</w:t>
+              <w:t xml:space="preserve">Bezoekersstatistiek landingspagina's</w:t>
+            </w:r>
+          </w:p>
+        </w:tc>
+        <w:tc>
+          <w:tcPr/>
+          <w:p>
+            <w:pPr>
+              <w:pStyle w:val="Compact"/>
+            </w:pPr>
+            <w:r>
+              <w:rPr>
+                <w:lang w:val="nl"/>
+              </w:rPr>
+              <w:t xml:space="preserve">13 maanden</w:t>
+            </w:r>
+          </w:p>
+        </w:tc>
+        <w:tc>
+          <w:tcPr/>
+          <w:p>
+            <w:pPr>
+              <w:pStyle w:val="Compact"/>
+            </w:pPr>
+            <w:r>
+              <w:rPr>
+                <w:lang w:val="nl"/>
+              </w:rPr>
+              <w:t xml:space="preserve">Aantallen verwijderen.</w:t>
             </w:r>
           </w:p>
         </w:tc>
@@ -15887,35 +16076,35 @@
               <w:rPr>
                 <w:lang w:val="nl"/>
               </w:rPr>
-              <w:t xml:space="preserve">Logboek</w:t>
-            </w:r>
-          </w:p>
-        </w:tc>
-        <w:tc>
-          <w:tcPr/>
-          <w:p>
-            <w:pPr>
-              <w:pStyle w:val="Compact"/>
-            </w:pPr>
-            <w:r>
-              <w:rPr>
-                <w:lang w:val="nl"/>
-              </w:rPr>
-              <w:t xml:space="preserve">12 maanden</w:t>
-            </w:r>
-          </w:p>
-        </w:tc>
-        <w:tc>
-          <w:tcPr/>
-          <w:p>
-            <w:pPr>
-              <w:pStyle w:val="Compact"/>
-            </w:pPr>
-            <w:r>
-              <w:rPr>
-                <w:lang w:val="nl"/>
-              </w:rPr>
-              <w:t xml:space="preserve">Auditregels verwijderen.</w:t>
+              <w:t xml:space="preserve">Herkenning unieke bezoekers</w:t>
+            </w:r>
+          </w:p>
+        </w:tc>
+        <w:tc>
+          <w:tcPr/>
+          <w:p>
+            <w:pPr>
+              <w:pStyle w:val="Compact"/>
+            </w:pPr>
+            <w:r>
+              <w:rPr>
+                <w:lang w:val="nl"/>
+              </w:rPr>
+              <w:t xml:space="preserve">30 dagen</w:t>
+            </w:r>
+          </w:p>
+        </w:tc>
+        <w:tc>
+          <w:tcPr/>
+          <w:p>
+            <w:pPr>
+              <w:pStyle w:val="Compact"/>
+            </w:pPr>
+            <w:r>
+              <w:rPr>
+                <w:lang w:val="nl"/>
+              </w:rPr>
+              <w:t xml:space="preserve">Het dag-pseudoniem wissen; aantallen blijven.</w:t>
             </w:r>
           </w:p>
         </w:tc>
@@ -15931,35 +16120,35 @@
               <w:rPr>
                 <w:lang w:val="nl"/>
               </w:rPr>
-              <w:t xml:space="preserve">Loondocumenten (loonheffing en ID-kopie)</w:t>
-            </w:r>
-          </w:p>
-        </w:tc>
-        <w:tc>
-          <w:tcPr/>
-          <w:p>
-            <w:pPr>
-              <w:pStyle w:val="Compact"/>
-            </w:pPr>
-            <w:r>
-              <w:rPr>
-                <w:lang w:val="nl"/>
-              </w:rPr>
-              <w:t xml:space="preserve">5 jaar na einde dienstjaar</w:t>
-            </w:r>
-          </w:p>
-        </w:tc>
-        <w:tc>
-          <w:tcPr/>
-          <w:p>
-            <w:pPr>
-              <w:pStyle w:val="Compact"/>
-            </w:pPr>
-            <w:r>
-              <w:rPr>
-                <w:lang w:val="nl"/>
-              </w:rPr>
-              <w:t xml:space="preserve">Wettelijke bewaarplicht; daarna vernietigd.</w:t>
+              <w:t xml:space="preserve">Logboek</w:t>
+            </w:r>
+          </w:p>
+        </w:tc>
+        <w:tc>
+          <w:tcPr/>
+          <w:p>
+            <w:pPr>
+              <w:pStyle w:val="Compact"/>
+            </w:pPr>
+            <w:r>
+              <w:rPr>
+                <w:lang w:val="nl"/>
+              </w:rPr>
+              <w:t xml:space="preserve">12 maanden</w:t>
+            </w:r>
+          </w:p>
+        </w:tc>
+        <w:tc>
+          <w:tcPr/>
+          <w:p>
+            <w:pPr>
+              <w:pStyle w:val="Compact"/>
+            </w:pPr>
+            <w:r>
+              <w:rPr>
+                <w:lang w:val="nl"/>
+              </w:rPr>
+              <w:t xml:space="preserve">Auditregels verwijderen.</w:t>
             </w:r>
           </w:p>
         </w:tc>
@@ -15975,6 +16164,50 @@
               <w:rPr>
                 <w:lang w:val="nl"/>
               </w:rPr>
+              <w:t xml:space="preserve">Loondocumenten (loonheffing en ID-kopie)</w:t>
+            </w:r>
+          </w:p>
+        </w:tc>
+        <w:tc>
+          <w:tcPr/>
+          <w:p>
+            <w:pPr>
+              <w:pStyle w:val="Compact"/>
+            </w:pPr>
+            <w:r>
+              <w:rPr>
+                <w:lang w:val="nl"/>
+              </w:rPr>
+              <w:t xml:space="preserve">5 jaar na einde dienstjaar</w:t>
+            </w:r>
+          </w:p>
+        </w:tc>
+        <w:tc>
+          <w:tcPr/>
+          <w:p>
+            <w:pPr>
+              <w:pStyle w:val="Compact"/>
+            </w:pPr>
+            <w:r>
+              <w:rPr>
+                <w:lang w:val="nl"/>
+              </w:rPr>
+              <w:t xml:space="preserve">Wettelijke bewaarplicht; daarna vernietigd.</w:t>
+            </w:r>
+          </w:p>
+        </w:tc>
+      </w:tr>
+      <w:tr>
+        <w:tc>
+          <w:tcPr/>
+          <w:p>
+            <w:pPr>
+              <w:pStyle w:val="Compact"/>
+            </w:pPr>
+            <w:r>
+              <w:rPr>
+                <w:lang w:val="nl"/>
+              </w:rPr>
               <w:t xml:space="preserve">Kopie bankpas</w:t>
             </w:r>
           </w:p>
@@ -16021,7 +16254,335 @@
       </w:r>
     </w:p>
     <w:bookmarkEnd w:id="58"/>
-    <w:bookmarkStart w:id="59" w:name="wat-je-nooit-per-mail-doorstuurt"/>
+    <w:bookmarkStart w:id="59" w:name="seintje-bij-de-volgende-werving"/>
+    <w:p>
+      <w:pPr>
+        <w:pStyle w:val="Heading2"/>
+      </w:pPr>
+      <w:r>
+        <w:rPr>
+          <w:lang w:val="nl"/>
+        </w:rPr>
+        <w:t xml:space="preserve">Seintje bij de volgende werving</w:t>
+      </w:r>
+    </w:p>
+    <w:p>
+      <w:pPr>
+        <w:pStyle w:val="FirstParagraph"/>
+      </w:pPr>
+      <w:r>
+        <w:rPr>
+          <w:lang w:val="nl"/>
+        </w:rPr>
+        <w:t xml:space="preserve">Een afgewezen sollicitant mag je niet zomaar een bericht sturen als de werving weer opent: de</w:t>
+      </w:r>
+      <w:r>
+        <w:rPr>
+          <w:lang w:val="nl"/>
+        </w:rPr>
+        <w:t xml:space="preserve"> </w:t>
+      </w:r>
+      <w:r>
+        <w:rPr>
+          <w:lang w:val="nl"/>
+        </w:rPr>
+        <w:t xml:space="preserve">gegevens zijn alleen voor die ene sollicitatie gegeven, en voor zo'n bericht is vooraf</w:t>
+      </w:r>
+      <w:r>
+        <w:rPr>
+          <w:lang w:val="nl"/>
+        </w:rPr>
+        <w:t xml:space="preserve"> </w:t>
+      </w:r>
+      <w:r>
+        <w:rPr>
+          <w:lang w:val="nl"/>
+        </w:rPr>
+        <w:t xml:space="preserve">toestemming nodig (AVG en Telecommunicatiewet). Een zin in de algemene voorwaarden is daarvoor</w:t>
+      </w:r>
+      <w:r>
+        <w:rPr>
+          <w:lang w:val="nl"/>
+        </w:rPr>
+        <w:t xml:space="preserve"> </w:t>
+      </w:r>
+      <w:r>
+        <w:rPr>
+          <w:lang w:val="nl"/>
+        </w:rPr>
+        <w:t xml:space="preserve">niet genoeg. Daarom vraagt het systeem het zelf, op het moment dat het logisch is:</w:t>
+      </w:r>
+    </w:p>
+    <w:p>
+      <w:pPr>
+        <w:pStyle w:val="Compact"/>
+        <w:numPr>
+          <w:ilvl w:val="0"/>
+          <w:numId w:val="1024"/>
+        </w:numPr>
+      </w:pPr>
+      <w:r>
+        <w:rPr>
+          <w:b/>
+          <w:bCs/>
+          <w:lang w:val="nl"/>
+        </w:rPr>
+        <w:t xml:space="preserve">In de afwijzingsmail</w:t>
+      </w:r>
+      <w:r>
+        <w:rPr>
+          <w:lang w:val="nl"/>
+        </w:rPr>
+        <w:t xml:space="preserve"> </w:t>
+      </w:r>
+      <w:r>
+        <w:rPr>
+          <w:lang w:val="nl"/>
+        </w:rPr>
+        <w:t xml:space="preserve">staat altijd de knop</w:t>
+      </w:r>
+      <w:r>
+        <w:rPr>
+          <w:lang w:val="nl"/>
+        </w:rPr>
+        <w:t xml:space="preserve"> </w:t>
+      </w:r>
+      <w:r>
+        <w:rPr>
+          <w:b/>
+          <w:bCs/>
+          <w:lang w:val="nl"/>
+        </w:rPr>
+        <w:t xml:space="preserve">Stuur me een seintje</w:t>
+      </w:r>
+      <w:r>
+        <w:rPr>
+          <w:lang w:val="nl"/>
+        </w:rPr>
+        <w:t xml:space="preserve">, onder je eigen tekst.</w:t>
+      </w:r>
+      <w:r>
+        <w:rPr>
+          <w:lang w:val="nl"/>
+        </w:rPr>
+        <w:t xml:space="preserve"> </w:t>
+      </w:r>
+      <w:r>
+        <w:rPr>
+          <w:lang w:val="nl"/>
+        </w:rPr>
+        <w:t xml:space="preserve">Let op: die mail staat standaard uit (het bestuur belt of mailt persoonlijk). Zet je hem aan</w:t>
+      </w:r>
+      <w:r>
+        <w:rPr>
+          <w:lang w:val="nl"/>
+        </w:rPr>
+        <w:t xml:space="preserve"> </w:t>
+      </w:r>
+      <w:r>
+        <w:rPr>
+          <w:lang w:val="nl"/>
+        </w:rPr>
+        <w:t xml:space="preserve">onder Sjablonen › Niet geselecteerd, dan gaat de knop vanzelf mee.</w:t>
+      </w:r>
+    </w:p>
+    <w:p>
+      <w:pPr>
+        <w:pStyle w:val="Compact"/>
+        <w:numPr>
+          <w:ilvl w:val="0"/>
+          <w:numId w:val="1024"/>
+        </w:numPr>
+      </w:pPr>
+      <w:r>
+        <w:rPr>
+          <w:b/>
+          <w:bCs/>
+          <w:lang w:val="nl"/>
+        </w:rPr>
+        <w:t xml:space="preserve">In het portaal</w:t>
+      </w:r>
+      <w:r>
+        <w:rPr>
+          <w:lang w:val="nl"/>
+        </w:rPr>
+        <w:t xml:space="preserve"> </w:t>
+      </w:r>
+      <w:r>
+        <w:rPr>
+          <w:lang w:val="nl"/>
+        </w:rPr>
+        <w:t xml:space="preserve">ziet een afgewezen sollicitant op de startpagina</w:t>
+      </w:r>
+      <w:r>
+        <w:rPr>
+          <w:lang w:val="nl"/>
+        </w:rPr>
+        <w:t xml:space="preserve"> </w:t>
+      </w:r>
+      <w:r>
+        <w:rPr>
+          <w:b/>
+          <w:bCs/>
+          <w:lang w:val="nl"/>
+        </w:rPr>
+        <w:t xml:space="preserve">Seintje bij de volgende</w:t>
+      </w:r>
+      <w:r>
+        <w:rPr>
+          <w:b/>
+          <w:bCs/>
+          <w:lang w:val="nl"/>
+        </w:rPr>
+        <w:t xml:space="preserve"> </w:t>
+      </w:r>
+      <w:r>
+        <w:rPr>
+          <w:b/>
+          <w:bCs/>
+          <w:lang w:val="nl"/>
+        </w:rPr>
+        <w:t xml:space="preserve">werving?</w:t>
+      </w:r>
+      <w:r>
+        <w:rPr>
+          <w:lang w:val="nl"/>
+        </w:rPr>
+        <w:t xml:space="preserve"> </w:t>
+      </w:r>
+      <w:r>
+        <w:rPr>
+          <w:lang w:val="nl"/>
+        </w:rPr>
+        <w:t xml:space="preserve">met de knop</w:t>
+      </w:r>
+      <w:r>
+        <w:rPr>
+          <w:lang w:val="nl"/>
+        </w:rPr>
+        <w:t xml:space="preserve"> </w:t>
+      </w:r>
+      <w:r>
+        <w:rPr>
+          <w:b/>
+          <w:bCs/>
+          <w:lang w:val="nl"/>
+        </w:rPr>
+        <w:t xml:space="preserve">Ja, graag</w:t>
+      </w:r>
+      <w:r>
+        <w:rPr>
+          <w:lang w:val="nl"/>
+        </w:rPr>
+        <w:t xml:space="preserve">. Dat werkt dus ook als het bestuur persoonlijk belt.</w:t>
+      </w:r>
+    </w:p>
+    <w:p>
+      <w:pPr>
+        <w:pStyle w:val="FirstParagraph"/>
+      </w:pPr>
+      <w:r>
+        <w:rPr>
+          <w:lang w:val="nl"/>
+        </w:rPr>
+        <w:t xml:space="preserve">Wie ja zegt, staat in Berichten in de groep</w:t>
+      </w:r>
+      <w:r>
+        <w:rPr>
+          <w:lang w:val="nl"/>
+        </w:rPr>
+        <w:t xml:space="preserve"> </w:t>
+      </w:r>
+      <w:r>
+        <w:rPr>
+          <w:b/>
+          <w:bCs/>
+          <w:lang w:val="nl"/>
+        </w:rPr>
+        <w:t xml:space="preserve">Seintje gevraagd</w:t>
+      </w:r>
+      <w:r>
+        <w:rPr>
+          <w:lang w:val="nl"/>
+        </w:rPr>
+        <w:t xml:space="preserve">. De toestemming geldt twaalf</w:t>
+      </w:r>
+      <w:r>
+        <w:rPr>
+          <w:lang w:val="nl"/>
+        </w:rPr>
+        <w:t xml:space="preserve"> </w:t>
+      </w:r>
+      <w:r>
+        <w:rPr>
+          <w:lang w:val="nl"/>
+        </w:rPr>
+        <w:t xml:space="preserve">maanden en is altijd in te trekken: met</w:t>
+      </w:r>
+      <w:r>
+        <w:rPr>
+          <w:lang w:val="nl"/>
+        </w:rPr>
+        <w:t xml:space="preserve"> </w:t>
+      </w:r>
+      <w:r>
+        <w:rPr>
+          <w:b/>
+          <w:bCs/>
+          <w:lang w:val="nl"/>
+        </w:rPr>
+        <w:t xml:space="preserve">Toch niet</w:t>
+      </w:r>
+      <w:r>
+        <w:rPr>
+          <w:lang w:val="nl"/>
+        </w:rPr>
+        <w:t xml:space="preserve"> </w:t>
+      </w:r>
+      <w:r>
+        <w:rPr>
+          <w:lang w:val="nl"/>
+        </w:rPr>
+        <w:t xml:space="preserve">in het portaal of op de pagina achter de</w:t>
+      </w:r>
+      <w:r>
+        <w:rPr>
+          <w:lang w:val="nl"/>
+        </w:rPr>
+        <w:t xml:space="preserve"> </w:t>
+      </w:r>
+      <w:r>
+        <w:rPr>
+          <w:lang w:val="nl"/>
+        </w:rPr>
+        <w:t xml:space="preserve">knop, en met de afmeldlink onder elk bericht. Geven en intrekken komen in het logboek.</w:t>
+      </w:r>
+    </w:p>
+    <w:p>
+      <w:pPr>
+        <w:pStyle w:val="BodyText"/>
+      </w:pPr>
+      <w:r>
+        <w:rPr>
+          <w:lang w:val="nl"/>
+        </w:rPr>
+        <w:t xml:space="preserve">Oud-strandwachten hebben geen seintje nodig: die mag je als vereniging benaderen, met de</w:t>
+      </w:r>
+      <w:r>
+        <w:rPr>
+          <w:lang w:val="nl"/>
+        </w:rPr>
+        <w:t xml:space="preserve"> </w:t>
+      </w:r>
+      <w:r>
+        <w:rPr>
+          <w:lang w:val="nl"/>
+        </w:rPr>
+        <w:t xml:space="preserve">afmeldlink eronder (die staat er automatisch onder).</w:t>
+      </w:r>
+    </w:p>
+    <w:bookmarkEnd w:id="59"/>
+    <w:bookmarkStart w:id="60" w:name="wat-je-nooit-per-mail-doorstuurt"/>
     <w:p>
       <w:pPr>
         <w:pStyle w:val="Heading2"/>
@@ -16099,9 +16660,9 @@
         </w:pict>
       </w:r>
     </w:p>
-    <w:bookmarkEnd w:id="59"/>
     <w:bookmarkEnd w:id="60"/>
-    <w:bookmarkStart w:id="64" w:name="systeem-en-foutenlog"/>
+    <w:bookmarkEnd w:id="61"/>
+    <w:bookmarkStart w:id="65" w:name="systeem-en-foutenlog"/>
     <w:p>
       <w:pPr>
         <w:pStyle w:val="Heading1"/>
@@ -16161,7 +16722,7 @@
         <w:t xml:space="preserve">alleen admin.</w:t>
       </w:r>
     </w:p>
-    <w:bookmarkStart w:id="61" w:name="systeem--updates"/>
+    <w:bookmarkStart w:id="62" w:name="systeem--updates"/>
     <w:p>
       <w:pPr>
         <w:pStyle w:val="Heading2"/>
@@ -16760,8 +17321,8 @@
         <w:t xml:space="preserve">met per versie wat er veranderde.</w:t>
       </w:r>
     </w:p>
-    <w:bookmarkEnd w:id="61"/>
-    <w:bookmarkStart w:id="62" w:name="foutenlog"/>
+    <w:bookmarkEnd w:id="62"/>
+    <w:bookmarkStart w:id="63" w:name="foutenlog"/>
     <w:p>
       <w:pPr>
         <w:pStyle w:val="Heading2"/>
@@ -16878,8 +17439,8 @@
         <w:t xml:space="preserve">wis je het hele foutenlog.</w:t>
       </w:r>
     </w:p>
-    <w:bookmarkEnd w:id="62"/>
-    <w:bookmarkStart w:id="63" w:name="testomgeving"/>
+    <w:bookmarkEnd w:id="63"/>
+    <w:bookmarkStart w:id="64" w:name="testomgeving"/>
     <w:p>
       <w:pPr>
         <w:pStyle w:val="Heading2"/>
@@ -16953,9 +17514,9 @@
         </w:pict>
       </w:r>
     </w:p>
-    <w:bookmarkEnd w:id="63"/>
     <w:bookmarkEnd w:id="64"/>
-    <w:bookmarkStart w:id="65" w:name="veelgestelde-vragen"/>
+    <w:bookmarkEnd w:id="65"/>
+    <w:bookmarkStart w:id="66" w:name="veelgestelde-vragen"/>
     <w:p>
       <w:pPr>
         <w:pStyle w:val="Heading1"/>
@@ -17853,19 +18414,57 @@
         <w:rPr>
           <w:lang w:val="nl"/>
         </w:rPr>
-        <w:t xml:space="preserve">WordPress-plugin staat. Op een landingspagina moet bovendien de markering voor het formulier in</w:t>
-      </w:r>
-      <w:r>
-        <w:rPr>
-          <w:lang w:val="nl"/>
-        </w:rPr>
-        <w:t xml:space="preserve"> </w:t>
-      </w:r>
-      <w:r>
-        <w:rPr>
-          <w:lang w:val="nl"/>
-        </w:rPr>
-        <w:t xml:space="preserve">het ontwerp staan en de status op Gepubliceerd; zie de handleiding Landingspagina's.</w:t>
+        <w:t xml:space="preserve">WordPress-plugin staat. In WordPress staat bij Instellingen › Paal 13 Aanmelden een knop</w:t>
+      </w:r>
+      <w:r>
+        <w:rPr>
+          <w:lang w:val="nl"/>
+        </w:rPr>
+        <w:t xml:space="preserve"> </w:t>
+      </w:r>
+      <w:r>
+        <w:rPr>
+          <w:b/>
+          <w:bCs/>
+          <w:lang w:val="nl"/>
+        </w:rPr>
+        <w:t xml:space="preserve">Verbinding testen</w:t>
+      </w:r>
+      <w:r>
+        <w:rPr>
+          <w:lang w:val="nl"/>
+        </w:rPr>
+        <w:t xml:space="preserve"> </w:t>
+      </w:r>
+      <w:r>
+        <w:rPr>
+          <w:lang w:val="nl"/>
+        </w:rPr>
+        <w:t xml:space="preserve">die meteen zegt wat er mis is. Op een landingspagina moet bovendien de</w:t>
+      </w:r>
+      <w:r>
+        <w:rPr>
+          <w:lang w:val="nl"/>
+        </w:rPr>
+        <w:t xml:space="preserve"> </w:t>
+      </w:r>
+      <w:r>
+        <w:rPr>
+          <w:lang w:val="nl"/>
+        </w:rPr>
+        <w:t xml:space="preserve">markering voor het formulier in het ontwerp staan en de status op Gepubliceerd; zie de</w:t>
+      </w:r>
+      <w:r>
+        <w:rPr>
+          <w:lang w:val="nl"/>
+        </w:rPr>
+        <w:t xml:space="preserve"> </w:t>
+      </w:r>
+      <w:r>
+        <w:rPr>
+          <w:lang w:val="nl"/>
+        </w:rPr>
+        <w:t xml:space="preserve">handleiding Landingspagina's.</w:t>
       </w:r>
     </w:p>
     <w:p>
@@ -17878,6 +18477,112 @@
           <w:bCs/>
           <w:lang w:val="nl"/>
         </w:rPr>
+        <w:t xml:space="preserve">Bezoekers krijgen "Deze pagina stond te lang open" op de website.</w:t>
+      </w:r>
+      <w:r>
+        <w:br/>
+      </w:r>
+      <w:r>
+        <w:rPr>
+          <w:lang w:val="nl"/>
+        </w:rPr>
+        <w:t xml:space="preserve">Dan bewaart een cache-plugin de pagina met het formulier als kant-en-klare HTML. Daar zit een</w:t>
+      </w:r>
+      <w:r>
+        <w:rPr>
+          <w:lang w:val="nl"/>
+        </w:rPr>
+        <w:t xml:space="preserve"> </w:t>
+      </w:r>
+      <w:r>
+        <w:rPr>
+          <w:lang w:val="nl"/>
+        </w:rPr>
+        <w:t xml:space="preserve">code in die maar een paar uur geldig is. Sluit de aanmeldpagina uit van de paginacache; de</w:t>
+      </w:r>
+      <w:r>
+        <w:rPr>
+          <w:lang w:val="nl"/>
+        </w:rPr>
+        <w:t xml:space="preserve"> </w:t>
+      </w:r>
+      <w:r>
+        <w:rPr>
+          <w:lang w:val="nl"/>
+        </w:rPr>
+        <w:t xml:space="preserve">plugin geeft dat zelf al aan, dus meestal gaat het vanzelf goed.</w:t>
+      </w:r>
+    </w:p>
+    <w:p>
+      <w:pPr>
+        <w:pStyle w:val="BodyText"/>
+      </w:pPr>
+      <w:r>
+        <w:rPr>
+          <w:b/>
+          <w:bCs/>
+          <w:lang w:val="nl"/>
+        </w:rPr>
+        <w:t xml:space="preserve">Ik wil zien waar mensen afhaken in het formulier.</w:t>
+      </w:r>
+      <w:r>
+        <w:br/>
+      </w:r>
+      <w:r>
+        <w:rPr>
+          <w:lang w:val="nl"/>
+        </w:rPr>
+        <w:t xml:space="preserve">Open bij Landingspagina's de betreffende pagina. Onder</w:t>
+      </w:r>
+      <w:r>
+        <w:rPr>
+          <w:lang w:val="nl"/>
+        </w:rPr>
+        <w:t xml:space="preserve"> </w:t>
+      </w:r>
+      <w:r>
+        <w:rPr>
+          <w:b/>
+          <w:bCs/>
+          <w:lang w:val="nl"/>
+        </w:rPr>
+        <w:t xml:space="preserve">Waar haken mensen af?</w:t>
+      </w:r>
+      <w:r>
+        <w:rPr>
+          <w:lang w:val="nl"/>
+        </w:rPr>
+        <w:t xml:space="preserve"> </w:t>
+      </w:r>
+      <w:r>
+        <w:rPr>
+          <w:lang w:val="nl"/>
+        </w:rPr>
+        <w:t xml:space="preserve">staat van</w:t>
+      </w:r>
+      <w:r>
+        <w:rPr>
+          <w:lang w:val="nl"/>
+        </w:rPr>
+        <w:t xml:space="preserve"> </w:t>
+      </w:r>
+      <w:r>
+        <w:rPr>
+          <w:lang w:val="nl"/>
+        </w:rPr>
+        <w:t xml:space="preserve">bezoek tot verstuurde aanmelding hoeveel mensen elke stap haalden.</w:t>
+      </w:r>
+    </w:p>
+    <w:p>
+      <w:pPr>
+        <w:pStyle w:val="BodyText"/>
+      </w:pPr>
+      <w:r>
+        <w:rPr>
+          <w:b/>
+          <w:bCs/>
+          <w:lang w:val="nl"/>
+        </w:rPr>
         <w:t xml:space="preserve">Ik zie een onderdeel niet in het menu.</w:t>
       </w:r>
       <w:r>
@@ -17914,7 +18619,7 @@
         <w:t xml:space="preserve">voor penningmeester en admin; Logboek, Beheerders en Systeem alleen voor admin.</w:t>
       </w:r>
     </w:p>
-    <w:bookmarkEnd w:id="65"/>
+    <w:bookmarkEnd w:id="66"/>
     <w:sectPr>
       <w:footnotePr>
         <w:numRestart w:val="eachSect"/>
@@ -18472,6 +19177,9 @@
     <w:abstractNumId w:val="991"/>
   </w:num>
   <w:num w:numId="1023">
+    <w:abstractNumId w:val="991"/>
+  </w:num>
+  <w:num w:numId="1024">
     <w:abstractNumId w:val="991"/>
   </w:num>
 </w:numbering>

</xml_diff>

<commit_message>
2.104.0: lazy cron eruit, taken in drie groepen via de echte cron
- lazy_cron_tick() en de aanroepen in layout_top.php en _kop.php verwijderd.
- cron_taken.php: groepen snel (60s), kwartier (900s) en dag, elk met eigen lock en
  laatste run; 'auto' draait wat aan de beurt is. cron_stand() voor health/Vandaag/Instellingen.
- cron/run.php draait ook onder CLI (geen token), groep als argument of ?groep=.
- Instellingen: Plesk-instructie PHP-script elke minuut, status per groep, 'Nu uitvoeren'
  als POST met CSRF + systeem.bewerken (token niet meer in een link).
- Runbook en beheerhandleiding bijgewerkt (+ HTML/Word opnieuw gegenereerd).

Let op bij deploy: de bestaande curl-taak (elke 5 min) blijft werken, maar zet hem op elke
minuut of vervang hem door php cron/run.php.
</commit_message>
<xml_diff>
--- a/docs/handleiding/word/handleiding_beheer.docx
+++ b/docs/handleiding/word/handleiding_beheer.docx
@@ -31537,7 +31537,7 @@
         <w:rPr>
           <w:lang w:val="nl"/>
         </w:rPr>
-        <w:t xml:space="preserve">elke vijf minuten.</w:t>
+        <w:t xml:space="preserve">elk kwartier.</w:t>
       </w:r>
     </w:p>
     <w:bookmarkStart w:id="106" w:name="de-ingebouwde-herinneringen"/>
@@ -36687,19 +36687,19 @@
         <w:rPr>
           <w:lang w:val="nl"/>
         </w:rPr>
-        <w:t xml:space="preserve">, onderaan (admin): zet de cronjob-regel als geplande taak in Plesk</w:t>
-      </w:r>
-      <w:r>
-        <w:rPr>
-          <w:lang w:val="nl"/>
-        </w:rPr>
-        <w:t xml:space="preserve"> </w:t>
-      </w:r>
-      <w:r>
-        <w:rPr>
-          <w:lang w:val="nl"/>
-        </w:rPr>
-        <w:t xml:space="preserve">(elke vijf minuten), of laat de technisch beheerder dat doen.</w:t>
+        <w:t xml:space="preserve">, onderaan (admin): zet de geplande taak in Plesk</w:t>
+      </w:r>
+      <w:r>
+        <w:rPr>
+          <w:lang w:val="nl"/>
+        </w:rPr>
+        <w:t xml:space="preserve"> </w:t>
+      </w:r>
+      <w:r>
+        <w:rPr>
+          <w:lang w:val="nl"/>
+        </w:rPr>
+        <w:t xml:space="preserve">(PHP-script cron/run.php, elke minuut), of laat de technisch beheerder dat doen.</w:t>
       </w:r>
     </w:p>
     <w:p>
@@ -45726,7 +45726,7 @@
               <w:rPr>
                 <w:lang w:val="nl"/>
               </w:rPr>
-              <w:t xml:space="preserve">Wanneer draaiden de automatische taken voor het laatst? Hoort elke vijf minuten. Langer dan 30 minuten is een waarschuwing, langer dan 2 uur een fout: controleer dan de cronjob in Plesk (de regel staat onder Instellingen › Bewaren &amp; opschonen). Een waarschuwing volgt ook als alleen het vangnet bij een bezoek aan het beheer draait en de echte cronjob langer dan 30 minuten stil ligt: dan gebeuren opschonen en opruimen niet.</w:t>
+              <w:t xml:space="preserve">Draaien de drie groepen automatische taken op tijd? Berichten elke minuut, herinneringen en uitnodigen elk kwartier, Authentik en opschonen dagelijks. Ligt een groep stil, dan volgt een waarschuwing en daarna een fout: controleer de geplande taak in Plesk (staat onder Instellingen › Bewaren &amp; opschonen). Er is geen vangnet meer bij een paginabezoek.</w:t>
             </w:r>
           </w:p>
         </w:tc>
@@ -48588,7 +48588,7 @@
         <w:rPr>
           <w:lang w:val="nl"/>
         </w:rPr>
-        <w:t xml:space="preserve">— de automatische taken die elke vijf minuten draaien: de wachtrij, herinneringen, geplande berichten, automatisch uitnodigen en één keer per dag het opschonen. Draait de cron van de hoster niet, dan springt het systeem hooguit één keer per uur bij als een beheerder een scherm opent, maar dan zonder het opschonen en de Authentik-synchronisatie.</w:t>
+        <w:t xml:space="preserve">— de automatische taken, via één geplande taak in Plesk die elke minuut draait: berichten en AI elke minuut, herinneringen, geplande berichten en automatisch uitnodigen elk kwartier, en één keer per dag de Authentik-synchronisatie en het opschonen. Draait de geplande taak niet, dan gebeurt er niets van dit alles: een bezoek aan het beheer of portaal vangt het niet meer op.</w:t>
       </w:r>
     </w:p>
     <w:p>

</xml_diff>

<commit_message>
2.116.0: loonplanning opnieuw opgebouwd + dossiertab Inzet
Zelfde opbouw als Beschikbaarheid: kop (scenario's, kosten, budget, definitief,
exports incl. rooster), ingepland per week tegen de norm, filterbalk, raster met
bh_weekcel (groot gepland, klein de opgave), zijpaneel per week (dagen uit
beschikbaarheid_per_dag, plannen, -/+, betaald, kopieer) en per persoon (functie,
afspraak, vastzetten/ontgrendelen). Geen inline style-blok of onclick meer.
Logica: includes/beheer/loonplanning.php; partials admin/lp/; gedrag
assets/js/loonplanning.js. bh_weekcel: soorten gepland/onbetaald/open/let + sub +
data. Dossier: tab Inzet (opgave, afspraak, alle scenario's).
</commit_message>
<xml_diff>
--- a/docs/handleiding/word/handleiding_beheer.docx
+++ b/docs/handleiding/word/handleiding_beheer.docx
@@ -14781,7 +14781,7 @@
     </w:p>
     <w:bookmarkEnd w:id="53"/>
     <w:bookmarkEnd w:id="54"/>
-    <w:bookmarkStart w:id="66" w:name="het-dossier"/>
+    <w:bookmarkStart w:id="68" w:name="het-dossier"/>
     <w:p>
       <w:pPr>
         <w:pStyle w:val="Heading1"/>
@@ -17233,7 +17233,147 @@
       </w:r>
     </w:p>
     <w:bookmarkEnd w:id="61"/>
-    <w:bookmarkStart w:id="62" w:name="tabblad-ondertekeningen"/>
+    <w:bookmarkStart w:id="62" w:name="tabblad-inzet"/>
+    <w:p>
+      <w:pPr>
+        <w:pStyle w:val="Heading2"/>
+      </w:pPr>
+      <w:r>
+        <w:rPr>
+          <w:lang w:val="nl"/>
+        </w:rPr>
+        <w:t xml:space="preserve">Tabblad Inzet</w:t>
+      </w:r>
+    </w:p>
+    <w:p>
+      <w:pPr>
+        <w:pStyle w:val="FirstParagraph"/>
+      </w:pPr>
+      <w:r>
+        <w:rPr>
+          <w:lang w:val="nl"/>
+        </w:rPr>
+        <w:t xml:space="preserve">Alleen met leesrecht op de loonplanning. Per week: wat de sollicitant opgaf, de vastgestelde</w:t>
+      </w:r>
+      <w:r>
+        <w:rPr>
+          <w:lang w:val="nl"/>
+        </w:rPr>
+        <w:t xml:space="preserve"> </w:t>
+      </w:r>
+      <w:r>
+        <w:rPr>
+          <w:b/>
+          <w:bCs/>
+          <w:lang w:val="nl"/>
+        </w:rPr>
+        <w:t xml:space="preserve">afspraak</w:t>
+      </w:r>
+      <w:r>
+        <w:rPr>
+          <w:lang w:val="nl"/>
+        </w:rPr>
+        <w:t xml:space="preserve"> </w:t>
+      </w:r>
+      <w:r>
+        <w:rPr>
+          <w:lang w:val="nl"/>
+        </w:rPr>
+        <w:t xml:space="preserve">(groen, zodra de loonplanning definitief is) en hoe de persoon in elk scenario staat</w:t>
+      </w:r>
+      <w:r>
+        <w:rPr>
+          <w:lang w:val="nl"/>
+        </w:rPr>
+        <w:t xml:space="preserve"> </w:t>
+      </w:r>
+      <w:r>
+        <w:rPr>
+          <w:lang w:val="nl"/>
+        </w:rPr>
+        <w:t xml:space="preserve">(de ster is het actieve). Bovenaan of de persoon vaststaat na het TW-gesprek. Via</w:t>
+      </w:r>
+      <w:r>
+        <w:rPr>
+          <w:lang w:val="nl"/>
+        </w:rPr>
+        <w:t xml:space="preserve"> </w:t>
+      </w:r>
+      <w:r>
+        <w:rPr>
+          <w:b/>
+          <w:bCs/>
+          <w:lang w:val="nl"/>
+        </w:rPr>
+        <w:t xml:space="preserve">Naar de</w:t>
+      </w:r>
+      <w:r>
+        <w:rPr>
+          <w:b/>
+          <w:bCs/>
+          <w:lang w:val="nl"/>
+        </w:rPr>
+        <w:t xml:space="preserve"> </w:t>
+      </w:r>
+      <w:r>
+        <w:rPr>
+          <w:b/>
+          <w:bCs/>
+          <w:lang w:val="nl"/>
+        </w:rPr>
+        <w:t xml:space="preserve">loonplanning</w:t>
+      </w:r>
+      <w:r>
+        <w:rPr>
+          <w:lang w:val="nl"/>
+        </w:rPr>
+        <w:t xml:space="preserve"> </w:t>
+      </w:r>
+      <w:r>
+        <w:rPr>
+          <w:lang w:val="nl"/>
+        </w:rPr>
+        <w:t xml:space="preserve">pas je het aan.</w:t>
+      </w:r>
+    </w:p>
+    <w:bookmarkEnd w:id="62"/>
+    <w:bookmarkStart w:id="63" w:name="tabblad-trainingsweekend"/>
+    <w:p>
+      <w:pPr>
+        <w:pStyle w:val="Heading2"/>
+      </w:pPr>
+      <w:r>
+        <w:rPr>
+          <w:lang w:val="nl"/>
+        </w:rPr>
+        <w:t xml:space="preserve">Tabblad Trainingsweekend</w:t>
+      </w:r>
+    </w:p>
+    <w:p>
+      <w:pPr>
+        <w:pStyle w:val="FirstParagraph"/>
+      </w:pPr>
+      <w:r>
+        <w:rPr>
+          <w:lang w:val="nl"/>
+        </w:rPr>
+        <w:t xml:space="preserve">Bevestiging en inchecken, de observaties van het weekend, en het gesprek: besluit, interne notitie</w:t>
+      </w:r>
+      <w:r>
+        <w:rPr>
+          <w:lang w:val="nl"/>
+        </w:rPr>
+        <w:t xml:space="preserve"> </w:t>
+      </w:r>
+      <w:r>
+        <w:rPr>
+          <w:lang w:val="nl"/>
+        </w:rPr>
+        <w:t xml:space="preserve">en het bericht aan de sollicitant.</w:t>
+      </w:r>
+    </w:p>
+    <w:bookmarkEnd w:id="63"/>
+    <w:bookmarkStart w:id="64" w:name="tabblad-ondertekeningen"/>
     <w:p>
       <w:pPr>
         <w:pStyle w:val="Heading2"/>
@@ -17471,8 +17611,8 @@
         <w:t xml:space="preserve">.</w:t>
       </w:r>
     </w:p>
-    <w:bookmarkEnd w:id="62"/>
-    <w:bookmarkStart w:id="63" w:name="tabblad-tijdlijn"/>
+    <w:bookmarkEnd w:id="64"/>
+    <w:bookmarkStart w:id="65" w:name="tabblad-tijdlijn"/>
     <w:p>
       <w:pPr>
         <w:pStyle w:val="Heading2"/>
@@ -17545,8 +17685,8 @@
         <w:t xml:space="preserve">logboek gefilterd op deze persoon, inclusief wie welk document opende).</w:t>
       </w:r>
     </w:p>
-    <w:bookmarkEnd w:id="63"/>
-    <w:bookmarkStart w:id="64" w:name="verwijderen-uit-het-dossier"/>
+    <w:bookmarkEnd w:id="65"/>
+    <w:bookmarkStart w:id="66" w:name="verwijderen-uit-het-dossier"/>
     <w:p>
       <w:pPr>
         <w:pStyle w:val="Heading2"/>
@@ -17890,8 +18030,8 @@
         <w:t xml:space="preserve">.</w:t>
       </w:r>
     </w:p>
-    <w:bookmarkEnd w:id="64"/>
-    <w:bookmarkStart w:id="65" w:name="gegevens-corrigeren"/>
+    <w:bookmarkEnd w:id="66"/>
+    <w:bookmarkStart w:id="67" w:name="gegevens-corrigeren"/>
     <w:p>
       <w:pPr>
         <w:pStyle w:val="Heading2"/>
@@ -18426,9 +18566,9 @@
         </w:pict>
       </w:r>
     </w:p>
-    <w:bookmarkEnd w:id="65"/>
-    <w:bookmarkEnd w:id="66"/>
-    <w:bookmarkStart w:id="71" w:name="de-fases-en-wat-er-automatisch-gebeurt"/>
+    <w:bookmarkEnd w:id="67"/>
+    <w:bookmarkEnd w:id="68"/>
+    <w:bookmarkStart w:id="73" w:name="de-fases-en-wat-er-automatisch-gebeurt"/>
     <w:p>
       <w:pPr>
         <w:pStyle w:val="Heading1"/>
@@ -18561,7 +18701,7 @@
         <w:t xml:space="preserve">Welke melding via welk kanaal gaat, stel je in bij Instellingen en Sjablonen.</w:t>
       </w:r>
     </w:p>
-    <w:bookmarkStart w:id="67" w:name="de-fases"/>
+    <w:bookmarkStart w:id="69" w:name="de-fases"/>
     <w:p>
       <w:pPr>
         <w:pStyle w:val="Heading2"/>
@@ -19178,8 +19318,8 @@
         </w:tc>
       </w:tr>
     </w:tbl>
-    <w:bookmarkEnd w:id="67"/>
-    <w:bookmarkStart w:id="68" w:name="het-seintje-bij-afwijzing"/>
+    <w:bookmarkEnd w:id="69"/>
+    <w:bookmarkStart w:id="70" w:name="het-seintje-bij-afwijzing"/>
     <w:p>
       <w:pPr>
         <w:pStyle w:val="Heading2"/>
@@ -19404,8 +19544,8 @@
         <w:t xml:space="preserve">.</w:t>
       </w:r>
     </w:p>
-    <w:bookmarkEnd w:id="68"/>
-    <w:bookmarkStart w:id="69" w:name="zonder-bericht-doorvoeren"/>
+    <w:bookmarkEnd w:id="70"/>
+    <w:bookmarkStart w:id="71" w:name="zonder-bericht-doorvoeren"/>
     <w:p>
       <w:pPr>
         <w:pStyle w:val="Heading2"/>
@@ -19614,8 +19754,8 @@
         <w:t xml:space="preserve">altijd het ingestelde bericht uit.</w:t>
       </w:r>
     </w:p>
-    <w:bookmarkEnd w:id="69"/>
-    <w:bookmarkStart w:id="70" w:name="goed-om-te-weten"/>
+    <w:bookmarkEnd w:id="71"/>
+    <w:bookmarkStart w:id="72" w:name="goed-om-te-weten"/>
     <w:p>
       <w:pPr>
         <w:pStyle w:val="Heading2"/>
@@ -19893,9 +20033,9 @@
         </w:pict>
       </w:r>
     </w:p>
-    <w:bookmarkEnd w:id="70"/>
-    <w:bookmarkEnd w:id="71"/>
-    <w:bookmarkStart w:id="77" w:name="selectiedag"/>
+    <w:bookmarkEnd w:id="72"/>
+    <w:bookmarkEnd w:id="73"/>
+    <w:bookmarkStart w:id="79" w:name="selectiedag"/>
     <w:p>
       <w:pPr>
         <w:pStyle w:val="Heading1"/>
@@ -20063,7 +20203,7 @@
         <w:t xml:space="preserve">Naast de titel staat de datum van de selectiedag.</w:t>
       </w:r>
     </w:p>
-    <w:bookmarkStart w:id="72" w:name="stap-1-groepen-indelen"/>
+    <w:bookmarkStart w:id="74" w:name="stap-1-groepen-indelen"/>
     <w:p>
       <w:pPr>
         <w:pStyle w:val="Heading2"/>
@@ -20396,8 +20536,8 @@
         <w:t xml:space="preserve">.</w:t>
       </w:r>
     </w:p>
-    <w:bookmarkEnd w:id="72"/>
-    <w:bookmarkStart w:id="73" w:name="stap-2-inchecken"/>
+    <w:bookmarkEnd w:id="74"/>
+    <w:bookmarkStart w:id="75" w:name="stap-2-inchecken"/>
     <w:p>
       <w:pPr>
         <w:pStyle w:val="Heading2"/>
@@ -20915,8 +21055,8 @@
         <w:t xml:space="preserve">je naar stap 3.</w:t>
       </w:r>
     </w:p>
-    <w:bookmarkEnd w:id="73"/>
-    <w:bookmarkStart w:id="74" w:name="stap-3-beoordelen"/>
+    <w:bookmarkEnd w:id="75"/>
+    <w:bookmarkStart w:id="76" w:name="stap-3-beoordelen"/>
     <w:p>
       <w:pPr>
         <w:pStyle w:val="Heading2"/>
@@ -21410,8 +21550,8 @@
         <w:t xml:space="preserve">knop zie je alleen als je Sollicitanten mag lezen.</w:t>
       </w:r>
     </w:p>
-    <w:bookmarkEnd w:id="74"/>
-    <w:bookmarkStart w:id="75" w:name="stap-4-nabespreken"/>
+    <w:bookmarkEnd w:id="76"/>
+    <w:bookmarkStart w:id="77" w:name="stap-4-nabespreken"/>
     <w:p>
       <w:pPr>
         <w:pStyle w:val="Heading2"/>
@@ -21719,8 +21859,8 @@
         <w:t xml:space="preserve">.</w:t>
       </w:r>
     </w:p>
-    <w:bookmarkEnd w:id="75"/>
-    <w:bookmarkStart w:id="76" w:name="stap-5-de-bellijst"/>
+    <w:bookmarkEnd w:id="77"/>
+    <w:bookmarkStart w:id="78" w:name="stap-5-de-bellijst"/>
     <w:p>
       <w:pPr>
         <w:pStyle w:val="Heading2"/>
@@ -22180,9 +22320,9 @@
         </w:pict>
       </w:r>
     </w:p>
-    <w:bookmarkEnd w:id="76"/>
-    <w:bookmarkEnd w:id="77"/>
-    <w:bookmarkStart w:id="82" w:name="trainingsweekend"/>
+    <w:bookmarkEnd w:id="78"/>
+    <w:bookmarkEnd w:id="79"/>
+    <w:bookmarkStart w:id="84" w:name="trainingsweekend"/>
     <w:p>
       <w:pPr>
         <w:pStyle w:val="Heading1"/>
@@ -22350,7 +22490,7 @@
         <w:t xml:space="preserve">scherm op Voorbereiden, daarna op Beoordelen.</w:t>
       </w:r>
     </w:p>
-    <w:bookmarkStart w:id="78" w:name="stap-1-voorbereiden"/>
+    <w:bookmarkStart w:id="80" w:name="stap-1-voorbereiden"/>
     <w:p>
       <w:pPr>
         <w:pStyle w:val="Heading2"/>
@@ -22503,8 +22643,8 @@
         <w:t xml:space="preserve">inchecken afsluiten. Een nieuwe code maakt de oude links ongeldig.</w:t>
       </w:r>
     </w:p>
-    <w:bookmarkEnd w:id="78"/>
-    <w:bookmarkStart w:id="79" w:name="stap-2-inchecken-1"/>
+    <w:bookmarkEnd w:id="80"/>
+    <w:bookmarkStart w:id="81" w:name="stap-2-inchecken-1"/>
     <w:p>
       <w:pPr>
         <w:pStyle w:val="Heading2"/>
@@ -22547,6 +22687,65 @@
         <w:rPr>
           <w:lang w:val="nl"/>
         </w:rPr>
+        <w:t xml:space="preserve">Is de gezondheidsverklaring of het intakeformulier nog niet getekend (selectiedag en weekend),</w:t>
+      </w:r>
+      <w:r>
+        <w:rPr>
+          <w:lang w:val="nl"/>
+        </w:rPr>
+        <w:t xml:space="preserve"> </w:t>
+      </w:r>
+      <w:r>
+        <w:rPr>
+          <w:lang w:val="nl"/>
+        </w:rPr>
+        <w:t xml:space="preserve">dan zegt de tablet dat en gaat de link meteen uit: per mail en WhatsApp naar wie 18+ is, per mail</w:t>
+      </w:r>
+      <w:r>
+        <w:rPr>
+          <w:lang w:val="nl"/>
+        </w:rPr>
+        <w:t xml:space="preserve"> </w:t>
+      </w:r>
+      <w:r>
+        <w:rPr>
+          <w:lang w:val="nl"/>
+        </w:rPr>
+        <w:t xml:space="preserve">naar de ouder als die tekent, en zonder bekend ouder-adres een verzoek om dat in te vullen. In de</w:t>
+      </w:r>
+      <w:r>
+        <w:rPr>
+          <w:lang w:val="nl"/>
+        </w:rPr>
+        <w:t xml:space="preserve"> </w:t>
+      </w:r>
+      <w:r>
+        <w:rPr>
+          <w:lang w:val="nl"/>
+        </w:rPr>
+        <w:t xml:space="preserve">incheck-lijst van het beheer staat bij die persoon een rode markering "Niet getekend: …". Laat</w:t>
+      </w:r>
+      <w:r>
+        <w:rPr>
+          <w:lang w:val="nl"/>
+        </w:rPr>
+        <w:t xml:space="preserve"> </w:t>
+      </w:r>
+      <w:r>
+        <w:rPr>
+          <w:lang w:val="nl"/>
+        </w:rPr>
+        <w:t xml:space="preserve">niemand zonder getekende gezondheidsverklaring het water in.</w:t>
+      </w:r>
+    </w:p>
+    <w:p>
+      <w:pPr>
+        <w:pStyle w:val="BodyText"/>
+      </w:pPr>
+      <w:r>
+        <w:rPr>
+          <w:lang w:val="nl"/>
+        </w:rPr>
         <w:t xml:space="preserve">Lukt de tablet niet, dan vink je hier af:</w:t>
       </w:r>
       <w:r>
@@ -22670,8 +22869,8 @@
         <w:t xml:space="preserve">verschenen". Er sluit niets vanzelf af, en een laatkomer check je daarna gewoon nog in.</w:t>
       </w:r>
     </w:p>
-    <w:bookmarkEnd w:id="79"/>
-    <w:bookmarkStart w:id="80" w:name="stap-3-beoordelen-1"/>
+    <w:bookmarkEnd w:id="81"/>
+    <w:bookmarkStart w:id="82" w:name="stap-3-beoordelen-1"/>
     <w:p>
       <w:pPr>
         <w:pStyle w:val="Heading2"/>
@@ -22884,8 +23083,8 @@
         <w:t xml:space="preserve">en het telefoonnummer ziet alleen wie Sollicitanten mag lezen.</w:t>
       </w:r>
     </w:p>
-    <w:bookmarkEnd w:id="80"/>
-    <w:bookmarkStart w:id="81" w:name="stap-4-gesprekken"/>
+    <w:bookmarkEnd w:id="82"/>
+    <w:bookmarkStart w:id="83" w:name="stap-4-gesprekken"/>
     <w:p>
       <w:pPr>
         <w:pStyle w:val="Heading2"/>
@@ -22917,7 +23116,19 @@
         <w:rPr>
           <w:lang w:val="nl"/>
         </w:rPr>
-        <w:t xml:space="preserve">en Gesproken. De volgorde kies je ter plekke.</w:t>
+        <w:t xml:space="preserve">en Gesproken. De volgorde kies je ter plekke. Zoek op naam, filter op gesprek of besluit, of sorteer</w:t>
+      </w:r>
+      <w:r>
+        <w:rPr>
+          <w:lang w:val="nl"/>
+        </w:rPr>
+        <w:t xml:space="preserve"> </w:t>
+      </w:r>
+      <w:r>
+        <w:rPr>
+          <w:lang w:val="nl"/>
+        </w:rPr>
+        <w:t xml:space="preserve">op het selectiedag-cijfer.</w:t>
       </w:r>
     </w:p>
     <w:p>
@@ -23041,19 +23252,31 @@
         <w:rPr>
           <w:lang w:val="nl"/>
         </w:rPr>
-        <w:t xml:space="preserve">wijziging wordt meteen opgeslagen), wat er dit weekend en op de selectiedag is opgevallen, en wat</w:t>
-      </w:r>
-      <w:r>
-        <w:rPr>
-          <w:lang w:val="nl"/>
-        </w:rPr>
-        <w:t xml:space="preserve"> </w:t>
-      </w:r>
-      <w:r>
-        <w:rPr>
-          <w:lang w:val="nl"/>
-        </w:rPr>
-        <w:t xml:space="preserve">er nog openstaat in het portaal.</w:t>
+        <w:t xml:space="preserve">wijziging wordt meteen opgeslagen, en wat iemand in de loonplanning verandert zie je hier binnen</w:t>
+      </w:r>
+      <w:r>
+        <w:rPr>
+          <w:lang w:val="nl"/>
+        </w:rPr>
+        <w:t xml:space="preserve"> </w:t>
+      </w:r>
+      <w:r>
+        <w:rPr>
+          <w:lang w:val="nl"/>
+        </w:rPr>
+        <w:t xml:space="preserve">15 seconden), wat er dit weekend is opgevallen, de selectiedag (cijfers per onderdeel, advies,</w:t>
+      </w:r>
+      <w:r>
+        <w:rPr>
+          <w:lang w:val="nl"/>
+        </w:rPr>
+        <w:t xml:space="preserve"> </w:t>
+      </w:r>
+      <w:r>
+        <w:rPr>
+          <w:lang w:val="nl"/>
+        </w:rPr>
+        <w:t xml:space="preserve">besluit en opmerkingen), en wat er nog openstaat in het portaal.</w:t>
       </w:r>
     </w:p>
     <w:p>
@@ -23349,6 +23572,119 @@
     <w:p>
       <w:pPr>
         <w:pStyle w:val="FirstParagraph"/>
+      </w:pPr>
+      <w:r>
+        <w:rPr>
+          <w:lang w:val="nl"/>
+        </w:rPr>
+        <w:t xml:space="preserve">Bij aannemen of twijfel wordt de inzet van die persoon uit het actieve scenario naar</w:t>
+      </w:r>
+      <w:r>
+        <w:rPr>
+          <w:lang w:val="nl"/>
+        </w:rPr>
+        <w:t xml:space="preserve"> </w:t>
+      </w:r>
+      <w:r>
+        <w:rPr>
+          <w:b/>
+          <w:bCs/>
+          <w:lang w:val="nl"/>
+        </w:rPr>
+        <w:t xml:space="preserve">alle</w:t>
+      </w:r>
+      <w:r>
+        <w:rPr>
+          <w:lang w:val="nl"/>
+        </w:rPr>
+        <w:t xml:space="preserve"> </w:t>
+      </w:r>
+      <w:r>
+        <w:rPr>
+          <w:lang w:val="nl"/>
+        </w:rPr>
+        <w:t xml:space="preserve">scenario's gekopieerd en daar vastgezet: wat met de sollicitant besproken is, verandert niet meer</w:t>
+      </w:r>
+      <w:r>
+        <w:rPr>
+          <w:lang w:val="nl"/>
+        </w:rPr>
+        <w:t xml:space="preserve"> </w:t>
+      </w:r>
+      <w:r>
+        <w:rPr>
+          <w:lang w:val="nl"/>
+        </w:rPr>
+        <w:t xml:space="preserve">doordat iemand met een ander scenario speelt. Met de anderen kun je gewoon verder puzzelen. Moet</w:t>
+      </w:r>
+      <w:r>
+        <w:rPr>
+          <w:lang w:val="nl"/>
+        </w:rPr>
+        <w:t xml:space="preserve"> </w:t>
+      </w:r>
+      <w:r>
+        <w:rPr>
+          <w:lang w:val="nl"/>
+        </w:rPr>
+        <w:t xml:space="preserve">het toch anders (bijzondere situatie), klik dan op</w:t>
+      </w:r>
+      <w:r>
+        <w:rPr>
+          <w:lang w:val="nl"/>
+        </w:rPr>
+        <w:t xml:space="preserve"> </w:t>
+      </w:r>
+      <w:r>
+        <w:rPr>
+          <w:b/>
+          <w:bCs/>
+          <w:lang w:val="nl"/>
+        </w:rPr>
+        <w:t xml:space="preserve">Toch aanpassen</w:t>
+      </w:r>
+      <w:r>
+        <w:rPr>
+          <w:lang w:val="nl"/>
+        </w:rPr>
+        <w:t xml:space="preserve">, geef een reden (die komt in</w:t>
+      </w:r>
+      <w:r>
+        <w:rPr>
+          <w:lang w:val="nl"/>
+        </w:rPr>
+        <w:t xml:space="preserve"> </w:t>
+      </w:r>
+      <w:r>
+        <w:rPr>
+          <w:lang w:val="nl"/>
+        </w:rPr>
+        <w:t xml:space="preserve">het logboek), pas het aan en klik op</w:t>
+      </w:r>
+      <w:r>
+        <w:rPr>
+          <w:lang w:val="nl"/>
+        </w:rPr>
+        <w:t xml:space="preserve"> </w:t>
+      </w:r>
+      <w:r>
+        <w:rPr>
+          <w:b/>
+          <w:bCs/>
+          <w:lang w:val="nl"/>
+        </w:rPr>
+        <w:t xml:space="preserve">Nu vastzetten</w:t>
+      </w:r>
+      <w:r>
+        <w:rPr>
+          <w:lang w:val="nl"/>
+        </w:rPr>
+        <w:t xml:space="preserve">.</w:t>
+      </w:r>
+    </w:p>
+    <w:p>
+      <w:pPr>
+        <w:pStyle w:val="BodyText"/>
       </w:pPr>
       <w:r>
         <w:rPr>
@@ -23459,9 +23795,9 @@
         </w:pict>
       </w:r>
     </w:p>
-    <w:bookmarkEnd w:id="81"/>
-    <w:bookmarkEnd w:id="82"/>
-    <w:bookmarkStart w:id="87" w:name="ondertekeningen"/>
+    <w:bookmarkEnd w:id="83"/>
+    <w:bookmarkEnd w:id="84"/>
+    <w:bookmarkStart w:id="89" w:name="ondertekeningen"/>
     <w:p>
       <w:pPr>
         <w:pStyle w:val="Heading1"/>
@@ -23582,7 +23918,7 @@
         <w:t xml:space="preserve">een link in de mail. Komt een mail niet aan, kopieer dan de link en stuur hem zelf.</w:t>
       </w:r>
     </w:p>
-    <w:bookmarkStart w:id="83" w:name="welke-documenten"/>
+    <w:bookmarkStart w:id="85" w:name="welke-documenten"/>
     <w:p>
       <w:pPr>
         <w:pStyle w:val="Heading2"/>
@@ -23952,8 +24288,8 @@
         <w:t xml:space="preserve">document wordt verzegeld opgeslagen en is daarna niet meer te wijzigen.</w:t>
       </w:r>
     </w:p>
-    <w:bookmarkEnd w:id="83"/>
-    <w:bookmarkStart w:id="84" w:name="hoe-het-loopt"/>
+    <w:bookmarkEnd w:id="85"/>
+    <w:bookmarkStart w:id="86" w:name="hoe-het-loopt"/>
     <w:p>
       <w:pPr>
         <w:pStyle w:val="Heading2"/>
@@ -24150,8 +24486,8 @@
         <w:t xml:space="preserve">).</w:t>
       </w:r>
     </w:p>
-    <w:bookmarkEnd w:id="84"/>
-    <w:bookmarkStart w:id="85" w:name="het-overzicht-van-de-handtekeningen"/>
+    <w:bookmarkEnd w:id="86"/>
+    <w:bookmarkStart w:id="87" w:name="het-overzicht-van-de-handtekeningen"/>
     <w:p>
       <w:pPr>
         <w:pStyle w:val="Heading2"/>
@@ -24493,8 +24829,8 @@
         <w:t xml:space="preserve">dan 3 dagen openstaan (afgewezen kandidaten tellen niet mee).</w:t>
       </w:r>
     </w:p>
-    <w:bookmarkEnd w:id="85"/>
-    <w:bookmarkStart w:id="86" w:name="een-verkeerd-e-mailadres-van-de-ouder"/>
+    <w:bookmarkEnd w:id="87"/>
+    <w:bookmarkStart w:id="88" w:name="een-verkeerd-e-mailadres-van-de-ouder"/>
     <w:p>
       <w:pPr>
         <w:pStyle w:val="Heading2"/>
@@ -24642,9 +24978,9 @@
         </w:pict>
       </w:r>
     </w:p>
-    <w:bookmarkEnd w:id="86"/>
-    <w:bookmarkEnd w:id="87"/>
-    <w:bookmarkStart w:id="94" w:name="beschikbaarheid-dekking-en-loonplanning"/>
+    <w:bookmarkEnd w:id="88"/>
+    <w:bookmarkEnd w:id="89"/>
+    <w:bookmarkStart w:id="97" w:name="beschikbaarheid-dekking-en-loonplanning"/>
     <w:p>
       <w:pPr>
         <w:pStyle w:val="Heading1"/>
@@ -24789,7 +25125,7 @@
         <w:t xml:space="preserve">kijken wie zijn of haar beschikbaarheid nog niet definitief heeft gemaakt.</w:t>
       </w:r>
     </w:p>
-    <w:bookmarkStart w:id="88" w:name="het-beschikbaarheidsraster"/>
+    <w:bookmarkStart w:id="90" w:name="het-beschikbaarheidsraster"/>
     <w:p>
       <w:pPr>
         <w:pStyle w:val="Heading2"/>
@@ -24961,6 +25297,129 @@
           <w:lang w:val="nl"/>
         </w:rPr>
         <w:t xml:space="preserve">hoeft ze niet zelf na te bellen. Met het envelopje bij een naam mail je iemand direct.</w:t>
+      </w:r>
+    </w:p>
+    <w:p>
+      <w:pPr>
+        <w:pStyle w:val="Compact"/>
+        <w:numPr>
+          <w:ilvl w:val="0"/>
+          <w:numId w:val="1056"/>
+        </w:numPr>
+      </w:pPr>
+      <w:r>
+        <w:rPr>
+          <w:b/>
+          <w:bCs/>
+          <w:lang w:val="nl"/>
+        </w:rPr>
+        <w:t xml:space="preserve">Filters en export</w:t>
+      </w:r>
+      <w:r>
+        <w:rPr>
+          <w:lang w:val="nl"/>
+        </w:rPr>
+        <w:t xml:space="preserve">: zoek op naam, kies wie (iedereen, nog in de procedure, aangenomen), nieuw</w:t>
+      </w:r>
+      <w:r>
+        <w:rPr>
+          <w:lang w:val="nl"/>
+        </w:rPr>
+        <w:t xml:space="preserve"> </w:t>
+      </w:r>
+      <w:r>
+        <w:rPr>
+          <w:lang w:val="nl"/>
+        </w:rPr>
+        <w:t xml:space="preserve">of terugkerend, en toon alleen wie een open verzoek heeft of nog voorlopig is. Grafiek, raster</w:t>
+      </w:r>
+      <w:r>
+        <w:rPr>
+          <w:lang w:val="nl"/>
+        </w:rPr>
+        <w:t xml:space="preserve"> </w:t>
+      </w:r>
+      <w:r>
+        <w:rPr>
+          <w:lang w:val="nl"/>
+        </w:rPr>
+        <w:t xml:space="preserve">en totalen volgen de filter.</w:t>
+      </w:r>
+      <w:r>
+        <w:rPr>
+          <w:lang w:val="nl"/>
+        </w:rPr>
+        <w:t xml:space="preserve"> </w:t>
+      </w:r>
+      <w:r>
+        <w:rPr>
+          <w:b/>
+          <w:bCs/>
+          <w:lang w:val="nl"/>
+        </w:rPr>
+        <w:t xml:space="preserve">Export per week</w:t>
+      </w:r>
+      <w:r>
+        <w:rPr>
+          <w:lang w:val="nl"/>
+        </w:rPr>
+        <w:t xml:space="preserve"> </w:t>
+      </w:r>
+      <w:r>
+        <w:rPr>
+          <w:lang w:val="nl"/>
+        </w:rPr>
+        <w:t xml:space="preserve">geeft een Excel met per persoon per week het</w:t>
+      </w:r>
+      <w:r>
+        <w:rPr>
+          <w:lang w:val="nl"/>
+        </w:rPr>
+        <w:t xml:space="preserve"> </w:t>
+      </w:r>
+      <w:r>
+        <w:rPr>
+          <w:lang w:val="nl"/>
+        </w:rPr>
+        <w:t xml:space="preserve">aantal dagen;</w:t>
+      </w:r>
+      <w:r>
+        <w:rPr>
+          <w:lang w:val="nl"/>
+        </w:rPr>
+        <w:t xml:space="preserve"> </w:t>
+      </w:r>
+      <w:r>
+        <w:rPr>
+          <w:b/>
+          <w:bCs/>
+          <w:lang w:val="nl"/>
+        </w:rPr>
+        <w:t xml:space="preserve">Export per dag</w:t>
+      </w:r>
+      <w:r>
+        <w:rPr>
+          <w:lang w:val="nl"/>
+        </w:rPr>
+        <w:t xml:space="preserve"> </w:t>
+      </w:r>
+      <w:r>
+        <w:rPr>
+          <w:lang w:val="nl"/>
+        </w:rPr>
+        <w:t xml:space="preserve">per persoon per datum ja / nee / liever niet, met een tabblad</w:t>
+      </w:r>
+      <w:r>
+        <w:rPr>
+          <w:lang w:val="nl"/>
+        </w:rPr>
+        <w:t xml:space="preserve"> </w:t>
+      </w:r>
+      <w:r>
+        <w:rPr>
+          <w:lang w:val="nl"/>
+        </w:rPr>
+        <w:t xml:space="preserve">met de redenen. Beide exports volgen de filter en komen in het logboek.</w:t>
       </w:r>
     </w:p>
     <w:p>
@@ -25496,8 +25955,8 @@
         <w:t xml:space="preserve">Met een klik op een naam open je het dossier op het tabblad Beschikbaarheid.</w:t>
       </w:r>
     </w:p>
-    <w:bookmarkEnd w:id="88"/>
-    <w:bookmarkStart w:id="89" w:name="een-verzoek-om-minder-dagen-beoordelen"/>
+    <w:bookmarkEnd w:id="90"/>
+    <w:bookmarkStart w:id="91" w:name="een-verzoek-om-minder-dagen-beoordelen"/>
     <w:p>
       <w:pPr>
         <w:pStyle w:val="Heading2"/>
@@ -25760,8 +26219,8 @@
         <w:t xml:space="preserve">dossier kan.</w:t>
       </w:r>
     </w:p>
-    <w:bookmarkEnd w:id="89"/>
-    <w:bookmarkStart w:id="90" w:name="een-week-corrigeren"/>
+    <w:bookmarkEnd w:id="91"/>
+    <w:bookmarkStart w:id="92" w:name="een-week-corrigeren"/>
     <w:p>
       <w:pPr>
         <w:pStyle w:val="Heading2"/>
@@ -26225,8 +26684,8 @@
         <w:t xml:space="preserve">: dan geldt weer wat de sollicitant zelf opgaf.</w:t>
       </w:r>
     </w:p>
-    <w:bookmarkEnd w:id="90"/>
-    <w:bookmarkStart w:id="91" w:name="beschikbaarheid-volledig-bewerken"/>
+    <w:bookmarkEnd w:id="92"/>
+    <w:bookmarkStart w:id="93" w:name="beschikbaarheid-volledig-bewerken"/>
     <w:p>
       <w:pPr>
         <w:pStyle w:val="Heading2"/>
@@ -26698,8 +27157,8 @@
         <w:t xml:space="preserve">, met een reden (bewerkrecht op Beschikbaarheid).</w:t>
       </w:r>
     </w:p>
-    <w:bookmarkEnd w:id="91"/>
-    <w:bookmarkStart w:id="92" w:name="het-dekkingsscherm"/>
+    <w:bookmarkEnd w:id="93"/>
+    <w:bookmarkStart w:id="94" w:name="het-dekkingsscherm"/>
     <w:p>
       <w:pPr>
         <w:pStyle w:val="Heading2"/>
@@ -27030,8 +27489,8 @@
         <w:t xml:space="preserve">staat niet tegelijk op een andere post. De postcommandant valt buiten deze berekening.</w:t>
       </w:r>
     </w:p>
-    <w:bookmarkEnd w:id="92"/>
-    <w:bookmarkStart w:id="93" w:name="de-loonplanning"/>
+    <w:bookmarkEnd w:id="94"/>
+    <w:bookmarkStart w:id="96" w:name="de-loonplanning"/>
     <w:p>
       <w:pPr>
         <w:pStyle w:val="Heading2"/>
@@ -27188,6 +27647,17 @@
     </w:p>
     <w:p>
       <w:pPr>
+        <w:pStyle w:val="FirstParagraph"/>
+      </w:pPr>
+      <w:r>
+        <w:rPr>
+          <w:lang w:val="nl"/>
+        </w:rPr>
+        <w:t xml:space="preserve">Het scherm heeft dezelfde opbouw als Beschikbaarheid, van boven naar beneden:</w:t>
+      </w:r>
+    </w:p>
+    <w:p>
+      <w:pPr>
         <w:pStyle w:val="Compact"/>
         <w:numPr>
           <w:ilvl w:val="0"/>
@@ -27200,51 +27670,63 @@
           <w:bCs/>
           <w:lang w:val="nl"/>
         </w:rPr>
-        <w:t xml:space="preserve">Scenario's</w:t>
-      </w:r>
-      <w:r>
-        <w:rPr>
-          <w:lang w:val="nl"/>
-        </w:rPr>
-        <w:t xml:space="preserve">: bovenaan.</w:t>
-      </w:r>
-      <w:r>
-        <w:rPr>
-          <w:lang w:val="nl"/>
-        </w:rPr>
-        <w:t xml:space="preserve"> </w:t>
-      </w:r>
-      <w:r>
-        <w:rPr>
-          <w:b/>
-          <w:bCs/>
-          <w:lang w:val="nl"/>
-        </w:rPr>
-        <w:t xml:space="preserve">+ Dupliceren</w:t>
-      </w:r>
-      <w:r>
-        <w:rPr>
-          <w:lang w:val="nl"/>
-        </w:rPr>
-        <w:t xml:space="preserve"> </w:t>
-      </w:r>
-      <w:r>
-        <w:rPr>
-          <w:lang w:val="nl"/>
-        </w:rPr>
-        <w:t xml:space="preserve">maakt een kopie (met betaald/onbetaald en functies).</w:t>
-      </w:r>
-      <w:r>
-        <w:rPr>
-          <w:lang w:val="nl"/>
-        </w:rPr>
-        <w:t xml:space="preserve"> </w:t>
-      </w:r>
-      <w:r>
-        <w:rPr>
-          <w:lang w:val="nl"/>
-        </w:rPr>
-        <w:t xml:space="preserve">Bij een scenario dat niet actief is staan</w:t>
+        <w:t xml:space="preserve">Scenario</w:t>
+      </w:r>
+      <w:r>
+        <w:rPr>
+          <w:lang w:val="nl"/>
+        </w:rPr>
+        <w:t xml:space="preserve">: de knoppen met de scenario's; de ster is de actieve planning (die zie je ook in het</w:t>
+      </w:r>
+      <w:r>
+        <w:rPr>
+          <w:lang w:val="nl"/>
+        </w:rPr>
+        <w:t xml:space="preserve"> </w:t>
+      </w:r>
+      <w:r>
+        <w:rPr>
+          <w:lang w:val="nl"/>
+        </w:rPr>
+        <w:t xml:space="preserve">TW-gesprek).</w:t>
+      </w:r>
+      <w:r>
+        <w:rPr>
+          <w:lang w:val="nl"/>
+        </w:rPr>
+        <w:t xml:space="preserve"> </w:t>
+      </w:r>
+      <w:r>
+        <w:rPr>
+          <w:b/>
+          <w:bCs/>
+          <w:lang w:val="nl"/>
+        </w:rPr>
+        <w:t xml:space="preserve">Kopie maken</w:t>
+      </w:r>
+      <w:r>
+        <w:rPr>
+          <w:lang w:val="nl"/>
+        </w:rPr>
+        <w:t xml:space="preserve"> </w:t>
+      </w:r>
+      <w:r>
+        <w:rPr>
+          <w:lang w:val="nl"/>
+        </w:rPr>
+        <w:t xml:space="preserve">dupliceert het getoonde scenario en opent de kopie. Bij een scenario</w:t>
+      </w:r>
+      <w:r>
+        <w:rPr>
+          <w:lang w:val="nl"/>
+        </w:rPr>
+        <w:t xml:space="preserve"> </w:t>
+      </w:r>
+      <w:r>
+        <w:rPr>
+          <w:lang w:val="nl"/>
+        </w:rPr>
+        <w:t xml:space="preserve">dat niet actief is staan</w:t>
       </w:r>
       <w:r>
         <w:rPr>
@@ -27307,63 +27789,25 @@
           <w:bCs/>
           <w:lang w:val="nl"/>
         </w:rPr>
-        <w:t xml:space="preserve">Concept / Definitief</w:t>
-      </w:r>
-      <w:r>
-        <w:rPr>
-          <w:lang w:val="nl"/>
-        </w:rPr>
-        <w:t xml:space="preserve">: de balk onder de scenario's.</w:t>
-      </w:r>
-      <w:r>
-        <w:rPr>
-          <w:lang w:val="nl"/>
-        </w:rPr>
-        <w:t xml:space="preserve"> </w:t>
-      </w:r>
-      <w:r>
-        <w:rPr>
-          <w:b/>
-          <w:bCs/>
-          <w:lang w:val="nl"/>
-        </w:rPr>
-        <w:t xml:space="preserve">Loonplanning definitief maken</w:t>
-      </w:r>
-      <w:r>
-        <w:rPr>
-          <w:lang w:val="nl"/>
-        </w:rPr>
-        <w:t xml:space="preserve"> </w:t>
-      </w:r>
-      <w:r>
-        <w:rPr>
-          <w:lang w:val="nl"/>
-        </w:rPr>
-        <w:t xml:space="preserve">maakt het</w:t>
-      </w:r>
-      <w:r>
-        <w:rPr>
-          <w:lang w:val="nl"/>
-        </w:rPr>
-        <w:t xml:space="preserve"> </w:t>
-      </w:r>
-      <w:r>
-        <w:rPr>
-          <w:lang w:val="nl"/>
-        </w:rPr>
-        <w:t xml:space="preserve">getoonde scenario de actieve planning én de afspraak van iedereen die is aangenomen. Wie is</w:t>
-      </w:r>
-      <w:r>
-        <w:rPr>
-          <w:lang w:val="nl"/>
-        </w:rPr>
-        <w:t xml:space="preserve"> </w:t>
-      </w:r>
-      <w:r>
-        <w:rPr>
-          <w:lang w:val="nl"/>
-        </w:rPr>
-        <w:t xml:space="preserve">aangenomen maar nergens staat ingepland, krijgt geen afspraak; die naam staat in de melding.</w:t>
+        <w:t xml:space="preserve">Loonkosten, werkdagen en budget</w:t>
+      </w:r>
+      <w:r>
+        <w:rPr>
+          <w:lang w:val="nl"/>
+        </w:rPr>
+        <w:t xml:space="preserve">: de kosten van betaalde dagen, het aantal werkdagen (en</w:t>
+      </w:r>
+      <w:r>
+        <w:rPr>
+          <w:lang w:val="nl"/>
+        </w:rPr>
+        <w:t xml:space="preserve"> </w:t>
+      </w:r>
+      <w:r>
+        <w:rPr>
+          <w:lang w:val="nl"/>
+        </w:rPr>
+        <w:t xml:space="preserve">hoeveel daarvan onbetaald) en de budgetbalk met wat er nog over is.</w:t>
       </w:r>
     </w:p>
     <w:p>
@@ -27380,89 +27824,116 @@
           <w:bCs/>
           <w:lang w:val="nl"/>
         </w:rPr>
-        <w:t xml:space="preserve">De tabel</w:t>
-      </w:r>
-      <w:r>
-        <w:rPr>
-          <w:lang w:val="nl"/>
-        </w:rPr>
-        <w:t xml:space="preserve">: per persoon de</w:t>
-      </w:r>
-      <w:r>
-        <w:rPr>
-          <w:lang w:val="nl"/>
-        </w:rPr>
-        <w:t xml:space="preserve"> </w:t>
-      </w:r>
-      <w:r>
-        <w:rPr>
-          <w:b/>
-          <w:bCs/>
-          <w:lang w:val="nl"/>
-        </w:rPr>
-        <w:t xml:space="preserve">Functie</w:t>
-      </w:r>
-      <w:r>
-        <w:rPr>
-          <w:lang w:val="nl"/>
-        </w:rPr>
-        <w:t xml:space="preserve"> </w:t>
-      </w:r>
-      <w:r>
-        <w:rPr>
-          <w:lang w:val="nl"/>
-        </w:rPr>
-        <w:t xml:space="preserve">en per week een vinkje (inplannen), het aantal dagen en</w:t>
-      </w:r>
-      <w:r>
-        <w:rPr>
-          <w:lang w:val="nl"/>
-        </w:rPr>
-        <w:t xml:space="preserve"> </w:t>
-      </w:r>
-      <w:r>
-        <w:rPr>
-          <w:b/>
-          <w:bCs/>
-          <w:lang w:val="nl"/>
-        </w:rPr>
-        <w:t xml:space="preserve">betaald</w:t>
-      </w:r>
-      <w:r>
-        <w:rPr>
-          <w:lang w:val="nl"/>
-        </w:rPr>
-        <w:t xml:space="preserve"> </w:t>
-      </w:r>
-      <w:r>
-        <w:rPr>
-          <w:lang w:val="nl"/>
-        </w:rPr>
-        <w:t xml:space="preserve">(uitzetten voor een onbetaalde week, bijvoorbeeld "8 weken waarvan 5 betaald").</w:t>
-      </w:r>
-      <w:r>
-        <w:rPr>
-          <w:lang w:val="nl"/>
-        </w:rPr>
-        <w:t xml:space="preserve"> </w:t>
-      </w:r>
-      <w:r>
-        <w:rPr>
-          <w:lang w:val="nl"/>
-        </w:rPr>
-        <w:t xml:space="preserve">Alle weken van het seizoen zijn te plannen, ook weken die iemand niet opgaf (stippelrand; dat</w:t>
-      </w:r>
-      <w:r>
-        <w:rPr>
-          <w:lang w:val="nl"/>
-        </w:rPr>
-        <w:t xml:space="preserve"> </w:t>
-      </w:r>
-      <w:r>
-        <w:rPr>
-          <w:lang w:val="nl"/>
-        </w:rPr>
-        <w:t xml:space="preserve">komt ook bij de signalen). Een oranje rand betekent meer dagen dan opgegeven, of meer dan vijf.</w:t>
+        <w:t xml:space="preserve">Concept of definitief</w:t>
+      </w:r>
+      <w:r>
+        <w:rPr>
+          <w:lang w:val="nl"/>
+        </w:rPr>
+        <w:t xml:space="preserve">:</w:t>
+      </w:r>
+      <w:r>
+        <w:rPr>
+          <w:lang w:val="nl"/>
+        </w:rPr>
+        <w:t xml:space="preserve"> </w:t>
+      </w:r>
+      <w:r>
+        <w:rPr>
+          <w:b/>
+          <w:bCs/>
+          <w:lang w:val="nl"/>
+        </w:rPr>
+        <w:t xml:space="preserve">Definitief maken</w:t>
+      </w:r>
+      <w:r>
+        <w:rPr>
+          <w:lang w:val="nl"/>
+        </w:rPr>
+        <w:t xml:space="preserve"> </w:t>
+      </w:r>
+      <w:r>
+        <w:rPr>
+          <w:lang w:val="nl"/>
+        </w:rPr>
+        <w:t xml:space="preserve">maakt het getoonde scenario de actieve planning én</w:t>
+      </w:r>
+      <w:r>
+        <w:rPr>
+          <w:lang w:val="nl"/>
+        </w:rPr>
+        <w:t xml:space="preserve"> </w:t>
+      </w:r>
+      <w:r>
+        <w:rPr>
+          <w:lang w:val="nl"/>
+        </w:rPr>
+        <w:t xml:space="preserve">de afspraak van iedereen die is aangenomen. Wie is aangenomen maar nergens staat ingepland, krijgt</w:t>
+      </w:r>
+      <w:r>
+        <w:rPr>
+          <w:lang w:val="nl"/>
+        </w:rPr>
+        <w:t xml:space="preserve"> </w:t>
+      </w:r>
+      <w:r>
+        <w:rPr>
+          <w:lang w:val="nl"/>
+        </w:rPr>
+        <w:t xml:space="preserve">geen afspraak; die naam staat in de melding. Onder</w:t>
+      </w:r>
+      <w:r>
+        <w:rPr>
+          <w:lang w:val="nl"/>
+        </w:rPr>
+        <w:t xml:space="preserve"> </w:t>
+      </w:r>
+      <w:r>
+        <w:rPr>
+          <w:b/>
+          <w:bCs/>
+          <w:lang w:val="nl"/>
+        </w:rPr>
+        <w:t xml:space="preserve">Exporteren</w:t>
+      </w:r>
+      <w:r>
+        <w:rPr>
+          <w:lang w:val="nl"/>
+        </w:rPr>
+        <w:t xml:space="preserve">: de Excel voor de</w:t>
+      </w:r>
+      <w:r>
+        <w:rPr>
+          <w:lang w:val="nl"/>
+        </w:rPr>
+        <w:t xml:space="preserve"> </w:t>
+      </w:r>
+      <w:r>
+        <w:rPr>
+          <w:lang w:val="nl"/>
+        </w:rPr>
+        <w:t xml:space="preserve">loonadministratie (vastgesteld of dit scenario) en de export voor het rooster (Excel of JSON; zie</w:t>
+      </w:r>
+      <w:r>
+        <w:rPr>
+          <w:lang w:val="nl"/>
+        </w:rPr>
+        <w:t xml:space="preserve"> </w:t>
+      </w:r>
+      <w:hyperlink r:id="rId95">
+        <w:r>
+          <w:rPr>
+            <w:rStyle w:val="Hyperlink"/>
+            <w:lang w:val="nl"/>
+          </w:rPr>
+          <w:t xml:space="preserve">Rooster-koppeling</w:t>
+        </w:r>
+      </w:hyperlink>
+      <w:r>
+        <w:rPr>
+          <w:lang w:val="nl"/>
+        </w:rPr>
+        <w:t xml:space="preserve">).</w:t>
       </w:r>
     </w:p>
     <w:p>
@@ -27479,37 +27950,13 @@
           <w:bCs/>
           <w:lang w:val="nl"/>
         </w:rPr>
-        <w:t xml:space="preserve">Functie</w:t>
-      </w:r>
-      <w:r>
-        <w:rPr>
-          <w:lang w:val="nl"/>
-        </w:rPr>
-        <w:t xml:space="preserve">: staat per persoon. "voorstel" betekent dat het systeem hem koos: een nieuwe</w:t>
-      </w:r>
-      <w:r>
-        <w:rPr>
-          <w:lang w:val="nl"/>
-        </w:rPr>
-        <w:t xml:space="preserve"> </w:t>
-      </w:r>
-      <w:r>
-        <w:rPr>
-          <w:lang w:val="nl"/>
-        </w:rPr>
-        <w:t xml:space="preserve">sollicitant is Aspirant, wie in Authentik een Lifeguard-rang heeft krijgt die rang (Junior,</w:t>
-      </w:r>
-      <w:r>
-        <w:rPr>
-          <w:lang w:val="nl"/>
-        </w:rPr>
-        <w:t xml:space="preserve"> </w:t>
-      </w:r>
-      <w:r>
-        <w:rPr>
-          <w:lang w:val="nl"/>
-        </w:rPr>
-        <w:t xml:space="preserve">Lifeguard, Senior). Kies je zelf, dan verdwijnt "voorstel". Postcommandant kies je altijd zelf.</w:t>
+        <w:t xml:space="preserve">Ingepland per week</w:t>
+      </w:r>
+      <w:r>
+        <w:rPr>
+          <w:lang w:val="nl"/>
+        </w:rPr>
+        <w:t xml:space="preserve">: hoeveel mensen je per week hebt ingepland, tegen de norm van de posten.</w:t>
       </w:r>
     </w:p>
     <w:p>
@@ -27526,115 +27973,25 @@
           <w:bCs/>
           <w:lang w:val="nl"/>
         </w:rPr>
-        <w:t xml:space="preserve">Afspraak per persoon</w:t>
-      </w:r>
-      <w:r>
-        <w:rPr>
-          <w:lang w:val="nl"/>
-        </w:rPr>
-        <w:t xml:space="preserve">: na definitief maken staat bij de naam "Afspraak dd-mm". Wijzig je daarna</w:t>
-      </w:r>
-      <w:r>
-        <w:rPr>
-          <w:lang w:val="nl"/>
-        </w:rPr>
-        <w:t xml:space="preserve"> </w:t>
-      </w:r>
-      <w:r>
-        <w:rPr>
-          <w:lang w:val="nl"/>
-        </w:rPr>
-        <w:t xml:space="preserve">iets in het scenario, dan staat er</w:t>
-      </w:r>
-      <w:r>
-        <w:rPr>
-          <w:lang w:val="nl"/>
-        </w:rPr>
-        <w:t xml:space="preserve"> </w:t>
-      </w:r>
-      <w:r>
-        <w:rPr>
-          <w:b/>
-          <w:bCs/>
-          <w:lang w:val="nl"/>
-        </w:rPr>
-        <w:t xml:space="preserve">Wijkt af van afspraak</w:t>
-      </w:r>
-      <w:r>
-        <w:rPr>
-          <w:lang w:val="nl"/>
-        </w:rPr>
-        <w:t xml:space="preserve"> </w:t>
-      </w:r>
-      <w:r>
-        <w:rPr>
-          <w:lang w:val="nl"/>
-        </w:rPr>
-        <w:t xml:space="preserve">met de knop</w:t>
-      </w:r>
-      <w:r>
-        <w:rPr>
-          <w:lang w:val="nl"/>
-        </w:rPr>
-        <w:t xml:space="preserve"> </w:t>
-      </w:r>
-      <w:r>
-        <w:rPr>
-          <w:b/>
-          <w:bCs/>
-          <w:lang w:val="nl"/>
-        </w:rPr>
-        <w:t xml:space="preserve">Afspraak bijwerken</w:t>
-      </w:r>
-      <w:r>
-        <w:rPr>
-          <w:lang w:val="nl"/>
-        </w:rPr>
-        <w:t xml:space="preserve">.</w:t>
-      </w:r>
-      <w:r>
-        <w:rPr>
-          <w:lang w:val="nl"/>
-        </w:rPr>
-        <w:t xml:space="preserve"> </w:t>
-      </w:r>
-      <w:r>
-        <w:rPr>
-          <w:lang w:val="nl"/>
-        </w:rPr>
-        <w:t xml:space="preserve">Wordt iemand later aangenomen, dan staat er</w:t>
-      </w:r>
-      <w:r>
-        <w:rPr>
-          <w:lang w:val="nl"/>
-        </w:rPr>
-        <w:t xml:space="preserve"> </w:t>
-      </w:r>
-      <w:r>
-        <w:rPr>
-          <w:b/>
-          <w:bCs/>
-          <w:lang w:val="nl"/>
-        </w:rPr>
-        <w:t xml:space="preserve">Afspraak vaststellen</w:t>
-      </w:r>
-      <w:r>
-        <w:rPr>
-          <w:lang w:val="nl"/>
-        </w:rPr>
-        <w:t xml:space="preserve">. Elke vaststelling komt in</w:t>
-      </w:r>
-      <w:r>
-        <w:rPr>
-          <w:lang w:val="nl"/>
-        </w:rPr>
-        <w:t xml:space="preserve"> </w:t>
-      </w:r>
-      <w:r>
-        <w:rPr>
-          <w:lang w:val="nl"/>
-        </w:rPr>
-        <w:t xml:space="preserve">het logboek.</w:t>
+        <w:t xml:space="preserve">Filters</w:t>
+      </w:r>
+      <w:r>
+        <w:rPr>
+          <w:lang w:val="nl"/>
+        </w:rPr>
+        <w:t xml:space="preserve">: zoek op naam, functie, wie (in de procedure of aangenomen) en toon alleen wie een</w:t>
+      </w:r>
+      <w:r>
+        <w:rPr>
+          <w:lang w:val="nl"/>
+        </w:rPr>
+        <w:t xml:space="preserve"> </w:t>
+      </w:r>
+      <w:r>
+        <w:rPr>
+          <w:lang w:val="nl"/>
+        </w:rPr>
+        <w:t xml:space="preserve">afwijking heeft, nog niet is ingepland, of wel of niet vaststaat na het gesprek.</w:t>
       </w:r>
     </w:p>
     <w:p>
@@ -27651,89 +28008,49 @@
           <w:bCs/>
           <w:lang w:val="nl"/>
         </w:rPr>
-        <w:t xml:space="preserve">Signalen (N)</w:t>
-      </w:r>
-      <w:r>
-        <w:rPr>
-          <w:lang w:val="nl"/>
-        </w:rPr>
-        <w:t xml:space="preserve">: aandachtspunten, geen blokkades: meer dagen dan opgegeven, een week die niet is</w:t>
-      </w:r>
-      <w:r>
-        <w:rPr>
-          <w:lang w:val="nl"/>
-        </w:rPr>
-        <w:t xml:space="preserve"> </w:t>
-      </w:r>
-      <w:r>
-        <w:rPr>
-          <w:lang w:val="nl"/>
-        </w:rPr>
-        <w:t xml:space="preserve">opgegeven, meer dan vijf dagen, of weinig rust over de weekgrens.</w:t>
-      </w:r>
-    </w:p>
-    <w:p>
-      <w:pPr>
-        <w:pStyle w:val="Compact"/>
-        <w:numPr>
-          <w:ilvl w:val="0"/>
-          <w:numId w:val="1063"/>
-        </w:numPr>
-      </w:pPr>
-      <w:r>
-        <w:rPr>
-          <w:b/>
-          <w:bCs/>
-          <w:lang w:val="nl"/>
-        </w:rPr>
-        <w:t xml:space="preserve">Dekking</w:t>
-      </w:r>
-      <w:r>
-        <w:rPr>
-          <w:lang w:val="nl"/>
-        </w:rPr>
-        <w:t xml:space="preserve"> </w:t>
-      </w:r>
-      <w:r>
-        <w:rPr>
-          <w:lang w:val="nl"/>
-        </w:rPr>
-        <w:t xml:space="preserve">(onderste rijen): rekent met wie je werkelijk inplant. Daaronder de kosten per week.</w:t>
-      </w:r>
-    </w:p>
-    <w:p>
-      <w:pPr>
-        <w:pStyle w:val="Compact"/>
-        <w:numPr>
-          <w:ilvl w:val="0"/>
-          <w:numId w:val="1063"/>
-        </w:numPr>
-      </w:pPr>
-      <w:r>
-        <w:rPr>
-          <w:b/>
-          <w:bCs/>
-          <w:lang w:val="nl"/>
-        </w:rPr>
-        <w:t xml:space="preserve">Onderaan</w:t>
-      </w:r>
-      <w:r>
-        <w:rPr>
-          <w:lang w:val="nl"/>
-        </w:rPr>
-        <w:t xml:space="preserve">: totale loonkosten (alleen betaalde dagen), mandagen met het aantal onbetaalde</w:t>
-      </w:r>
-      <w:r>
-        <w:rPr>
-          <w:lang w:val="nl"/>
-        </w:rPr>
-        <w:t xml:space="preserve"> </w:t>
-      </w:r>
-      <w:r>
-        <w:rPr>
-          <w:lang w:val="nl"/>
-        </w:rPr>
-        <w:t xml:space="preserve">dagen, en de budgetbalk.</w:t>
+        <w:t xml:space="preserve">De planning</w:t>
+      </w:r>
+      <w:r>
+        <w:rPr>
+          <w:lang w:val="nl"/>
+        </w:rPr>
+        <w:t xml:space="preserve">: per persoon per week staat groot wat je plant en klein wat iemand opgaf ("kan 4";</w:t>
+      </w:r>
+      <w:r>
+        <w:rPr>
+          <w:lang w:val="nl"/>
+        </w:rPr>
+        <w:t xml:space="preserve"> </w:t>
+      </w:r>
+      <w:r>
+        <w:rPr>
+          <w:lang w:val="nl"/>
+        </w:rPr>
+        <w:t xml:space="preserve">"niet opg." als de week niet is opgegeven). Blauw is gepland, oranje met "onb." is onbetaald, rood</w:t>
+      </w:r>
+      <w:r>
+        <w:rPr>
+          <w:lang w:val="nl"/>
+        </w:rPr>
+        <w:t xml:space="preserve"> </w:t>
+      </w:r>
+      <w:r>
+        <w:rPr>
+          <w:lang w:val="nl"/>
+        </w:rPr>
+        <w:t xml:space="preserve">met een stippelrand is meer dan opgegeven. Een streepje met "kan 4" is opgegeven maar niet</w:t>
+      </w:r>
+      <w:r>
+        <w:rPr>
+          <w:lang w:val="nl"/>
+        </w:rPr>
+        <w:t xml:space="preserve"> </w:t>
+      </w:r>
+      <w:r>
+        <w:rPr>
+          <w:lang w:val="nl"/>
+        </w:rPr>
+        <w:t xml:space="preserve">gepland. Onderaan per week het aantal ingeplande mensen (en hoeveel in het weekend) en de kosten.</w:t>
       </w:r>
     </w:p>
     <w:p>
@@ -27742,6 +28059,491 @@
       </w:pPr>
       <w:r>
         <w:rPr>
+          <w:b/>
+          <w:bCs/>
+          <w:lang w:val="nl"/>
+        </w:rPr>
+        <w:t xml:space="preserve">Een week plannen</w:t>
+      </w:r>
+      <w:r>
+        <w:rPr>
+          <w:lang w:val="nl"/>
+        </w:rPr>
+        <w:t xml:space="preserve">: klik op de cel. In het paneel zie je per dag of iemand kan, liever niet of</w:t>
+      </w:r>
+      <w:r>
+        <w:rPr>
+          <w:lang w:val="nl"/>
+        </w:rPr>
+        <w:t xml:space="preserve"> </w:t>
+      </w:r>
+      <w:r>
+        <w:rPr>
+          <w:lang w:val="nl"/>
+        </w:rPr>
+        <w:t xml:space="preserve">niet kan (met de reden: vakantie, bijbaan, en dergelijke). Vink</w:t>
+      </w:r>
+      <w:r>
+        <w:rPr>
+          <w:lang w:val="nl"/>
+        </w:rPr>
+        <w:t xml:space="preserve"> </w:t>
+      </w:r>
+      <w:r>
+        <w:rPr>
+          <w:b/>
+          <w:bCs/>
+          <w:lang w:val="nl"/>
+        </w:rPr>
+        <w:t xml:space="preserve">Deze week inplannen</w:t>
+      </w:r>
+      <w:r>
+        <w:rPr>
+          <w:lang w:val="nl"/>
+        </w:rPr>
+        <w:t xml:space="preserve"> </w:t>
+      </w:r>
+      <w:r>
+        <w:rPr>
+          <w:lang w:val="nl"/>
+        </w:rPr>
+        <w:t xml:space="preserve">aan (dat</w:t>
+      </w:r>
+      <w:r>
+        <w:rPr>
+          <w:lang w:val="nl"/>
+        </w:rPr>
+        <w:t xml:space="preserve"> </w:t>
+      </w:r>
+      <w:r>
+        <w:rPr>
+          <w:lang w:val="nl"/>
+        </w:rPr>
+        <w:t xml:space="preserve">zet vijf dagen, of minder als iemand minder opgaf), zet het aantal dagen met</w:t>
+      </w:r>
+      <w:r>
+        <w:rPr>
+          <w:lang w:val="nl"/>
+        </w:rPr>
+        <w:t xml:space="preserve"> </w:t>
+      </w:r>
+      <w:r>
+        <w:rPr>
+          <w:b/>
+          <w:bCs/>
+          <w:lang w:val="nl"/>
+        </w:rPr>
+        <w:t xml:space="preserve">−</w:t>
+      </w:r>
+      <w:r>
+        <w:rPr>
+          <w:lang w:val="nl"/>
+        </w:rPr>
+        <w:t xml:space="preserve"> </w:t>
+      </w:r>
+      <w:r>
+        <w:rPr>
+          <w:lang w:val="nl"/>
+        </w:rPr>
+        <w:t xml:space="preserve">en</w:t>
+      </w:r>
+      <w:r>
+        <w:rPr>
+          <w:lang w:val="nl"/>
+        </w:rPr>
+        <w:t xml:space="preserve"> </w:t>
+      </w:r>
+      <w:r>
+        <w:rPr>
+          <w:b/>
+          <w:bCs/>
+          <w:lang w:val="nl"/>
+        </w:rPr>
+        <w:t xml:space="preserve">+</w:t>
+      </w:r>
+      <w:r>
+        <w:rPr>
+          <w:lang w:val="nl"/>
+        </w:rPr>
+        <w:t xml:space="preserve">, en zet</w:t>
+      </w:r>
+      <w:r>
+        <w:rPr>
+          <w:lang w:val="nl"/>
+        </w:rPr>
+        <w:t xml:space="preserve"> </w:t>
+      </w:r>
+      <w:r>
+        <w:rPr>
+          <w:b/>
+          <w:bCs/>
+          <w:lang w:val="nl"/>
+        </w:rPr>
+        <w:t xml:space="preserve">Betaald</w:t>
+      </w:r>
+      <w:r>
+        <w:rPr>
+          <w:lang w:val="nl"/>
+        </w:rPr>
+        <w:t xml:space="preserve"> </w:t>
+      </w:r>
+      <w:r>
+        <w:rPr>
+          <w:lang w:val="nl"/>
+        </w:rPr>
+        <w:t xml:space="preserve">uit voor een onbetaalde week. Elke wijziging slaat meteen op.</w:t>
+      </w:r>
+      <w:r>
+        <w:rPr>
+          <w:lang w:val="nl"/>
+        </w:rPr>
+        <w:t xml:space="preserve"> </w:t>
+      </w:r>
+      <w:r>
+        <w:rPr>
+          <w:b/>
+          <w:bCs/>
+          <w:lang w:val="nl"/>
+        </w:rPr>
+        <w:t xml:space="preserve">Zelfde voor de volgende</w:t>
+      </w:r>
+      <w:r>
+        <w:rPr>
+          <w:b/>
+          <w:bCs/>
+          <w:lang w:val="nl"/>
+        </w:rPr>
+        <w:t xml:space="preserve"> </w:t>
+      </w:r>
+      <w:r>
+        <w:rPr>
+          <w:b/>
+          <w:bCs/>
+          <w:lang w:val="nl"/>
+        </w:rPr>
+        <w:t xml:space="preserve">opgegeven weken</w:t>
+      </w:r>
+      <w:r>
+        <w:rPr>
+          <w:lang w:val="nl"/>
+        </w:rPr>
+        <w:t xml:space="preserve"> </w:t>
+      </w:r>
+      <w:r>
+        <w:rPr>
+          <w:lang w:val="nl"/>
+        </w:rPr>
+        <w:t xml:space="preserve">plant de weken erna hetzelfde, nooit met meer dagen dan iemand opgaf.</w:t>
+      </w:r>
+    </w:p>
+    <w:p>
+      <w:pPr>
+        <w:pStyle w:val="BodyText"/>
+      </w:pPr>
+      <w:r>
+        <w:rPr>
+          <w:b/>
+          <w:bCs/>
+          <w:lang w:val="nl"/>
+        </w:rPr>
+        <w:t xml:space="preserve">Onbetaalde weken</w:t>
+      </w:r>
+      <w:r>
+        <w:rPr>
+          <w:lang w:val="nl"/>
+        </w:rPr>
+        <w:t xml:space="preserve"> </w:t>
+      </w:r>
+      <w:r>
+        <w:rPr>
+          <w:lang w:val="nl"/>
+        </w:rPr>
+        <w:t xml:space="preserve">zijn echte werkdagen die je met de sollicitant afspreekt; alleen het loon valt</w:t>
+      </w:r>
+      <w:r>
+        <w:rPr>
+          <w:lang w:val="nl"/>
+        </w:rPr>
+        <w:t xml:space="preserve"> </w:t>
+      </w:r>
+      <w:r>
+        <w:rPr>
+          <w:lang w:val="nl"/>
+        </w:rPr>
+        <w:t xml:space="preserve">weg. Ze tellen mee in de dekking, staan in de afspraak en gaan gewoon naar het rooster.</w:t>
+      </w:r>
+    </w:p>
+    <w:p>
+      <w:pPr>
+        <w:pStyle w:val="BodyText"/>
+      </w:pPr>
+      <w:r>
+        <w:rPr>
+          <w:b/>
+          <w:bCs/>
+          <w:lang w:val="nl"/>
+        </w:rPr>
+        <w:t xml:space="preserve">Minder plannen dan opgegeven</w:t>
+      </w:r>
+      <w:r>
+        <w:rPr>
+          <w:lang w:val="nl"/>
+        </w:rPr>
+        <w:t xml:space="preserve"> </w:t>
+      </w:r>
+      <w:r>
+        <w:rPr>
+          <w:lang w:val="nl"/>
+        </w:rPr>
+        <w:t xml:space="preserve">(bijvoorbeeld 3 dagen terwijl iemand er 4 opgaf) is gewoon goed: de</w:t>
+      </w:r>
+      <w:r>
+        <w:rPr>
+          <w:lang w:val="nl"/>
+        </w:rPr>
+        <w:t xml:space="preserve"> </w:t>
+      </w:r>
+      <w:r>
+        <w:rPr>
+          <w:lang w:val="nl"/>
+        </w:rPr>
+        <w:t xml:space="preserve">afspraak zegt 3, en het rooster kiest 3 van de 4 dagen waarop iemand kan.</w:t>
+      </w:r>
+      <w:r>
+        <w:rPr>
+          <w:lang w:val="nl"/>
+        </w:rPr>
+        <w:t xml:space="preserve"> </w:t>
+      </w:r>
+      <w:r>
+        <w:rPr>
+          <w:b/>
+          <w:bCs/>
+          <w:lang w:val="nl"/>
+        </w:rPr>
+        <w:t xml:space="preserve">Meer plannen dan</w:t>
+      </w:r>
+      <w:r>
+        <w:rPr>
+          <w:b/>
+          <w:bCs/>
+          <w:lang w:val="nl"/>
+        </w:rPr>
+        <w:t xml:space="preserve"> </w:t>
+      </w:r>
+      <w:r>
+        <w:rPr>
+          <w:b/>
+          <w:bCs/>
+          <w:lang w:val="nl"/>
+        </w:rPr>
+        <w:t xml:space="preserve">opgegeven</w:t>
+      </w:r>
+      <w:r>
+        <w:rPr>
+          <w:lang w:val="nl"/>
+        </w:rPr>
+        <w:t xml:space="preserve"> </w:t>
+      </w:r>
+      <w:r>
+        <w:rPr>
+          <w:lang w:val="nl"/>
+        </w:rPr>
+        <w:t xml:space="preserve">kan ook, maar dan is de cel rood: bespreek het met de sollicitant.</w:t>
+      </w:r>
+    </w:p>
+    <w:p>
+      <w:pPr>
+        <w:pStyle w:val="BodyText"/>
+      </w:pPr>
+      <w:r>
+        <w:rPr>
+          <w:b/>
+          <w:bCs/>
+          <w:lang w:val="nl"/>
+        </w:rPr>
+        <w:t xml:space="preserve">Een persoon</w:t>
+      </w:r>
+      <w:r>
+        <w:rPr>
+          <w:lang w:val="nl"/>
+        </w:rPr>
+        <w:t xml:space="preserve">: klik op de naam. Je ziet de</w:t>
+      </w:r>
+      <w:r>
+        <w:rPr>
+          <w:lang w:val="nl"/>
+        </w:rPr>
+        <w:t xml:space="preserve"> </w:t>
+      </w:r>
+      <w:r>
+        <w:rPr>
+          <w:b/>
+          <w:bCs/>
+          <w:lang w:val="nl"/>
+        </w:rPr>
+        <w:t xml:space="preserve">Functie</w:t>
+      </w:r>
+      <w:r>
+        <w:rPr>
+          <w:lang w:val="nl"/>
+        </w:rPr>
+        <w:t xml:space="preserve"> </w:t>
+      </w:r>
+      <w:r>
+        <w:rPr>
+          <w:lang w:val="nl"/>
+        </w:rPr>
+        <w:t xml:space="preserve">("voorstel": nieuw = Aspirant, anders de</w:t>
+      </w:r>
+      <w:r>
+        <w:rPr>
+          <w:lang w:val="nl"/>
+        </w:rPr>
+        <w:t xml:space="preserve"> </w:t>
+      </w:r>
+      <w:r>
+        <w:rPr>
+          <w:lang w:val="nl"/>
+        </w:rPr>
+        <w:t xml:space="preserve">Lifeguard-rang uit Authentik; Postcommandant kies je zelf), de totalen, de</w:t>
+      </w:r>
+      <w:r>
+        <w:rPr>
+          <w:lang w:val="nl"/>
+        </w:rPr>
+        <w:t xml:space="preserve"> </w:t>
+      </w:r>
+      <w:r>
+        <w:rPr>
+          <w:b/>
+          <w:bCs/>
+          <w:lang w:val="nl"/>
+        </w:rPr>
+        <w:t xml:space="preserve">afspraak</w:t>
+      </w:r>
+      <w:r>
+        <w:rPr>
+          <w:lang w:val="nl"/>
+        </w:rPr>
+        <w:t xml:space="preserve"> </w:t>
+      </w:r>
+      <w:r>
+        <w:rPr>
+          <w:lang w:val="nl"/>
+        </w:rPr>
+        <w:t xml:space="preserve">(na definitief</w:t>
+      </w:r>
+      <w:r>
+        <w:rPr>
+          <w:lang w:val="nl"/>
+        </w:rPr>
+        <w:t xml:space="preserve"> </w:t>
+      </w:r>
+      <w:r>
+        <w:rPr>
+          <w:lang w:val="nl"/>
+        </w:rPr>
+        <w:t xml:space="preserve">maken: bijwerken naar dit scenario als het afwijkt, of vaststellen voor wie later is aangenomen) en</w:t>
+      </w:r>
+      <w:r>
+        <w:rPr>
+          <w:lang w:val="nl"/>
+        </w:rPr>
+        <w:t xml:space="preserve"> </w:t>
+      </w:r>
+      <w:r>
+        <w:rPr>
+          <w:lang w:val="nl"/>
+        </w:rPr>
+        <w:t xml:space="preserve">of de persoon</w:t>
+      </w:r>
+      <w:r>
+        <w:rPr>
+          <w:lang w:val="nl"/>
+        </w:rPr>
+        <w:t xml:space="preserve"> </w:t>
+      </w:r>
+      <w:r>
+        <w:rPr>
+          <w:b/>
+          <w:bCs/>
+          <w:lang w:val="nl"/>
+        </w:rPr>
+        <w:t xml:space="preserve">vaststaat na het TW-gesprek</w:t>
+      </w:r>
+      <w:r>
+        <w:rPr>
+          <w:lang w:val="nl"/>
+        </w:rPr>
+        <w:t xml:space="preserve">. Vaststaan betekent: in alle scenario's gelijk en op</w:t>
+      </w:r>
+      <w:r>
+        <w:rPr>
+          <w:lang w:val="nl"/>
+        </w:rPr>
+        <w:t xml:space="preserve"> </w:t>
+      </w:r>
+      <w:r>
+        <w:rPr>
+          <w:lang w:val="nl"/>
+        </w:rPr>
+        <w:t xml:space="preserve">slot.</w:t>
+      </w:r>
+      <w:r>
+        <w:rPr>
+          <w:lang w:val="nl"/>
+        </w:rPr>
+        <w:t xml:space="preserve"> </w:t>
+      </w:r>
+      <w:r>
+        <w:rPr>
+          <w:b/>
+          <w:bCs/>
+          <w:lang w:val="nl"/>
+        </w:rPr>
+        <w:t xml:space="preserve">Ontgrendelen</w:t>
+      </w:r>
+      <w:r>
+        <w:rPr>
+          <w:lang w:val="nl"/>
+        </w:rPr>
+        <w:t xml:space="preserve"> </w:t>
+      </w:r>
+      <w:r>
+        <w:rPr>
+          <w:lang w:val="nl"/>
+        </w:rPr>
+        <w:t xml:space="preserve">vraagt een reden (die komt in het logboek); zet het daarna weer vast met</w:t>
+      </w:r>
+      <w:r>
+        <w:rPr>
+          <w:lang w:val="nl"/>
+        </w:rPr>
+        <w:t xml:space="preserve"> </w:t>
+      </w:r>
+      <w:r>
+        <w:rPr>
+          <w:b/>
+          <w:bCs/>
+          <w:lang w:val="nl"/>
+        </w:rPr>
+        <w:t xml:space="preserve">Vastzetten vanuit dit scenario</w:t>
+      </w:r>
+      <w:r>
+        <w:rPr>
+          <w:lang w:val="nl"/>
+        </w:rPr>
+        <w:t xml:space="preserve">.</w:t>
+      </w:r>
+      <w:r>
+        <w:rPr>
+          <w:lang w:val="nl"/>
+        </w:rPr>
+        <w:t xml:space="preserve"> </w:t>
+      </w:r>
+      <w:r>
+        <w:rPr>
           <w:lang w:val="nl"/>
         </w:rPr>
         <w:t xml:space="preserve">Het dagloon rekent met de leeftijd op de maandag van elke week: wie halverwege het seizoen jarig</w:t>
@@ -27775,75 +28577,13 @@
         <w:rPr>
           <w:lang w:val="nl"/>
         </w:rPr>
-        <w:t xml:space="preserve">:</w:t>
-      </w:r>
-      <w:r>
-        <w:rPr>
-          <w:lang w:val="nl"/>
-        </w:rPr>
-        <w:t xml:space="preserve"> </w:t>
-      </w:r>
-      <w:r>
-        <w:rPr>
-          <w:b/>
-          <w:bCs/>
-          <w:lang w:val="nl"/>
-        </w:rPr>
-        <w:t xml:space="preserve">Excel (vastgesteld)</w:t>
-      </w:r>
-      <w:r>
-        <w:rPr>
-          <w:lang w:val="nl"/>
-        </w:rPr>
-        <w:t xml:space="preserve"> </w:t>
-      </w:r>
-      <w:r>
-        <w:rPr>
-          <w:lang w:val="nl"/>
-        </w:rPr>
-        <w:t xml:space="preserve">(pas na definitief maken) en</w:t>
-      </w:r>
-      <w:r>
-        <w:rPr>
-          <w:lang w:val="nl"/>
-        </w:rPr>
-        <w:t xml:space="preserve"> </w:t>
-      </w:r>
-      <w:r>
-        <w:rPr>
-          <w:b/>
-          <w:bCs/>
-          <w:lang w:val="nl"/>
-        </w:rPr>
-        <w:t xml:space="preserve">Excel</w:t>
-      </w:r>
-      <w:r>
-        <w:rPr>
-          <w:b/>
-          <w:bCs/>
-          <w:lang w:val="nl"/>
-        </w:rPr>
-        <w:t xml:space="preserve"> </w:t>
-      </w:r>
-      <w:r>
-        <w:rPr>
-          <w:b/>
-          <w:bCs/>
-          <w:lang w:val="nl"/>
-        </w:rPr>
-        <w:t xml:space="preserve">(dit scenario)</w:t>
-      </w:r>
-      <w:r>
-        <w:rPr>
-          <w:lang w:val="nl"/>
-        </w:rPr>
-        <w:t xml:space="preserve"> </w:t>
-      </w:r>
-      <w:r>
-        <w:rPr>
-          <w:lang w:val="nl"/>
-        </w:rPr>
-        <w:t xml:space="preserve">(met CONCEPT bovenaan elk tabblad). Vier tabbladen: Per persoon (geboortedatum,</w:t>
+        <w:t xml:space="preserve"> </w:t>
+      </w:r>
+      <w:r>
+        <w:rPr>
+          <w:lang w:val="nl"/>
+        </w:rPr>
+        <w:t xml:space="preserve">(onder Exporteren): vastgesteld (pas na definitief maken) of dit scenario (met CONCEPT bovenaan elk tabblad). Vier tabbladen: Per persoon (geboortedatum,</w:t>
       </w:r>
       <w:r>
         <w:rPr>
@@ -27912,9 +28652,9 @@
         </w:pict>
       </w:r>
     </w:p>
-    <w:bookmarkEnd w:id="93"/>
-    <w:bookmarkEnd w:id="94"/>
-    <w:bookmarkStart w:id="99" w:name="loondossiers"/>
+    <w:bookmarkEnd w:id="96"/>
+    <w:bookmarkEnd w:id="97"/>
+    <w:bookmarkStart w:id="102" w:name="loondossiers"/>
     <w:p>
       <w:pPr>
         <w:pStyle w:val="Heading1"/>
@@ -28047,7 +28787,7 @@
         <w:t xml:space="preserve">en het zegel werken.</w:t>
       </w:r>
     </w:p>
-    <w:bookmarkStart w:id="95" w:name="wat-je-als-admin-regelt"/>
+    <w:bookmarkStart w:id="98" w:name="wat-je-als-admin-regelt"/>
     <w:p>
       <w:pPr>
         <w:pStyle w:val="Heading2"/>
@@ -28345,8 +29085,8 @@
         <w:t xml:space="preserve">bereikbaar." en zijn uploads en loonheffingsformulieren geblokkeerd.</w:t>
       </w:r>
     </w:p>
-    <w:bookmarkEnd w:id="95"/>
-    <w:bookmarkStart w:id="96" w:name="wat-er-op-het-scherm-staat"/>
+    <w:bookmarkEnd w:id="98"/>
+    <w:bookmarkStart w:id="99" w:name="wat-er-op-het-scherm-staat"/>
     <w:p>
       <w:pPr>
         <w:pStyle w:val="Heading2"/>
@@ -28804,8 +29544,8 @@
         <w:t xml:space="preserve">(zie hieronder).</w:t>
       </w:r>
     </w:p>
-    <w:bookmarkEnd w:id="96"/>
-    <w:bookmarkStart w:id="97" w:name="te-beoordelen-voor-vernietiging"/>
+    <w:bookmarkEnd w:id="99"/>
+    <w:bookmarkStart w:id="100" w:name="te-beoordelen-voor-vernietiging"/>
     <w:p>
       <w:pPr>
         <w:pStyle w:val="Heading2"/>
@@ -29085,8 +29825,8 @@
         <w:t xml:space="preserve">aanstaat).</w:t>
       </w:r>
     </w:p>
-    <w:bookmarkEnd w:id="97"/>
-    <w:bookmarkStart w:id="98" w:name="wat-automatisch-gebeurt"/>
+    <w:bookmarkEnd w:id="100"/>
+    <w:bookmarkStart w:id="101" w:name="wat-automatisch-gebeurt"/>
     <w:p>
       <w:pPr>
         <w:pStyle w:val="Heading2"/>
@@ -29330,9 +30070,9 @@
         </w:pict>
       </w:r>
     </w:p>
-    <w:bookmarkEnd w:id="98"/>
-    <w:bookmarkEnd w:id="99"/>
-    <w:bookmarkStart w:id="104" w:name="berichten-sturen"/>
+    <w:bookmarkEnd w:id="101"/>
+    <w:bookmarkEnd w:id="102"/>
+    <w:bookmarkStart w:id="107" w:name="berichten-sturen"/>
     <w:p>
       <w:pPr>
         <w:pStyle w:val="Heading1"/>
@@ -29525,7 +30265,7 @@
         <w:t xml:space="preserve">uitgaan.</w:t>
       </w:r>
     </w:p>
-    <w:bookmarkStart w:id="100" w:name="een-bericht-versturen"/>
+    <w:bookmarkStart w:id="103" w:name="een-bericht-versturen"/>
     <w:p>
       <w:pPr>
         <w:pStyle w:val="Heading2"/>
@@ -30416,8 +31156,8 @@
         <w:t xml:space="preserve">ga je naar Verzonden.</w:t>
       </w:r>
     </w:p>
-    <w:bookmarkEnd w:id="100"/>
-    <w:bookmarkStart w:id="101" w:name="Xbe2977045984a840c8c9212a7c330a827f32244"/>
+    <w:bookmarkEnd w:id="103"/>
+    <w:bookmarkStart w:id="104" w:name="Xbe2977045984a840c8c9212a7c330a827f32244"/>
     <w:p>
       <w:pPr>
         <w:pStyle w:val="Heading2"/>
@@ -30578,8 +31318,8 @@
         <w:t xml:space="preserve">groepen is {{seizoen_naam}} het huidige seizoen.</w:t>
       </w:r>
     </w:p>
-    <w:bookmarkEnd w:id="101"/>
-    <w:bookmarkStart w:id="102" w:name="het-tabblad-verzonden"/>
+    <w:bookmarkEnd w:id="104"/>
+    <w:bookmarkStart w:id="105" w:name="het-tabblad-verzonden"/>
     <w:p>
       <w:pPr>
         <w:pStyle w:val="Heading2"/>
@@ -30857,8 +31597,8 @@
         <w:t xml:space="preserve">brengt je terug naar de lijst.</w:t>
       </w:r>
     </w:p>
-    <w:bookmarkEnd w:id="102"/>
-    <w:bookmarkStart w:id="103" w:name="het-tabblad-gepland"/>
+    <w:bookmarkEnd w:id="105"/>
+    <w:bookmarkStart w:id="106" w:name="het-tabblad-gepland"/>
     <w:p>
       <w:pPr>
         <w:pStyle w:val="Heading2"/>
@@ -30909,9 +31649,9 @@
         </w:pict>
       </w:r>
     </w:p>
-    <w:bookmarkEnd w:id="103"/>
-    <w:bookmarkEnd w:id="104"/>
-    <w:bookmarkStart w:id="107" w:name="sjablonen"/>
+    <w:bookmarkEnd w:id="106"/>
+    <w:bookmarkEnd w:id="107"/>
+    <w:bookmarkStart w:id="110" w:name="sjablonen"/>
     <w:p>
       <w:pPr>
         <w:pStyle w:val="Heading1"/>
@@ -31084,7 +31824,7 @@
         <w:t xml:space="preserve">kan altijd.</w:t>
       </w:r>
     </w:p>
-    <w:bookmarkStart w:id="105" w:name="het-sjablonenscherm"/>
+    <w:bookmarkStart w:id="108" w:name="het-sjablonenscherm"/>
     <w:p>
       <w:pPr>
         <w:pStyle w:val="Heading2"/>
@@ -31385,8 +32125,8 @@
         <w:t xml:space="preserve">Klik op een chip om hem in de e-mailtekst te zetten.</w:t>
       </w:r>
     </w:p>
-    <w:bookmarkEnd w:id="105"/>
-    <w:bookmarkStart w:id="106" w:name="een-sjabloon-aanpassen"/>
+    <w:bookmarkEnd w:id="108"/>
+    <w:bookmarkStart w:id="109" w:name="een-sjabloon-aanpassen"/>
     <w:p>
       <w:pPr>
         <w:pStyle w:val="Heading2"/>
@@ -32056,9 +32796,9 @@
         </w:pict>
       </w:r>
     </w:p>
-    <w:bookmarkEnd w:id="106"/>
-    <w:bookmarkEnd w:id="107"/>
-    <w:bookmarkStart w:id="111" w:name="geplande-berichten-en-herinneringen"/>
+    <w:bookmarkEnd w:id="109"/>
+    <w:bookmarkEnd w:id="110"/>
+    <w:bookmarkStart w:id="114" w:name="geplande-berichten-en-herinneringen"/>
     <w:p>
       <w:pPr>
         <w:pStyle w:val="Heading1"/>
@@ -32217,7 +32957,7 @@
         <w:t xml:space="preserve">elk kwartier.</w:t>
       </w:r>
     </w:p>
-    <w:bookmarkStart w:id="108" w:name="de-ingebouwde-herinneringen"/>
+    <w:bookmarkStart w:id="111" w:name="de-ingebouwde-herinneringen"/>
     <w:p>
       <w:pPr>
         <w:pStyle w:val="Heading2"/>
@@ -32771,8 +33511,8 @@
         <w:t xml:space="preserve">Instellingen › Kanalen &amp; meldingen.</w:t>
       </w:r>
     </w:p>
-    <w:bookmarkEnd w:id="108"/>
-    <w:bookmarkStart w:id="109" w:name="herinneringen-proefdraaien"/>
+    <w:bookmarkEnd w:id="111"/>
+    <w:bookmarkStart w:id="112" w:name="herinneringen-proefdraaien"/>
     <w:p>
       <w:pPr>
         <w:pStyle w:val="Heading2"/>
@@ -32988,8 +33728,8 @@
         <w:t xml:space="preserve">Op die kaart staat ook wanneer de automatische taken voor het laatst draaiden.</w:t>
       </w:r>
     </w:p>
-    <w:bookmarkEnd w:id="109"/>
-    <w:bookmarkStart w:id="110" w:name="een-eigen-regel-maken"/>
+    <w:bookmarkEnd w:id="112"/>
+    <w:bookmarkStart w:id="113" w:name="een-eigen-regel-maken"/>
     <w:p>
       <w:pPr>
         <w:pStyle w:val="Heading2"/>
@@ -33730,9 +34470,9 @@
         </w:pict>
       </w:r>
     </w:p>
-    <w:bookmarkEnd w:id="110"/>
-    <w:bookmarkEnd w:id="111"/>
-    <w:bookmarkStart w:id="115" w:name="seintje-bij-de-volgende-werving"/>
+    <w:bookmarkEnd w:id="113"/>
+    <w:bookmarkEnd w:id="114"/>
+    <w:bookmarkStart w:id="118" w:name="seintje-bij-de-volgende-werving"/>
     <w:p>
       <w:pPr>
         <w:pStyle w:val="Heading1"/>
@@ -33879,7 +34619,7 @@
         <w:t xml:space="preserve">bij Berichten in de groep Seintje gevraagd. De toestemming geldt maximaal twaalf maanden.</w:t>
       </w:r>
     </w:p>
-    <w:bookmarkStart w:id="112" w:name="wat-de-afgewezen-sollicitant-ziet"/>
+    <w:bookmarkStart w:id="115" w:name="wat-de-afgewezen-sollicitant-ziet"/>
     <w:p>
       <w:pPr>
         <w:pStyle w:val="Heading2"/>
@@ -34267,8 +35007,8 @@
         <w:t xml:space="preserve">.</w:t>
       </w:r>
     </w:p>
-    <w:bookmarkEnd w:id="112"/>
-    <w:bookmarkStart w:id="113" w:name="wat-je-als-bestuur-doet"/>
+    <w:bookmarkEnd w:id="115"/>
+    <w:bookmarkStart w:id="116" w:name="wat-je-als-bestuur-doet"/>
     <w:p>
       <w:pPr>
         <w:pStyle w:val="Heading2"/>
@@ -34477,8 +35217,8 @@
         <w:t xml:space="preserve">Benader afgewezen mensen buiten deze groep niet, ook niet als je hun adres nog ergens hebt.</w:t>
       </w:r>
     </w:p>
-    <w:bookmarkEnd w:id="113"/>
-    <w:bookmarkStart w:id="114" w:name="hoe-lang-het-geldt-en-hoe-het-vervalt"/>
+    <w:bookmarkEnd w:id="116"/>
+    <w:bookmarkStart w:id="117" w:name="hoe-lang-het-geldt-en-hoe-het-vervalt"/>
     <w:p>
       <w:pPr>
         <w:pStyle w:val="Heading2"/>
@@ -34749,9 +35489,9 @@
         </w:pict>
       </w:r>
     </w:p>
-    <w:bookmarkEnd w:id="114"/>
-    <w:bookmarkEnd w:id="115"/>
-    <w:bookmarkStart w:id="120" w:name="instellingen"/>
+    <w:bookmarkEnd w:id="117"/>
+    <w:bookmarkEnd w:id="118"/>
+    <w:bookmarkStart w:id="123" w:name="instellingen"/>
     <w:p>
       <w:pPr>
         <w:pStyle w:val="Heading1"/>
@@ -34964,7 +35704,7 @@
         <w:t xml:space="preserve">Systeem mag bewerken). Zoeken door het hele beheer kan met Ctrl K.</w:t>
       </w:r>
     </w:p>
-    <w:bookmarkStart w:id="116" w:name="wachtwoorden-en-sleutels"/>
+    <w:bookmarkStart w:id="119" w:name="wachtwoorden-en-sleutels"/>
     <w:p>
       <w:pPr>
         <w:pStyle w:val="Heading2"/>
@@ -35111,8 +35851,8 @@
         <w:t xml:space="preserve">alleen welk veld is gewijzigd, nooit de waarde.</w:t>
       </w:r>
     </w:p>
-    <w:bookmarkEnd w:id="116"/>
-    <w:bookmarkStart w:id="117" w:name="de-tabbladen-1"/>
+    <w:bookmarkEnd w:id="119"/>
+    <w:bookmarkStart w:id="120" w:name="de-tabbladen-1"/>
     <w:p>
       <w:pPr>
         <w:pStyle w:val="Heading2"/>
@@ -36838,8 +37578,8 @@
         <w:t xml:space="preserve">.</w:t>
       </w:r>
     </w:p>
-    <w:bookmarkEnd w:id="117"/>
-    <w:bookmarkStart w:id="118" w:name="handleidingen"/>
+    <w:bookmarkEnd w:id="120"/>
+    <w:bookmarkStart w:id="121" w:name="handleidingen"/>
     <w:p>
       <w:pPr>
         <w:pStyle w:val="Heading2"/>
@@ -37021,8 +37761,8 @@
         <w:t xml:space="preserve">via de zoeker (Ctrl K): typ "handleiding".</w:t>
       </w:r>
     </w:p>
-    <w:bookmarkEnd w:id="118"/>
-    <w:bookmarkStart w:id="119" w:name="wat-je-bij-de-start-instelt"/>
+    <w:bookmarkEnd w:id="121"/>
+    <w:bookmarkStart w:id="122" w:name="wat-je-bij-de-start-instelt"/>
     <w:p>
       <w:pPr>
         <w:pStyle w:val="Heading2"/>
@@ -37386,9 +38126,9 @@
         </w:pict>
       </w:r>
     </w:p>
-    <w:bookmarkEnd w:id="119"/>
-    <w:bookmarkEnd w:id="120"/>
-    <w:bookmarkStart w:id="126" w:name="beheerders-en-rechten"/>
+    <w:bookmarkEnd w:id="122"/>
+    <w:bookmarkEnd w:id="123"/>
+    <w:bookmarkStart w:id="129" w:name="beheerders-en-rechten"/>
     <w:p>
       <w:pPr>
         <w:pStyle w:val="Heading1"/>
@@ -37549,7 +38289,7 @@
         <w:t xml:space="preserve">onderdeel in wat een rol mag. Admin heeft altijd alles.</w:t>
       </w:r>
     </w:p>
-    <w:bookmarkStart w:id="121" w:name="iemand-toegang-geven"/>
+    <w:bookmarkStart w:id="124" w:name="iemand-toegang-geven"/>
     <w:p>
       <w:pPr>
         <w:pStyle w:val="Heading2"/>
@@ -37926,8 +38666,8 @@
         <w:t xml:space="preserve">Penningmeester.</w:t>
       </w:r>
     </w:p>
-    <w:bookmarkEnd w:id="121"/>
-    <w:bookmarkStart w:id="122" w:name="iemand-de-toegang-afnemen"/>
+    <w:bookmarkEnd w:id="124"/>
+    <w:bookmarkStart w:id="125" w:name="iemand-de-toegang-afnemen"/>
     <w:p>
       <w:pPr>
         <w:pStyle w:val="Heading2"/>
@@ -37994,8 +38734,8 @@
         <w:t xml:space="preserve">.</w:t>
       </w:r>
     </w:p>
-    <w:bookmarkEnd w:id="122"/>
-    <w:bookmarkStart w:id="123" w:name="het-tabblad-beheerders"/>
+    <w:bookmarkEnd w:id="125"/>
+    <w:bookmarkStart w:id="126" w:name="het-tabblad-beheerders"/>
     <w:p>
       <w:pPr>
         <w:pStyle w:val="Heading2"/>
@@ -38659,8 +39399,8 @@
         <w:t xml:space="preserve">nooit.</w:t>
       </w:r>
     </w:p>
-    <w:bookmarkEnd w:id="123"/>
-    <w:bookmarkStart w:id="124" w:name="een-noodingang-maken"/>
+    <w:bookmarkEnd w:id="126"/>
+    <w:bookmarkStart w:id="127" w:name="een-noodingang-maken"/>
     <w:p>
       <w:pPr>
         <w:pStyle w:val="Heading2"/>
@@ -38896,8 +39636,8 @@
         <w:t xml:space="preserve">(klik linksonder op je naam).</w:t>
       </w:r>
     </w:p>
-    <w:bookmarkEnd w:id="124"/>
-    <w:bookmarkStart w:id="125" w:name="het-tabblad-rollen--rechten"/>
+    <w:bookmarkEnd w:id="127"/>
+    <w:bookmarkStart w:id="128" w:name="het-tabblad-rollen--rechten"/>
     <w:p>
       <w:pPr>
         <w:pStyle w:val="Heading2"/>
@@ -40654,9 +41394,9 @@
         </w:pict>
       </w:r>
     </w:p>
-    <w:bookmarkEnd w:id="125"/>
-    <w:bookmarkEnd w:id="126"/>
-    <w:bookmarkStart w:id="130" w:name="logboek"/>
+    <w:bookmarkEnd w:id="128"/>
+    <w:bookmarkEnd w:id="129"/>
+    <w:bookmarkStart w:id="133" w:name="logboek"/>
     <w:p>
       <w:pPr>
         <w:pStyle w:val="Heading1"/>
@@ -40789,7 +41529,7 @@
         <w:t xml:space="preserve">zit hier nu in, als tabblad Fouten.</w:t>
       </w:r>
     </w:p>
-    <w:bookmarkStart w:id="127" w:name="het-logboekscherm"/>
+    <w:bookmarkStart w:id="130" w:name="het-logboekscherm"/>
     <w:p>
       <w:pPr>
         <w:pStyle w:val="Heading2"/>
@@ -41373,8 +42113,8 @@
         <w:t xml:space="preserve">.</w:t>
       </w:r>
     </w:p>
-    <w:bookmarkEnd w:id="127"/>
-    <w:bookmarkStart w:id="128" w:name="een-melding-herleiden"/>
+    <w:bookmarkEnd w:id="130"/>
+    <w:bookmarkStart w:id="131" w:name="een-melding-herleiden"/>
     <w:p>
       <w:pPr>
         <w:pStyle w:val="Heading2"/>
@@ -41601,8 +42341,8 @@
         <w:t xml:space="preserve">.</w:t>
       </w:r>
     </w:p>
-    <w:bookmarkEnd w:id="128"/>
-    <w:bookmarkStart w:id="129" w:name="hoe-lang-regels-blijven"/>
+    <w:bookmarkEnd w:id="131"/>
+    <w:bookmarkStart w:id="132" w:name="hoe-lang-regels-blijven"/>
     <w:p>
       <w:pPr>
         <w:pStyle w:val="Heading2"/>
@@ -41689,9 +42429,9 @@
         </w:pict>
       </w:r>
     </w:p>
-    <w:bookmarkEnd w:id="129"/>
-    <w:bookmarkEnd w:id="130"/>
-    <w:bookmarkStart w:id="138" w:name="privacy-en-avg-verzoeken"/>
+    <w:bookmarkEnd w:id="132"/>
+    <w:bookmarkEnd w:id="133"/>
+    <w:bookmarkStart w:id="141" w:name="privacy-en-avg-verzoeken"/>
     <w:p>
       <w:pPr>
         <w:pStyle w:val="Heading1"/>
@@ -41968,7 +42708,7 @@
         <w:t xml:space="preserve">er iets in wat we verwerken, dan hoort het register mee te veranderen.</w:t>
       </w:r>
     </w:p>
-    <w:bookmarkStart w:id="131" w:name="wat-de-sollicitant-zelf-kan"/>
+    <w:bookmarkStart w:id="134" w:name="wat-de-sollicitant-zelf-kan"/>
     <w:p>
       <w:pPr>
         <w:pStyle w:val="Heading2"/>
@@ -42558,8 +43298,8 @@
         <w:t xml:space="preserve">).</w:t>
       </w:r>
     </w:p>
-    <w:bookmarkEnd w:id="131"/>
-    <w:bookmarkStart w:id="132" w:name="de-privacyverklaring"/>
+    <w:bookmarkEnd w:id="134"/>
+    <w:bookmarkStart w:id="135" w:name="de-privacyverklaring"/>
     <w:p>
       <w:pPr>
         <w:pStyle w:val="Heading2"/>
@@ -42697,8 +43437,8 @@
         <w:t xml:space="preserve">overeenkomst te kunnen sluiten.</w:t>
       </w:r>
     </w:p>
-    <w:bookmarkEnd w:id="132"/>
-    <w:bookmarkStart w:id="133" w:name="een-verzoek-om-inzage"/>
+    <w:bookmarkEnd w:id="135"/>
+    <w:bookmarkStart w:id="136" w:name="een-verzoek-om-inzage"/>
     <w:p>
       <w:pPr>
         <w:pStyle w:val="Heading2"/>
@@ -43015,8 +43755,8 @@
         <w:t xml:space="preserve">Antwoord binnen een maand.</w:t>
       </w:r>
     </w:p>
-    <w:bookmarkEnd w:id="133"/>
-    <w:bookmarkStart w:id="134" w:name="een-verzoek-om-correctie"/>
+    <w:bookmarkEnd w:id="136"/>
+    <w:bookmarkStart w:id="137" w:name="een-verzoek-om-correctie"/>
     <w:p>
       <w:pPr>
         <w:pStyle w:val="Heading2"/>
@@ -43128,8 +43868,8 @@
         <w:t xml:space="preserve">logboek als "Gegevens gecorrigeerd". Antwoord binnen een maand.</w:t>
       </w:r>
     </w:p>
-    <w:bookmarkEnd w:id="134"/>
-    <w:bookmarkStart w:id="135" w:name="een-dossier-verwijderen"/>
+    <w:bookmarkEnd w:id="137"/>
+    <w:bookmarkStart w:id="138" w:name="een-dossier-verwijderen"/>
     <w:p>
       <w:pPr>
         <w:pStyle w:val="Heading2"/>
@@ -43687,8 +44427,8 @@
         <w:t xml:space="preserve">verdwijnt.</w:t>
       </w:r>
     </w:p>
-    <w:bookmarkEnd w:id="135"/>
-    <w:bookmarkStart w:id="136" w:name="bezwaar-tegen-de-ai-analyse"/>
+    <w:bookmarkEnd w:id="138"/>
+    <w:bookmarkStart w:id="139" w:name="bezwaar-tegen-de-ai-analyse"/>
     <w:p>
       <w:pPr>
         <w:pStyle w:val="Heading2"/>
@@ -43992,8 +44732,8 @@
         <w:t xml:space="preserve">bestuur beoordeelt het formulier dan gewoon zonder AI-advies.</w:t>
       </w:r>
     </w:p>
-    <w:bookmarkEnd w:id="136"/>
-    <w:bookmarkStart w:id="137" w:name="wat-je-nooit-per-mail-doorstuurt"/>
+    <w:bookmarkEnd w:id="139"/>
+    <w:bookmarkStart w:id="140" w:name="wat-je-nooit-per-mail-doorstuurt"/>
     <w:p>
       <w:pPr>
         <w:pStyle w:val="Heading2"/>
@@ -44059,9 +44799,9 @@
         </w:pict>
       </w:r>
     </w:p>
-    <w:bookmarkEnd w:id="137"/>
-    <w:bookmarkEnd w:id="138"/>
-    <w:bookmarkStart w:id="142" w:name="bewaartermijnen"/>
+    <w:bookmarkEnd w:id="140"/>
+    <w:bookmarkEnd w:id="141"/>
+    <w:bookmarkStart w:id="145" w:name="bewaartermijnen"/>
     <w:p>
       <w:pPr>
         <w:pStyle w:val="Heading1"/>
@@ -44226,7 +44966,7 @@
         <w:t xml:space="preserve">hand. Wat er is opgeruimd zie je in het opschoon-logboek en in het Logboek onder AVG-opschoning.</w:t>
       </w:r>
     </w:p>
-    <w:bookmarkStart w:id="139" w:name="opschonen-aanzetten"/>
+    <w:bookmarkStart w:id="142" w:name="opschonen-aanzetten"/>
     <w:p>
       <w:pPr>
         <w:pStyle w:val="Heading2"/>
@@ -44539,8 +45279,8 @@
         <w:t xml:space="preserve">uitzondering: daar heeft 0 een eigen betekenis (zie de tabel).</w:t>
       </w:r>
     </w:p>
-    <w:bookmarkEnd w:id="139"/>
-    <w:bookmarkStart w:id="140" w:name="de-termijnen"/>
+    <w:bookmarkEnd w:id="142"/>
+    <w:bookmarkStart w:id="143" w:name="de-termijnen"/>
     <w:p>
       <w:pPr>
         <w:pStyle w:val="Heading2"/>
@@ -45794,8 +46534,8 @@
         <w:t xml:space="preserve">termijn aan, lees de verklaring dan even na.</w:t>
       </w:r>
     </w:p>
-    <w:bookmarkEnd w:id="140"/>
-    <w:bookmarkStart w:id="141" w:name="waar-je-het-terugziet"/>
+    <w:bookmarkEnd w:id="143"/>
+    <w:bookmarkStart w:id="144" w:name="waar-je-het-terugziet"/>
     <w:p>
       <w:pPr>
         <w:pStyle w:val="Heading2"/>
@@ -45961,9 +46701,9 @@
         </w:pict>
       </w:r>
     </w:p>
-    <w:bookmarkEnd w:id="141"/>
-    <w:bookmarkEnd w:id="142"/>
-    <w:bookmarkStart w:id="147" w:name="systeem-en-foutenlog"/>
+    <w:bookmarkEnd w:id="144"/>
+    <w:bookmarkEnd w:id="145"/>
+    <w:bookmarkStart w:id="150" w:name="systeem-en-foutenlog"/>
     <w:p>
       <w:pPr>
         <w:pStyle w:val="Heading1"/>
@@ -46118,7 +46858,7 @@
         <w:t xml:space="preserve">Een los foutenlog met een knop om het te legen bestaat niet meer.</w:t>
       </w:r>
     </w:p>
-    <w:bookmarkStart w:id="143" w:name="systeem--updates"/>
+    <w:bookmarkStart w:id="146" w:name="systeem--updates"/>
     <w:p>
       <w:pPr>
         <w:pStyle w:val="Heading2"/>
@@ -46830,8 +47570,8 @@
         <w:t xml:space="preserve">: per versie wat er veranderde, met de huidige versie open.</w:t>
       </w:r>
     </w:p>
-    <w:bookmarkEnd w:id="143"/>
-    <w:bookmarkStart w:id="144" w:name="kluissleutel-wisselen"/>
+    <w:bookmarkEnd w:id="146"/>
+    <w:bookmarkStart w:id="147" w:name="kluissleutel-wisselen"/>
     <w:p>
       <w:pPr>
         <w:pStyle w:val="Heading2"/>
@@ -47574,8 +48314,8 @@
         <w:t xml:space="preserve">bij Beheerders).</w:t>
       </w:r>
     </w:p>
-    <w:bookmarkEnd w:id="144"/>
-    <w:bookmarkStart w:id="145" w:name="fouten-opzoeken"/>
+    <w:bookmarkEnd w:id="147"/>
+    <w:bookmarkStart w:id="148" w:name="fouten-opzoeken"/>
     <w:p>
       <w:pPr>
         <w:pStyle w:val="Heading2"/>
@@ -47728,8 +48468,8 @@
         <w:t xml:space="preserve">Logboek › Fouten.</w:t>
       </w:r>
     </w:p>
-    <w:bookmarkEnd w:id="145"/>
-    <w:bookmarkStart w:id="146" w:name="testomgeving"/>
+    <w:bookmarkEnd w:id="148"/>
+    <w:bookmarkStart w:id="149" w:name="testomgeving"/>
     <w:p>
       <w:pPr>
         <w:pStyle w:val="Heading2"/>
@@ -47803,9 +48543,9 @@
         </w:pict>
       </w:r>
     </w:p>
-    <w:bookmarkEnd w:id="146"/>
-    <w:bookmarkEnd w:id="147"/>
-    <w:bookmarkStart w:id="148" w:name="veelgestelde-vragen"/>
+    <w:bookmarkEnd w:id="149"/>
+    <w:bookmarkEnd w:id="150"/>
+    <w:bookmarkStart w:id="151" w:name="veelgestelde-vragen"/>
     <w:p>
       <w:pPr>
         <w:pStyle w:val="Heading1"/>
@@ -49105,8 +49845,8 @@
         </w:pict>
       </w:r>
     </w:p>
-    <w:bookmarkEnd w:id="148"/>
-    <w:bookmarkStart w:id="149" w:name="woordenlijst"/>
+    <w:bookmarkEnd w:id="151"/>
+    <w:bookmarkStart w:id="152" w:name="woordenlijst"/>
     <w:p>
       <w:pPr>
         <w:pStyle w:val="Heading1"/>
@@ -49668,7 +50408,7 @@
         <w:t xml:space="preserve">— het digitale zegel op ondertekende PDF's. Daarmee is te controleren dat het document na het tekenen niet is veranderd.</w:t>
       </w:r>
     </w:p>
-    <w:bookmarkEnd w:id="149"/>
+    <w:bookmarkEnd w:id="152"/>
     <w:sectPr>
       <w:footnotePr>
         <w:numRestart w:val="eachSect"/>

</xml_diff>

<commit_message>
2.126.0: kleine beheerpunten, privacyverklaring, docs en versie
- SSO-foutpagina zonder emoji/inline styles; export beschikbaarheid in woorden; dode paneel-overlay en -CSS weg
- Namen gelijk: Kennismakingsformulier (geen BLK), Seizoen, Beheerders & rechten; zoeker Aanmelding openen of sluiten
- Privacyverklaring: termijn gezondheidsverklaring volgt de instelling; lidmaatschap door ouder; PRIVACY_VERSIE 2026-09d
- actief_seizoen(): zonder open aanmelding het nieuwste seizoen met sollicitaties
- Verwerkingsregister bijgewerkt; handleidingen (aanmelding openen/sluiten, lonen per jaar) + exports
- APP_VERSIE 2.126.0 (nieuwe kolom/tabel lonen en nieuwe sjablonen)
</commit_message>
<xml_diff>
--- a/docs/handleiding/word/handleiding_beheer.docx
+++ b/docs/handleiding/word/handleiding_beheer.docx
@@ -4560,7 +4560,7 @@
                 <w:bCs/>
                 <w:lang w:val="nl"/>
               </w:rPr>
-              <w:t xml:space="preserve">Seizoen openen</w:t>
+              <w:t xml:space="preserve">Aanmelding openen</w:t>
             </w:r>
             <w:r>
               <w:rPr>
@@ -4586,7 +4586,7 @@
                 <w:bCs/>
                 <w:lang w:val="nl"/>
               </w:rPr>
-              <w:t xml:space="preserve">Ja, openen</w:t>
+              <w:t xml:space="preserve">Ja, aanmelding openen</w:t>
             </w:r>
             <w:r>
               <w:rPr>
@@ -4953,7 +4953,7 @@
                 <w:bCs/>
                 <w:lang w:val="nl"/>
               </w:rPr>
-              <w:t xml:space="preserve">Seizoen sluiten</w:t>
+              <w:t xml:space="preserve">Aanmelding sluiten</w:t>
             </w:r>
             <w:r>
               <w:rPr>
@@ -4973,7 +4973,7 @@
               <w:rPr>
                 <w:lang w:val="nl"/>
               </w:rPr>
-              <w:t xml:space="preserve">Vandaag springt naar "Formulieren" en telt wie het kennismakingsformulier nog niet inleverde.</w:t>
+              <w:t xml:space="preserve">Het aanmeldformulier gaat uit. Zodra niemand meer op een uitnodiging wacht, springt Vandaag naar "Formulieren" en telt wie het kennismakingsformulier nog niet inleverde; daarna wijst het naar de groepsindeling.</w:t>
             </w:r>
           </w:p>
         </w:tc>
@@ -10844,7 +10844,7 @@
           <w:bCs/>
           <w:lang w:val="nl"/>
         </w:rPr>
-        <w:t xml:space="preserve">Openen.</w:t>
+        <w:t xml:space="preserve">Aanmelding openen.</w:t>
       </w:r>
       <w:r>
         <w:rPr>
@@ -10870,51 +10870,63 @@
           <w:bCs/>
           <w:lang w:val="nl"/>
         </w:rPr>
-        <w:t xml:space="preserve">Seizoen openen</w:t>
-      </w:r>
-      <w:r>
-        <w:rPr>
-          <w:lang w:val="nl"/>
-        </w:rPr>
-        <w:t xml:space="preserve">. Het tussenscherm zegt dat het</w:t>
-      </w:r>
-      <w:r>
-        <w:rPr>
-          <w:lang w:val="nl"/>
-        </w:rPr>
-        <w:t xml:space="preserve"> </w:t>
-      </w:r>
-      <w:r>
-        <w:rPr>
-          <w:lang w:val="nl"/>
-        </w:rPr>
-        <w:t xml:space="preserve">aanmeldformulier meteen actief wordt en vraagt je de datums te controleren (die staan in de</w:t>
-      </w:r>
-      <w:r>
-        <w:rPr>
-          <w:lang w:val="nl"/>
-        </w:rPr>
-        <w:t xml:space="preserve"> </w:t>
-      </w:r>
-      <w:r>
-        <w:rPr>
-          <w:lang w:val="nl"/>
-        </w:rPr>
-        <w:t xml:space="preserve">bevestigingsmail van elke aanmelder). Klik op</w:t>
-      </w:r>
-      <w:r>
-        <w:rPr>
-          <w:lang w:val="nl"/>
-        </w:rPr>
-        <w:t xml:space="preserve"> </w:t>
-      </w:r>
-      <w:r>
-        <w:rPr>
-          <w:b/>
-          <w:bCs/>
-          <w:lang w:val="nl"/>
-        </w:rPr>
-        <w:t xml:space="preserve">Ja, openen</w:t>
+        <w:t xml:space="preserve">Aanmelding openen</w:t>
+      </w:r>
+      <w:r>
+        <w:rPr>
+          <w:lang w:val="nl"/>
+        </w:rPr>
+        <w:t xml:space="preserve">. Het tussenscherm zegt</w:t>
+      </w:r>
+      <w:r>
+        <w:rPr>
+          <w:lang w:val="nl"/>
+        </w:rPr>
+        <w:t xml:space="preserve"> </w:t>
+      </w:r>
+      <w:r>
+        <w:rPr>
+          <w:lang w:val="nl"/>
+        </w:rPr>
+        <w:t xml:space="preserve">dat het aanmeldformulier meteen actief wordt en vraagt je de datums te controleren (die staan in de</w:t>
+      </w:r>
+      <w:r>
+        <w:rPr>
+          <w:lang w:val="nl"/>
+        </w:rPr>
+        <w:t xml:space="preserve"> </w:t>
+      </w:r>
+      <w:r>
+        <w:rPr>
+          <w:lang w:val="nl"/>
+        </w:rPr>
+        <w:t xml:space="preserve">bevestigingsmail van elke aanmelder). Staat de aanmelding van een ander seizoen nog open, dan gaat</w:t>
+      </w:r>
+      <w:r>
+        <w:rPr>
+          <w:lang w:val="nl"/>
+        </w:rPr>
+        <w:t xml:space="preserve"> </w:t>
+      </w:r>
+      <w:r>
+        <w:rPr>
+          <w:lang w:val="nl"/>
+        </w:rPr>
+        <w:t xml:space="preserve">die vanzelf dicht en stapt het beheer over naar dit seizoen. Klik op</w:t>
+      </w:r>
+      <w:r>
+        <w:rPr>
+          <w:lang w:val="nl"/>
+        </w:rPr>
+        <w:t xml:space="preserve"> </w:t>
+      </w:r>
+      <w:r>
+        <w:rPr>
+          <w:b/>
+          <w:bCs/>
+          <w:lang w:val="nl"/>
+        </w:rPr>
+        <w:t xml:space="preserve">Ja, aanmelding openen</w:t>
       </w:r>
       <w:r>
         <w:rPr>
@@ -10963,6 +10975,87 @@
           <w:bCs/>
           <w:lang w:val="nl"/>
         </w:rPr>
+        <w:t xml:space="preserve">Aanmelding sluiten</w:t>
+      </w:r>
+      <w:r>
+        <w:rPr>
+          <w:lang w:val="nl"/>
+        </w:rPr>
+        <w:t xml:space="preserve"> </w:t>
+      </w:r>
+      <w:r>
+        <w:rPr>
+          <w:lang w:val="nl"/>
+        </w:rPr>
+        <w:t xml:space="preserve">zodra je genoeg kandidaten hebt:</w:t>
+      </w:r>
+      <w:r>
+        <w:rPr>
+          <w:lang w:val="nl"/>
+        </w:rPr>
+        <w:t xml:space="preserve"> </w:t>
+      </w:r>
+      <w:r>
+        <w:rPr>
+          <w:b/>
+          <w:bCs/>
+          <w:lang w:val="nl"/>
+        </w:rPr>
+        <w:t xml:space="preserve">Aanmelding sluiten</w:t>
+      </w:r>
+      <w:r>
+        <w:rPr>
+          <w:lang w:val="nl"/>
+        </w:rPr>
+        <w:t xml:space="preserve">, bevestigen met</w:t>
+      </w:r>
+      <w:r>
+        <w:rPr>
+          <w:lang w:val="nl"/>
+        </w:rPr>
+        <w:t xml:space="preserve"> </w:t>
+      </w:r>
+      <w:r>
+        <w:rPr>
+          <w:b/>
+          <w:bCs/>
+          <w:lang w:val="nl"/>
+        </w:rPr>
+        <w:t xml:space="preserve">Ja, aanmelding sluiten</w:t>
+      </w:r>
+      <w:r>
+        <w:rPr>
+          <w:lang w:val="nl"/>
+        </w:rPr>
+        <w:t xml:space="preserve">. Alleen het aanmeldformulier gaat uit; het seizoen zelf loopt door en</w:t>
+      </w:r>
+      <w:r>
+        <w:rPr>
+          <w:lang w:val="nl"/>
+        </w:rPr>
+        <w:t xml:space="preserve"> </w:t>
+      </w:r>
+      <w:r>
+        <w:rPr>
+          <w:lang w:val="nl"/>
+        </w:rPr>
+        <w:t xml:space="preserve">alle gegevens blijven bewaard. Je kunt later weer openen.</w:t>
+      </w:r>
+    </w:p>
+    <w:p>
+      <w:pPr>
+        <w:pStyle w:val="Compact"/>
+        <w:numPr>
+          <w:ilvl w:val="0"/>
+          <w:numId w:val="1028"/>
+        </w:numPr>
+      </w:pPr>
+      <w:r>
+        <w:rPr>
+          <w:b/>
+          <w:bCs/>
+          <w:lang w:val="nl"/>
+        </w:rPr>
         <w:t xml:space="preserve">Procedure doorlopen</w:t>
       </w:r>
       <w:r>
@@ -10976,27 +11069,6 @@
           <w:lang w:val="nl"/>
         </w:rPr>
         <w:t xml:space="preserve">bij</w:t>
-      </w:r>
-      <w:r>
-        <w:rPr>
-          <w:lang w:val="nl"/>
-        </w:rPr>
-        <w:t xml:space="preserve"> </w:t>
-      </w:r>
-      <w:hyperlink w:anchor="sollicitanten">
-        <w:r>
-          <w:rPr>
-            <w:rStyle w:val="Hyperlink"/>
-            <w:lang w:val="nl"/>
-          </w:rPr>
-          <w:t xml:space="preserve">Sollicitanten</w:t>
-        </w:r>
-      </w:hyperlink>
-      <w:r>
-        <w:rPr>
-          <w:lang w:val="nl"/>
-        </w:rPr>
-        <w:t xml:space="preserve">,</w:t>
       </w:r>
       <w:r>
         <w:rPr>
@@ -11046,92 +11118,55 @@
         </w:rPr>
         <w:t xml:space="preserve">.</w:t>
       </w:r>
-    </w:p>
-    <w:p>
-      <w:pPr>
-        <w:pStyle w:val="Compact"/>
-        <w:numPr>
-          <w:ilvl w:val="0"/>
-          <w:numId w:val="1028"/>
-        </w:numPr>
-      </w:pPr>
-      <w:r>
-        <w:rPr>
-          <w:b/>
-          <w:bCs/>
-          <w:lang w:val="nl"/>
-        </w:rPr>
-        <w:t xml:space="preserve">Sluiten.</w:t>
-      </w:r>
-      <w:r>
-        <w:rPr>
-          <w:lang w:val="nl"/>
-        </w:rPr>
-        <w:t xml:space="preserve"> </w:t>
-      </w:r>
-      <w:r>
-        <w:rPr>
-          <w:lang w:val="nl"/>
-        </w:rPr>
-        <w:t xml:space="preserve">Klik op</w:t>
-      </w:r>
-      <w:r>
-        <w:rPr>
-          <w:lang w:val="nl"/>
-        </w:rPr>
-        <w:t xml:space="preserve"> </w:t>
-      </w:r>
-      <w:r>
-        <w:rPr>
-          <w:b/>
-          <w:bCs/>
-          <w:lang w:val="nl"/>
-        </w:rPr>
-        <w:t xml:space="preserve">Seizoen sluiten</w:t>
-      </w:r>
-      <w:r>
-        <w:rPr>
-          <w:lang w:val="nl"/>
-        </w:rPr>
-        <w:t xml:space="preserve"> </w:t>
-      </w:r>
-      <w:r>
-        <w:rPr>
-          <w:lang w:val="nl"/>
-        </w:rPr>
-        <w:t xml:space="preserve">en bevestig met</w:t>
-      </w:r>
-      <w:r>
-        <w:rPr>
-          <w:lang w:val="nl"/>
-        </w:rPr>
-        <w:t xml:space="preserve"> </w:t>
-      </w:r>
-      <w:r>
-        <w:rPr>
-          <w:b/>
-          <w:bCs/>
-          <w:lang w:val="nl"/>
-        </w:rPr>
-        <w:t xml:space="preserve">Ja, sluiten</w:t>
-      </w:r>
-      <w:r>
-        <w:rPr>
-          <w:lang w:val="nl"/>
-        </w:rPr>
-        <w:t xml:space="preserve">. Het aanmeldformulier</w:t>
-      </w:r>
-      <w:r>
-        <w:rPr>
-          <w:lang w:val="nl"/>
-        </w:rPr>
-        <w:t xml:space="preserve"> </w:t>
-      </w:r>
-      <w:r>
-        <w:rPr>
-          <w:lang w:val="nl"/>
-        </w:rPr>
-        <w:t xml:space="preserve">gaat uit; alle gegevens blijven bewaard en je kunt later weer openen.</w:t>
+      <w:r>
+        <w:rPr>
+          <w:lang w:val="nl"/>
+        </w:rPr>
+        <w:t xml:space="preserve"> </w:t>
+      </w:r>
+      <w:r>
+        <w:rPr>
+          <w:lang w:val="nl"/>
+        </w:rPr>
+        <w:t xml:space="preserve">Vandaag wijst per fase de volgende stap aan, tot en met de fase</w:t>
+      </w:r>
+      <w:r>
+        <w:rPr>
+          <w:lang w:val="nl"/>
+        </w:rPr>
+        <w:t xml:space="preserve"> </w:t>
+      </w:r>
+      <w:r>
+        <w:rPr>
+          <w:b/>
+          <w:bCs/>
+          <w:lang w:val="nl"/>
+        </w:rPr>
+        <w:t xml:space="preserve">Afronden</w:t>
+      </w:r>
+      <w:r>
+        <w:rPr>
+          <w:lang w:val="nl"/>
+        </w:rPr>
+        <w:t xml:space="preserve"> </w:t>
+      </w:r>
+      <w:r>
+        <w:rPr>
+          <w:lang w:val="nl"/>
+        </w:rPr>
+        <w:t xml:space="preserve">(loonplanning</w:t>
+      </w:r>
+      <w:r>
+        <w:rPr>
+          <w:lang w:val="nl"/>
+        </w:rPr>
+        <w:t xml:space="preserve"> </w:t>
+      </w:r>
+      <w:r>
+        <w:rPr>
+          <w:lang w:val="nl"/>
+        </w:rPr>
+        <w:t xml:space="preserve">definitief, opschonen aan, volgend seizoen klaarzetten).</w:t>
       </w:r>
     </w:p>
     <w:bookmarkEnd w:id="39"/>
@@ -36498,7 +36533,7 @@
               <w:rPr>
                 <w:lang w:val="nl"/>
               </w:rPr>
-              <w:t xml:space="preserve">Het seizoensbudget voor loonkosten (voor de balk in de loonplanning; leeg is zonder budget); het vakantietoeslagpercentage (standaard 8), de werkuren per dag (standaard 8) en de vaste weekbedragen van de postcommandant voor juni en juli–september; de minimumuurlonen per leeftijd (15 tot en met 32) voor juni en voor juli/augustus/september, elk met een eigen</w:t>
+              <w:t xml:space="preserve">Alles per kalenderjaar (kies het jaar bovenaan; een seizoen rekent met het jaar van de eerste werkdag): het budget voor loonkosten (voor de balk in de loonplanning; leeg is zonder budget), het vakantietoeslagpercentage (standaard 8), de werkuren per dag (standaard 8), de vaste weekbedragen van de postcommandant voor juni en juli–september, en de minimumuurlonen per leeftijd (15 tot en met 32) voor juni en voor juli/augustus/september, elk met een eigen</w:t>
             </w:r>
             <w:r>
               <w:rPr>
@@ -36518,7 +36553,33 @@
               <w:rPr>
                 <w:lang w:val="nl"/>
               </w:rPr>
-              <w:t xml:space="preserve">.</w:t>
+              <w:t xml:space="preserve">. Met</w:t>
+            </w:r>
+            <w:r>
+              <w:rPr>
+                <w:lang w:val="nl"/>
+              </w:rPr>
+              <w:t xml:space="preserve"> </w:t>
+            </w:r>
+            <w:r>
+              <w:rPr>
+                <w:b/>
+                <w:bCs/>
+                <w:lang w:val="nl"/>
+              </w:rPr>
+              <w:t xml:space="preserve">Nieuw jaar op basis van …</w:t>
+            </w:r>
+            <w:r>
+              <w:rPr>
+                <w:lang w:val="nl"/>
+              </w:rPr>
+              <w:t xml:space="preserve"> </w:t>
+            </w:r>
+            <w:r>
+              <w:rPr>
+                <w:lang w:val="nl"/>
+              </w:rPr>
+              <w:t xml:space="preserve">kopieer je de tarieven naar het volgende jaar (het budget niet). Zijn de tarieven van een jaar nog niet ingevuld, dan rekent de loonplanning met het vorige jaar en zegt dat erbij. Oude seizoenen veranderen dus niet meer als je nieuwe minimumlonen invoert.</w:t>
             </w:r>
           </w:p>
         </w:tc>
@@ -40272,7 +40333,7 @@
               <w:rPr>
                 <w:lang w:val="nl"/>
               </w:rPr>
-              <w:t xml:space="preserve">BLK-formulieren &amp; details</w:t>
+              <w:t xml:space="preserve">Kennismakingsformulier</w:t>
             </w:r>
           </w:p>
         </w:tc>
@@ -40848,7 +40909,7 @@
               <w:rPr>
                 <w:lang w:val="nl"/>
               </w:rPr>
-              <w:t xml:space="preserve">Seizoenbeheer</w:t>
+              <w:t xml:space="preserve">Seizoen</w:t>
             </w:r>
           </w:p>
         </w:tc>

</xml_diff>

<commit_message>
Handleiding penningmeester: de hele keten van beschikbaarheid tot loondossier
- Herschreven voor de penningmeester: het grote plaatje, wat je per seizoen doet (afvinklijst), beschikbaarheid, loonplanning (opgave, scenario's, vastgestelde afspraak, slot na het gesprek, dagloon, lonen en budget per jaar, Excel), trainingsweekend en gesprek, takenpakket na aanname, loondossiers, rooster, FAQ en woordenlijst
- Handleidingen beheer/sollicitant: lidmaatschap onder 18 door de ouder, zes TW-stappen, Excel i.p.v. CSV
- hulp.php: omschrijving van de penningmeester-handleiding
</commit_message>
<xml_diff>
--- a/docs/handleiding/word/handleiding_beheer.docx
+++ b/docs/handleiding/word/handleiding_beheer.docx
@@ -1537,7 +1537,7 @@
               <w:rPr>
                 <w:lang w:val="nl"/>
               </w:rPr>
-              <w:t xml:space="preserve">Het loondossier: loonheffing, kopie ID en bankpas inzien, downloaden, als verwerkt markeren en na de bewaarplicht vernietigen. De loonplanning bekijken en bewerken (kosten, scenario's, CSV). Sollicitanten alleen bekijken.</w:t>
+              <w:t xml:space="preserve">Het loondossier: loonheffing, kopie ID en bankpas inzien, downloaden, als verwerkt markeren en na de bewaarplicht vernietigen. De loonplanning bekijken en bewerken (kosten, scenario's, Excel-export). Sollicitanten alleen bekijken.</w:t>
             </w:r>
           </w:p>
         </w:tc>
@@ -22391,19 +22391,19 @@
         <w:rPr>
           <w:lang w:val="nl"/>
         </w:rPr>
-        <w:t xml:space="preserve">Kandidaten › Trainingsweekend, met vier stappen: Voorbereiden, Inchecken, Beoordelen en</w:t>
-      </w:r>
-      <w:r>
-        <w:rPr>
-          <w:lang w:val="nl"/>
-        </w:rPr>
-        <w:t xml:space="preserve"> </w:t>
-      </w:r>
-      <w:r>
-        <w:rPr>
-          <w:lang w:val="nl"/>
-        </w:rPr>
-        <w:t xml:space="preserve">Gesprekken.</w:t>
+        <w:t xml:space="preserve">Kandidaten › Trainingsweekend, met zes stappen: Voorbereiden, Groepen, Inchecken,</w:t>
+      </w:r>
+      <w:r>
+        <w:rPr>
+          <w:lang w:val="nl"/>
+        </w:rPr>
+        <w:t xml:space="preserve"> </w:t>
+      </w:r>
+      <w:r>
+        <w:rPr>
+          <w:lang w:val="nl"/>
+        </w:rPr>
+        <w:t xml:space="preserve">Beoordelen, Evaluatie en Gesprekken.</w:t>
       </w:r>
       <w:r>
         <w:br/>
@@ -22426,7 +22426,7 @@
         <w:rPr>
           <w:lang w:val="nl"/>
         </w:rPr>
-        <w:t xml:space="preserve">de eerste drie: bestuur, beheerder en begeleiders. Gesprekken: alleen bestuur en beheerder.</w:t>
+        <w:t xml:space="preserve">de eerste vier: bestuur, beheerder en begeleiders. Evaluatie en Gesprekken: alleen bestuur en beheerder.</w:t>
       </w:r>
     </w:p>
     <w:p>
@@ -24268,7 +24268,7 @@
               <w:rPr>
                 <w:lang w:val="nl"/>
               </w:rPr>
-              <w:t xml:space="preserve">Sollicitant zelf, ook onder de 18</w:t>
+              <w:t xml:space="preserve">Vanaf 18 de sollicitant zelf; onder de 18 de ouder of verzorger via een link per mail (ook de SEPA-machtiging, als rekeninghouder)</w:t>
             </w:r>
           </w:p>
         </w:tc>

</xml_diff>

<commit_message>
2.137.0: dossier met kaart "Nu" en de rest inklapbaar
bh_dossier_nu() (includes/beheer/dossier.php, geen HTML): één zin per fase (met selectiedag-
bevestiging, nabesprekingsbesluit, TW-besluit), openstaande taken als "wacht op" en of een
herinnering zin heeft. Partial admin/dossier/_nu.php met herinnerknop (POST herinneren=1 op
sollicitant.php -> sollicitant_herinneren()). bh_herinner_uitkomst() voor de meldingstekst
(lijst en dossier). _tab_dossier.php: gegevens, advies, competenties, formulier, AI, taken en
eerdere seizoenen als bh-klap met samenvatting; Gegevens corrigeren genest in de kaart Gegevens
(#gegevens + ?corrigeer=1 blijven werken). Dossiertabs scrollen op mobiel.
</commit_message>
<xml_diff>
--- a/docs/handleiding/word/handleiding_beheer.docx
+++ b/docs/handleiding/word/handleiding_beheer.docx
@@ -16322,6 +16322,184 @@
     </w:p>
     <w:p>
       <w:pPr>
+        <w:pStyle w:val="FirstParagraph"/>
+      </w:pPr>
+      <w:r>
+        <w:rPr>
+          <w:lang w:val="nl"/>
+        </w:rPr>
+        <w:t xml:space="preserve">Bovenaan staat altijd de kaart</w:t>
+      </w:r>
+      <w:r>
+        <w:rPr>
+          <w:lang w:val="nl"/>
+        </w:rPr>
+        <w:t xml:space="preserve"> </w:t>
+      </w:r>
+      <w:r>
+        <w:rPr>
+          <w:b/>
+          <w:bCs/>
+          <w:lang w:val="nl"/>
+        </w:rPr>
+        <w:t xml:space="preserve">Nu</w:t>
+      </w:r>
+      <w:r>
+        <w:rPr>
+          <w:lang w:val="nl"/>
+        </w:rPr>
+        <w:t xml:space="preserve">: in één zin waar de sollicitant staat (bijvoorbeeld "Selectiedag</w:t>
+      </w:r>
+      <w:r>
+        <w:rPr>
+          <w:lang w:val="nl"/>
+        </w:rPr>
+        <w:t xml:space="preserve"> </w:t>
+      </w:r>
+      <w:r>
+        <w:rPr>
+          <w:lang w:val="nl"/>
+        </w:rPr>
+        <w:t xml:space="preserve">geweest. Besluit: door. Bellen en uitnodigen voor het trainingsweekend gaat via de bellijst"), en</w:t>
+      </w:r>
+      <w:r>
+        <w:rPr>
+          <w:lang w:val="nl"/>
+        </w:rPr>
+        <w:t xml:space="preserve"> </w:t>
+      </w:r>
+      <w:r>
+        <w:rPr>
+          <w:lang w:val="nl"/>
+        </w:rPr>
+        <w:t xml:space="preserve">onder</w:t>
+      </w:r>
+      <w:r>
+        <w:rPr>
+          <w:lang w:val="nl"/>
+        </w:rPr>
+        <w:t xml:space="preserve"> </w:t>
+      </w:r>
+      <w:r>
+        <w:rPr>
+          <w:b/>
+          <w:bCs/>
+          <w:lang w:val="nl"/>
+        </w:rPr>
+        <w:t xml:space="preserve">Wacht op</w:t>
+      </w:r>
+      <w:r>
+        <w:rPr>
+          <w:lang w:val="nl"/>
+        </w:rPr>
+        <w:t xml:space="preserve"> </w:t>
+      </w:r>
+      <w:r>
+        <w:rPr>
+          <w:lang w:val="nl"/>
+        </w:rPr>
+        <w:t xml:space="preserve">de taken die nog openstaan, met "(wacht op ouder)" als een ouder aan zet is. Staat</w:t>
+      </w:r>
+      <w:r>
+        <w:rPr>
+          <w:lang w:val="nl"/>
+        </w:rPr>
+        <w:t xml:space="preserve"> </w:t>
+      </w:r>
+      <w:r>
+        <w:rPr>
+          <w:lang w:val="nl"/>
+        </w:rPr>
+        <w:t xml:space="preserve">er iets open, dan stuurt</w:t>
+      </w:r>
+      <w:r>
+        <w:rPr>
+          <w:lang w:val="nl"/>
+        </w:rPr>
+        <w:t xml:space="preserve"> </w:t>
+      </w:r>
+      <w:r>
+        <w:rPr>
+          <w:b/>
+          <w:bCs/>
+          <w:lang w:val="nl"/>
+        </w:rPr>
+        <w:t xml:space="preserve">Herinnering sturen</w:t>
+      </w:r>
+      <w:r>
+        <w:rPr>
+          <w:lang w:val="nl"/>
+        </w:rPr>
+        <w:t xml:space="preserve"> </w:t>
+      </w:r>
+      <w:r>
+        <w:rPr>
+          <w:lang w:val="nl"/>
+        </w:rPr>
+        <w:t xml:space="preserve">(na een korte vraag) dezelfde herinnering als de</w:t>
+      </w:r>
+      <w:r>
+        <w:rPr>
+          <w:lang w:val="nl"/>
+        </w:rPr>
+        <w:t xml:space="preserve"> </w:t>
+      </w:r>
+      <w:r>
+        <w:rPr>
+          <w:lang w:val="nl"/>
+        </w:rPr>
+        <w:t xml:space="preserve">bulkknop op de lijst. De stap vooruit zelf staat in de kop, niet in deze kaart.</w:t>
+      </w:r>
+    </w:p>
+    <w:p>
+      <w:pPr>
+        <w:pStyle w:val="BodyText"/>
+      </w:pPr>
+      <w:r>
+        <w:rPr>
+          <w:lang w:val="nl"/>
+        </w:rPr>
+        <w:t xml:space="preserve">Alles daaronder staat ingeklapt, met een samenvatting op één regel (bijvoorbeeld "Advies · Door ·</w:t>
+      </w:r>
+      <w:r>
+        <w:rPr>
+          <w:lang w:val="nl"/>
+        </w:rPr>
+        <w:t xml:space="preserve"> </w:t>
+      </w:r>
+      <w:r>
+        <w:rPr>
+          <w:lang w:val="nl"/>
+        </w:rPr>
+        <w:t xml:space="preserve">4,3 gemiddeld"). Klik om te openen; wat je openklapt blijft open zolang je werkt, ook bij de</w:t>
+      </w:r>
+      <w:r>
+        <w:rPr>
+          <w:lang w:val="nl"/>
+        </w:rPr>
+        <w:t xml:space="preserve"> </w:t>
+      </w:r>
+      <w:r>
+        <w:rPr>
+          <w:lang w:val="nl"/>
+        </w:rPr>
+        <w:t xml:space="preserve">volgende sollicitant. Na de selectiedag staat het advies standaard open, en een gemelde</w:t>
+      </w:r>
+      <w:r>
+        <w:rPr>
+          <w:lang w:val="nl"/>
+        </w:rPr>
+        <w:t xml:space="preserve"> </w:t>
+      </w:r>
+      <w:r>
+        <w:rPr>
+          <w:lang w:val="nl"/>
+        </w:rPr>
+        <w:t xml:space="preserve">bijzonderheid zie je als rood label zonder uit te klappen.</w:t>
+      </w:r>
+    </w:p>
+    <w:p>
+      <w:pPr>
         <w:pStyle w:val="Compact"/>
         <w:numPr>
           <w:ilvl w:val="0"/>
@@ -16527,19 +16705,19 @@
         <w:rPr>
           <w:lang w:val="nl"/>
         </w:rPr>
-        <w:t xml:space="preserve">(met bewerkrecht): een uitklapper om naam, e-mail, telefoon of</w:t>
-      </w:r>
-      <w:r>
-        <w:rPr>
-          <w:lang w:val="nl"/>
-        </w:rPr>
-        <w:t xml:space="preserve"> </w:t>
-      </w:r>
-      <w:r>
-        <w:rPr>
-          <w:lang w:val="nl"/>
-        </w:rPr>
-        <w:t xml:space="preserve">geboortedatum te verbeteren. Zie</w:t>
+        <w:t xml:space="preserve">(met bewerkrecht, onderaan de kaart Gegevens): een uitklapper om naam,</w:t>
+      </w:r>
+      <w:r>
+        <w:rPr>
+          <w:lang w:val="nl"/>
+        </w:rPr>
+        <w:t xml:space="preserve"> </w:t>
+      </w:r>
+      <w:r>
+        <w:rPr>
+          <w:lang w:val="nl"/>
+        </w:rPr>
+        <w:t xml:space="preserve">e-mail, telefoon of geboortedatum te verbeteren. Zie</w:t>
       </w:r>
       <w:r>
         <w:rPr>
@@ -17042,7 +17220,13 @@
         <w:rPr>
           <w:lang w:val="nl"/>
         </w:rPr>
-        <w:t xml:space="preserve">: de taken precies zoals de sollicitant ze in het portaal ziet, met "x / y afgerond"</w:t>
+        <w:t xml:space="preserve"> </w:t>
+      </w:r>
+      <w:r>
+        <w:rPr>
+          <w:lang w:val="nl"/>
+        </w:rPr>
+        <w:t xml:space="preserve">(ingeklapt, "x van y afgerond"): de taken precies zoals de sollicitant ze in het portaal ziet, met "x / y afgerond"</w:t>
       </w:r>
       <w:r>
         <w:rPr>
@@ -17182,13 +17366,19 @@
           <w:bCs/>
           <w:lang w:val="nl"/>
         </w:rPr>
-        <w:t xml:space="preserve">Tijdlijn</w:t>
-      </w:r>
-      <w:r>
-        <w:rPr>
-          <w:lang w:val="nl"/>
-        </w:rPr>
-        <w:t xml:space="preserve">: de laatste gebeurtenissen.</w:t>
+        <w:t xml:space="preserve">Eerdere seizoenen</w:t>
+      </w:r>
+      <w:r>
+        <w:rPr>
+          <w:lang w:val="nl"/>
+        </w:rPr>
+        <w:t xml:space="preserve"> </w:t>
+      </w:r>
+      <w:r>
+        <w:rPr>
+          <w:lang w:val="nl"/>
+        </w:rPr>
+        <w:t xml:space="preserve">(ingeklapt): eerdere sollicitaties van dezelfde persoon, met de fase waarin die eindigden.</w:t>
       </w:r>
     </w:p>
     <w:p>
@@ -17205,13 +17395,19 @@
           <w:bCs/>
           <w:lang w:val="nl"/>
         </w:rPr>
-        <w:t xml:space="preserve">Eerdere seizoenen</w:t>
-      </w:r>
-      <w:r>
-        <w:rPr>
-          <w:lang w:val="nl"/>
-        </w:rPr>
-        <w:t xml:space="preserve">: eerdere sollicitaties van dezelfde persoon, met de fase waarin die eindigden.</w:t>
+        <w:t xml:space="preserve">Tijdlijn bekijken</w:t>
+      </w:r>
+      <w:r>
+        <w:rPr>
+          <w:lang w:val="nl"/>
+        </w:rPr>
+        <w:t xml:space="preserve"> </w:t>
+      </w:r>
+      <w:r>
+        <w:rPr>
+          <w:lang w:val="nl"/>
+        </w:rPr>
+        <w:t xml:space="preserve">opent het tabblad Tijdlijn.</w:t>
       </w:r>
     </w:p>
     <w:bookmarkEnd w:id="59"/>

</xml_diff>

<commit_message>
2.138.0: berichten standaard WhatsApp/sms, opmaak, variabelen, mobiel
Nieuw bestand includes/berichten_opmaak.php: kort_opmaak_strip() (sms), kort_naar_html()
(e-mailterugval, escapet eerst) en melding_variabelen_lijst() (één bron voor Berichten en
Sjablonen). verzend.php stript opmaak voor sms; melding_render() gebruikt 'kort_max' uit het
register (handmatig 1000).
berichten.php: modus standaard 'kort'; bij alleen WhatsApp/sms wordt de e-mail uit de korte tekst
gemaakt met een vast onderwerp (besluit Lucas). Formulier in één kolom (Aan, Hoe, Bericht,
Versturen; sticky op mobiel), velden per kanaal via data-kanaal. Inline script naar
assets/js/berichten.js (opmaakknoppen, teller met sms-delen, WhatsApp-voorbeeld, terugvalteller).
Gedeelde partial admin/_variabelen.php + assets/js/variabelen.js (invoegen in het laatst
gefocuste veld of de editor), ook in mail_templates.php.
</commit_message>
<xml_diff>
--- a/docs/handleiding/word/handleiding_beheer.docx
+++ b/docs/handleiding/word/handleiding_beheer.docx
@@ -32098,6 +32098,17 @@
     </w:p>
     <w:p>
       <w:pPr>
+        <w:pStyle w:val="FirstParagraph"/>
+      </w:pPr>
+      <w:r>
+        <w:rPr>
+          <w:lang w:val="nl"/>
+        </w:rPr>
+        <w:t xml:space="preserve">Het formulier staat in drie stappen onder elkaar, ook op een telefoon.</w:t>
+      </w:r>
+    </w:p>
+    <w:p>
+      <w:pPr>
         <w:pStyle w:val="Compact"/>
         <w:numPr>
           <w:ilvl w:val="0"/>
@@ -32110,121 +32121,203 @@
           <w:bCs/>
           <w:lang w:val="nl"/>
         </w:rPr>
-        <w:t xml:space="preserve">Kanaal</w:t>
-      </w:r>
-      <w:r>
-        <w:rPr>
-          <w:lang w:val="nl"/>
-        </w:rPr>
-        <w:t xml:space="preserve">: kies</w:t>
-      </w:r>
-      <w:r>
-        <w:rPr>
-          <w:lang w:val="nl"/>
-        </w:rPr>
-        <w:t xml:space="preserve"> </w:t>
-      </w:r>
-      <w:r>
-        <w:rPr>
-          <w:b/>
-          <w:bCs/>
-          <w:lang w:val="nl"/>
-        </w:rPr>
-        <w:t xml:space="preserve">E-mail</w:t>
-      </w:r>
-      <w:r>
-        <w:rPr>
-          <w:lang w:val="nl"/>
-        </w:rPr>
-        <w:t xml:space="preserve"> </w:t>
-      </w:r>
-      <w:r>
-        <w:rPr>
-          <w:lang w:val="nl"/>
-        </w:rPr>
-        <w:t xml:space="preserve">(volledige opmaak),</w:t>
-      </w:r>
-      <w:r>
-        <w:rPr>
-          <w:lang w:val="nl"/>
-        </w:rPr>
-        <w:t xml:space="preserve"> </w:t>
-      </w:r>
-      <w:r>
-        <w:rPr>
-          <w:b/>
-          <w:bCs/>
-          <w:lang w:val="nl"/>
-        </w:rPr>
-        <w:t xml:space="preserve">WhatsApp/SMS</w:t>
-      </w:r>
-      <w:r>
-        <w:rPr>
-          <w:lang w:val="nl"/>
-        </w:rPr>
-        <w:t xml:space="preserve"> </w:t>
-      </w:r>
-      <w:r>
-        <w:rPr>
-          <w:lang w:val="nl"/>
-        </w:rPr>
-        <w:t xml:space="preserve">(korte tekst, e-mail als</w:t>
-      </w:r>
-      <w:r>
-        <w:rPr>
-          <w:lang w:val="nl"/>
-        </w:rPr>
-        <w:t xml:space="preserve"> </w:t>
-      </w:r>
-      <w:r>
-        <w:rPr>
-          <w:lang w:val="nl"/>
-        </w:rPr>
-        <w:t xml:space="preserve">terugval) of</w:t>
-      </w:r>
-      <w:r>
-        <w:rPr>
-          <w:lang w:val="nl"/>
-        </w:rPr>
-        <w:t xml:space="preserve"> </w:t>
-      </w:r>
-      <w:r>
-        <w:rPr>
-          <w:b/>
-          <w:bCs/>
-          <w:lang w:val="nl"/>
-        </w:rPr>
-        <w:t xml:space="preserve">E-mail + WhatsApp/SMS</w:t>
-      </w:r>
-      <w:r>
-        <w:rPr>
-          <w:lang w:val="nl"/>
-        </w:rPr>
-        <w:t xml:space="preserve">. WhatsApp of SMS volgt de voorkeur die de sollicitant</w:t>
-      </w:r>
-      <w:r>
-        <w:rPr>
-          <w:lang w:val="nl"/>
-        </w:rPr>
-        <w:t xml:space="preserve"> </w:t>
-      </w:r>
-      <w:r>
-        <w:rPr>
-          <w:lang w:val="nl"/>
-        </w:rPr>
-        <w:t xml:space="preserve">zelf instelde. Zonder telefoonnummer, of als het niet lukt, gaat het bericht per e-mail. Wie</w:t>
-      </w:r>
-      <w:r>
-        <w:rPr>
-          <w:lang w:val="nl"/>
-        </w:rPr>
-        <w:t xml:space="preserve"> </w:t>
-      </w:r>
-      <w:r>
-        <w:rPr>
-          <w:lang w:val="nl"/>
-        </w:rPr>
-        <w:t xml:space="preserve">zich heeft afgemeld wordt overgeslagen, en elk bericht krijgt een afmeldvoet.</w:t>
+        <w:t xml:space="preserve">Aan</w:t>
+      </w:r>
+      <w:r>
+        <w:rPr>
+          <w:lang w:val="nl"/>
+        </w:rPr>
+        <w:t xml:space="preserve">: typ een naam in het zoekveld, of klik op een snelknop zoals</w:t>
+      </w:r>
+      <w:r>
+        <w:rPr>
+          <w:lang w:val="nl"/>
+        </w:rPr>
+        <w:t xml:space="preserve"> </w:t>
+      </w:r>
+      <w:r>
+        <w:rPr>
+          <w:b/>
+          <w:bCs/>
+          <w:lang w:val="nl"/>
+        </w:rPr>
+        <w:t xml:space="preserve">+ Aangemeld (12)</w:t>
+      </w:r>
+      <w:r>
+        <w:rPr>
+          <w:lang w:val="nl"/>
+        </w:rPr>
+        <w:t xml:space="preserve"> </w:t>
+      </w:r>
+      <w:r>
+        <w:rPr>
+          <w:lang w:val="nl"/>
+        </w:rPr>
+        <w:t xml:space="preserve">of</w:t>
+      </w:r>
+      <w:r>
+        <w:rPr>
+          <w:lang w:val="nl"/>
+        </w:rPr>
+        <w:t xml:space="preserve"> </w:t>
+      </w:r>
+      <w:r>
+        <w:rPr>
+          <w:b/>
+          <w:bCs/>
+          <w:lang w:val="nl"/>
+        </w:rPr>
+        <w:t xml:space="preserve">+ Seintje gevraagd (4)</w:t>
+      </w:r>
+      <w:r>
+        <w:rPr>
+          <w:lang w:val="nl"/>
+        </w:rPr>
+        <w:t xml:space="preserve">.</w:t>
+      </w:r>
+      <w:r>
+        <w:rPr>
+          <w:lang w:val="nl"/>
+        </w:rPr>
+        <w:t xml:space="preserve"> </w:t>
+      </w:r>
+      <w:r>
+        <w:rPr>
+          <w:b/>
+          <w:bCs/>
+          <w:lang w:val="nl"/>
+        </w:rPr>
+        <w:t xml:space="preserve">Iedereen</w:t>
+      </w:r>
+      <w:r>
+        <w:rPr>
+          <w:lang w:val="nl"/>
+        </w:rPr>
+        <w:t xml:space="preserve"> </w:t>
+      </w:r>
+      <w:r>
+        <w:rPr>
+          <w:lang w:val="nl"/>
+        </w:rPr>
+        <w:t xml:space="preserve">en</w:t>
+      </w:r>
+      <w:r>
+        <w:rPr>
+          <w:lang w:val="nl"/>
+        </w:rPr>
+        <w:t xml:space="preserve"> </w:t>
+      </w:r>
+      <w:r>
+        <w:rPr>
+          <w:b/>
+          <w:bCs/>
+          <w:lang w:val="nl"/>
+        </w:rPr>
+        <w:t xml:space="preserve">Niemand</w:t>
+      </w:r>
+      <w:r>
+        <w:rPr>
+          <w:lang w:val="nl"/>
+        </w:rPr>
+        <w:t xml:space="preserve"> </w:t>
+      </w:r>
+      <w:r>
+        <w:rPr>
+          <w:lang w:val="nl"/>
+        </w:rPr>
+        <w:t xml:space="preserve">zetten de hele lijst aan of uit. Onder</w:t>
+      </w:r>
+      <w:r>
+        <w:rPr>
+          <w:lang w:val="nl"/>
+        </w:rPr>
+        <w:t xml:space="preserve"> </w:t>
+      </w:r>
+      <w:r>
+        <w:rPr>
+          <w:b/>
+          <w:bCs/>
+          <w:lang w:val="nl"/>
+        </w:rPr>
+        <w:t xml:space="preserve">Of</w:t>
+      </w:r>
+      <w:r>
+        <w:rPr>
+          <w:b/>
+          <w:bCs/>
+          <w:lang w:val="nl"/>
+        </w:rPr>
+        <w:t xml:space="preserve"> </w:t>
+      </w:r>
+      <w:r>
+        <w:rPr>
+          <w:b/>
+          <w:bCs/>
+          <w:lang w:val="nl"/>
+        </w:rPr>
+        <w:t xml:space="preserve">kies uit de volledige lijst</w:t>
+      </w:r>
+      <w:r>
+        <w:rPr>
+          <w:lang w:val="nl"/>
+        </w:rPr>
+        <w:t xml:space="preserve"> </w:t>
+      </w:r>
+      <w:r>
+        <w:rPr>
+          <w:lang w:val="nl"/>
+        </w:rPr>
+        <w:t xml:space="preserve">staan alle sollicitanten van het seizoen per fase, met een vinkje</w:t>
+      </w:r>
+      <w:r>
+        <w:rPr>
+          <w:lang w:val="nl"/>
+        </w:rPr>
+        <w:t xml:space="preserve"> </w:t>
+      </w:r>
+      <w:r>
+        <w:rPr>
+          <w:lang w:val="nl"/>
+        </w:rPr>
+        <w:t xml:space="preserve">voor de hele fase. Bij elke naam staan het e-mailadres en het kanaal ("WhatsApp", "sms",</w:t>
+      </w:r>
+      <w:r>
+        <w:rPr>
+          <w:lang w:val="nl"/>
+        </w:rPr>
+        <w:t xml:space="preserve"> </w:t>
+      </w:r>
+      <w:r>
+        <w:rPr>
+          <w:lang w:val="nl"/>
+        </w:rPr>
+        <w:t xml:space="preserve">"alleen e-mail" of "geen telefoon"), en eventueel het label "afgemeld". Kom je via</w:t>
+      </w:r>
+      <w:r>
+        <w:rPr>
+          <w:lang w:val="nl"/>
+        </w:rPr>
+        <w:t xml:space="preserve"> </w:t>
+      </w:r>
+      <w:r>
+        <w:rPr>
+          <w:b/>
+          <w:bCs/>
+          <w:lang w:val="nl"/>
+        </w:rPr>
+        <w:t xml:space="preserve">Bericht</w:t>
+      </w:r>
+      <w:r>
+        <w:rPr>
+          <w:lang w:val="nl"/>
+        </w:rPr>
+        <w:t xml:space="preserve"> </w:t>
+      </w:r>
+      <w:r>
+        <w:rPr>
+          <w:lang w:val="nl"/>
+        </w:rPr>
+        <w:t xml:space="preserve">in een dossier of via een bulkactie, dan staan die mensen al aangevinkt.</w:t>
       </w:r>
     </w:p>
     <w:p>
@@ -32241,7 +32334,166 @@
           <w:bCs/>
           <w:lang w:val="nl"/>
         </w:rPr>
-        <w:t xml:space="preserve">Inhoud</w:t>
+        <w:t xml:space="preserve">Hoe</w:t>
+      </w:r>
+      <w:r>
+        <w:rPr>
+          <w:lang w:val="nl"/>
+        </w:rPr>
+        <w:t xml:space="preserve">: standaard</w:t>
+      </w:r>
+      <w:r>
+        <w:rPr>
+          <w:lang w:val="nl"/>
+        </w:rPr>
+        <w:t xml:space="preserve"> </w:t>
+      </w:r>
+      <w:r>
+        <w:rPr>
+          <w:b/>
+          <w:bCs/>
+          <w:lang w:val="nl"/>
+        </w:rPr>
+        <w:t xml:space="preserve">WhatsApp/SMS</w:t>
+      </w:r>
+      <w:r>
+        <w:rPr>
+          <w:lang w:val="nl"/>
+        </w:rPr>
+        <w:t xml:space="preserve">. WhatsApp of sms volgt de voorkeur die de sollicitant zelf</w:t>
+      </w:r>
+      <w:r>
+        <w:rPr>
+          <w:lang w:val="nl"/>
+        </w:rPr>
+        <w:t xml:space="preserve"> </w:t>
+      </w:r>
+      <w:r>
+        <w:rPr>
+          <w:lang w:val="nl"/>
+        </w:rPr>
+        <w:t xml:space="preserve">instelde. Wie geen telefoonnummer heeft of liever alleen e-mail wil, krijgt dezelfde tekst als</w:t>
+      </w:r>
+      <w:r>
+        <w:rPr>
+          <w:lang w:val="nl"/>
+        </w:rPr>
+        <w:t xml:space="preserve"> </w:t>
+      </w:r>
+      <w:r>
+        <w:rPr>
+          <w:lang w:val="nl"/>
+        </w:rPr>
+        <w:t xml:space="preserve">eenvoudige e-mail (onderwerp "Bericht van …"); onder de keuze staat hoeveel van je ontvangers dat</w:t>
+      </w:r>
+      <w:r>
+        <w:rPr>
+          <w:lang w:val="nl"/>
+        </w:rPr>
+        <w:t xml:space="preserve"> </w:t>
+      </w:r>
+      <w:r>
+        <w:rPr>
+          <w:lang w:val="nl"/>
+        </w:rPr>
+        <w:t xml:space="preserve">zijn. Kies</w:t>
+      </w:r>
+      <w:r>
+        <w:rPr>
+          <w:lang w:val="nl"/>
+        </w:rPr>
+        <w:t xml:space="preserve"> </w:t>
+      </w:r>
+      <w:r>
+        <w:rPr>
+          <w:b/>
+          <w:bCs/>
+          <w:lang w:val="nl"/>
+        </w:rPr>
+        <w:t xml:space="preserve">E-mail</w:t>
+      </w:r>
+      <w:r>
+        <w:rPr>
+          <w:lang w:val="nl"/>
+        </w:rPr>
+        <w:t xml:space="preserve"> </w:t>
+      </w:r>
+      <w:r>
+        <w:rPr>
+          <w:lang w:val="nl"/>
+        </w:rPr>
+        <w:t xml:space="preserve">voor een mail met volledige opmaak, knoppen en bijlagen, of</w:t>
+      </w:r>
+      <w:r>
+        <w:rPr>
+          <w:lang w:val="nl"/>
+        </w:rPr>
+        <w:t xml:space="preserve"> </w:t>
+      </w:r>
+      <w:r>
+        <w:rPr>
+          <w:b/>
+          <w:bCs/>
+          <w:lang w:val="nl"/>
+        </w:rPr>
+        <w:t xml:space="preserve">E-mail +</w:t>
+      </w:r>
+      <w:r>
+        <w:rPr>
+          <w:b/>
+          <w:bCs/>
+          <w:lang w:val="nl"/>
+        </w:rPr>
+        <w:t xml:space="preserve"> </w:t>
+      </w:r>
+      <w:r>
+        <w:rPr>
+          <w:b/>
+          <w:bCs/>
+          <w:lang w:val="nl"/>
+        </w:rPr>
+        <w:t xml:space="preserve">WhatsApp/SMS</w:t>
+      </w:r>
+      <w:r>
+        <w:rPr>
+          <w:lang w:val="nl"/>
+        </w:rPr>
+        <w:t xml:space="preserve"> </w:t>
+      </w:r>
+      <w:r>
+        <w:rPr>
+          <w:lang w:val="nl"/>
+        </w:rPr>
+        <w:t xml:space="preserve">voor allebei. Wie zich heeft afgemeld wordt overgeslagen; elk bericht krijgt een</w:t>
+      </w:r>
+      <w:r>
+        <w:rPr>
+          <w:lang w:val="nl"/>
+        </w:rPr>
+        <w:t xml:space="preserve"> </w:t>
+      </w:r>
+      <w:r>
+        <w:rPr>
+          <w:lang w:val="nl"/>
+        </w:rPr>
+        <w:t xml:space="preserve">afmeldregel.</w:t>
+      </w:r>
+    </w:p>
+    <w:p>
+      <w:pPr>
+        <w:pStyle w:val="Compact"/>
+        <w:numPr>
+          <w:ilvl w:val="0"/>
+          <w:numId w:val="1070"/>
+        </w:numPr>
+      </w:pPr>
+      <w:r>
+        <w:rPr>
+          <w:b/>
+          <w:bCs/>
+          <w:lang w:val="nl"/>
+        </w:rPr>
+        <w:t xml:space="preserve">Bericht</w:t>
       </w:r>
       <w:r>
         <w:rPr>
@@ -32273,7 +32525,19 @@
         <w:rPr>
           <w:lang w:val="nl"/>
         </w:rPr>
-        <w:t xml:space="preserve">staan en vul in:</w:t>
+        <w:t xml:space="preserve">staan. Je ziet</w:t>
+      </w:r>
+      <w:r>
+        <w:rPr>
+          <w:lang w:val="nl"/>
+        </w:rPr>
+        <w:t xml:space="preserve"> </w:t>
+      </w:r>
+      <w:r>
+        <w:rPr>
+          <w:lang w:val="nl"/>
+        </w:rPr>
+        <w:t xml:space="preserve">alleen de velden die bij je keuze horen:</w:t>
       </w:r>
     </w:p>
     <w:p>
@@ -32290,13 +32554,179 @@
           <w:bCs/>
           <w:lang w:val="nl"/>
         </w:rPr>
-        <w:t xml:space="preserve">Onderwerp (e-mail)</w:t>
-      </w:r>
-      <w:r>
-        <w:rPr>
-          <w:lang w:val="nl"/>
-        </w:rPr>
-        <w:t xml:space="preserve">;</w:t>
+        <w:t xml:space="preserve">Tekst voor WhatsApp en sms</w:t>
+      </w:r>
+      <w:r>
+        <w:rPr>
+          <w:lang w:val="nl"/>
+        </w:rPr>
+        <w:t xml:space="preserve"> </w:t>
+      </w:r>
+      <w:r>
+        <w:rPr>
+          <w:lang w:val="nl"/>
+        </w:rPr>
+        <w:t xml:space="preserve">(tot 1000 tekens). De knoppen zetten opmaak zoals WhatsApp die</w:t>
+      </w:r>
+      <w:r>
+        <w:rPr>
+          <w:lang w:val="nl"/>
+        </w:rPr>
+        <w:t xml:space="preserve"> </w:t>
+      </w:r>
+      <w:r>
+        <w:rPr>
+          <w:lang w:val="nl"/>
+        </w:rPr>
+        <w:t xml:space="preserve">kent:</w:t>
+      </w:r>
+      <w:r>
+        <w:rPr>
+          <w:lang w:val="nl"/>
+        </w:rPr>
+        <w:t xml:space="preserve"> </w:t>
+      </w:r>
+      <w:r>
+        <w:rPr>
+          <w:b/>
+          <w:bCs/>
+          <w:lang w:val="nl"/>
+        </w:rPr>
+        <w:t xml:space="preserve">B</w:t>
+      </w:r>
+      <w:r>
+        <w:rPr>
+          <w:lang w:val="nl"/>
+        </w:rPr>
+        <w:t xml:space="preserve"> </w:t>
+      </w:r>
+      <w:r>
+        <w:rPr>
+          <w:lang w:val="nl"/>
+        </w:rPr>
+        <w:t xml:space="preserve">voor *vet*,</w:t>
+      </w:r>
+      <w:r>
+        <w:rPr>
+          <w:lang w:val="nl"/>
+        </w:rPr>
+        <w:t xml:space="preserve"> </w:t>
+      </w:r>
+      <w:r>
+        <w:rPr>
+          <w:b/>
+          <w:bCs/>
+          <w:lang w:val="nl"/>
+        </w:rPr>
+        <w:t xml:space="preserve">I</w:t>
+      </w:r>
+      <w:r>
+        <w:rPr>
+          <w:lang w:val="nl"/>
+        </w:rPr>
+        <w:t xml:space="preserve"> </w:t>
+      </w:r>
+      <w:r>
+        <w:rPr>
+          <w:lang w:val="nl"/>
+        </w:rPr>
+        <w:t xml:space="preserve">voor _cursief_,</w:t>
+      </w:r>
+      <w:r>
+        <w:rPr>
+          <w:lang w:val="nl"/>
+        </w:rPr>
+        <w:t xml:space="preserve"> </w:t>
+      </w:r>
+      <w:r>
+        <w:rPr>
+          <w:b/>
+          <w:bCs/>
+          <w:lang w:val="nl"/>
+        </w:rPr>
+        <w:t xml:space="preserve">S</w:t>
+      </w:r>
+      <w:r>
+        <w:rPr>
+          <w:lang w:val="nl"/>
+        </w:rPr>
+        <w:t xml:space="preserve"> </w:t>
+      </w:r>
+      <w:r>
+        <w:rPr>
+          <w:lang w:val="nl"/>
+        </w:rPr>
+        <w:t xml:space="preserve">voor ~doorgehaald~,</w:t>
+      </w:r>
+      <w:r>
+        <w:rPr>
+          <w:lang w:val="nl"/>
+        </w:rPr>
+        <w:t xml:space="preserve"> </w:t>
+      </w:r>
+      <w:r>
+        <w:rPr>
+          <w:b/>
+          <w:bCs/>
+          <w:lang w:val="nl"/>
+        </w:rPr>
+        <w:t xml:space="preserve">Lijst</w:t>
+      </w:r>
+      <w:r>
+        <w:rPr>
+          <w:lang w:val="nl"/>
+        </w:rPr>
+        <w:t xml:space="preserve"> </w:t>
+      </w:r>
+      <w:r>
+        <w:rPr>
+          <w:lang w:val="nl"/>
+        </w:rPr>
+        <w:t xml:space="preserve">voor regels met</w:t>
+      </w:r>
+      <w:r>
+        <w:rPr>
+          <w:lang w:val="nl"/>
+        </w:rPr>
+        <w:t xml:space="preserve"> </w:t>
+      </w:r>
+      <w:r>
+        <w:rPr>
+          <w:lang w:val="nl"/>
+        </w:rPr>
+        <w:t xml:space="preserve">een streepje, en</w:t>
+      </w:r>
+      <w:r>
+        <w:rPr>
+          <w:lang w:val="nl"/>
+        </w:rPr>
+        <w:t xml:space="preserve"> </w:t>
+      </w:r>
+      <w:r>
+        <w:rPr>
+          <w:b/>
+          <w:bCs/>
+          <w:lang w:val="nl"/>
+        </w:rPr>
+        <w:t xml:space="preserve">Link portaal</w:t>
+      </w:r>
+      <w:r>
+        <w:rPr>
+          <w:lang w:val="nl"/>
+        </w:rPr>
+        <w:t xml:space="preserve">. Sms toont geen opmaak; die tekens halen we daar weg. Onder het</w:t>
+      </w:r>
+      <w:r>
+        <w:rPr>
+          <w:lang w:val="nl"/>
+        </w:rPr>
+        <w:t xml:space="preserve"> </w:t>
+      </w:r>
+      <w:r>
+        <w:rPr>
+          <w:lang w:val="nl"/>
+        </w:rPr>
+        <w:t xml:space="preserve">veld staan het aantal tekens en sms-delen, en een voorbeeld zoals het in WhatsApp aankomt.</w:t>
       </w:r>
     </w:p>
     <w:p>
@@ -32309,23 +32739,81 @@
       </w:pPr>
       <w:r>
         <w:rPr>
-          <w:b/>
-          <w:bCs/>
-          <w:lang w:val="nl"/>
-        </w:rPr>
-        <w:t xml:space="preserve">Hero-titel</w:t>
-      </w:r>
-      <w:r>
-        <w:rPr>
-          <w:lang w:val="nl"/>
-        </w:rPr>
-        <w:t xml:space="preserve"> </w:t>
-      </w:r>
-      <w:r>
-        <w:rPr>
-          <w:lang w:val="nl"/>
-        </w:rPr>
-        <w:t xml:space="preserve">(optioneel, de grote tekst bovenin);</w:t>
+          <w:lang w:val="nl"/>
+        </w:rPr>
+        <w:t xml:space="preserve">Bij e-mail:</w:t>
+      </w:r>
+      <w:r>
+        <w:rPr>
+          <w:lang w:val="nl"/>
+        </w:rPr>
+        <w:t xml:space="preserve"> </w:t>
+      </w:r>
+      <w:r>
+        <w:rPr>
+          <w:b/>
+          <w:bCs/>
+          <w:lang w:val="nl"/>
+        </w:rPr>
+        <w:t xml:space="preserve">Onderwerp van de e-mail</w:t>
+      </w:r>
+      <w:r>
+        <w:rPr>
+          <w:lang w:val="nl"/>
+        </w:rPr>
+        <w:t xml:space="preserve">, de</w:t>
+      </w:r>
+      <w:r>
+        <w:rPr>
+          <w:lang w:val="nl"/>
+        </w:rPr>
+        <w:t xml:space="preserve"> </w:t>
+      </w:r>
+      <w:r>
+        <w:rPr>
+          <w:b/>
+          <w:bCs/>
+          <w:lang w:val="nl"/>
+        </w:rPr>
+        <w:t xml:space="preserve">E-mailtekst</w:t>
+      </w:r>
+      <w:r>
+        <w:rPr>
+          <w:lang w:val="nl"/>
+        </w:rPr>
+        <w:t xml:space="preserve"> </w:t>
+      </w:r>
+      <w:r>
+        <w:rPr>
+          <w:lang w:val="nl"/>
+        </w:rPr>
+        <w:t xml:space="preserve">in de editor en onder</w:t>
+      </w:r>
+      <w:r>
+        <w:rPr>
+          <w:lang w:val="nl"/>
+        </w:rPr>
+        <w:t xml:space="preserve"> </w:t>
+      </w:r>
+      <w:r>
+        <w:rPr>
+          <w:b/>
+          <w:bCs/>
+          <w:lang w:val="nl"/>
+        </w:rPr>
+        <w:t xml:space="preserve">Meer opties</w:t>
+      </w:r>
+      <w:r>
+        <w:rPr>
+          <w:lang w:val="nl"/>
+        </w:rPr>
+        <w:t xml:space="preserve"> </w:t>
+      </w:r>
+      <w:r>
+        <w:rPr>
+          <w:lang w:val="nl"/>
+        </w:rPr>
+        <w:t xml:space="preserve">een grote titel bovenin.</w:t>
       </w:r>
     </w:p>
     <w:p>
@@ -32342,19 +32830,37 @@
           <w:bCs/>
           <w:lang w:val="nl"/>
         </w:rPr>
-        <w:t xml:space="preserve">Bericht (e-mail)</w:t>
-      </w:r>
-      <w:r>
-        <w:rPr>
-          <w:lang w:val="nl"/>
-        </w:rPr>
-        <w:t xml:space="preserve"> </w:t>
-      </w:r>
-      <w:r>
-        <w:rPr>
-          <w:lang w:val="nl"/>
-        </w:rPr>
-        <w:t xml:space="preserve">in de editor;</w:t>
+        <w:t xml:space="preserve">Variabele invoegen</w:t>
+      </w:r>
+      <w:r>
+        <w:rPr>
+          <w:lang w:val="nl"/>
+        </w:rPr>
+        <w:t xml:space="preserve">: alle variabelen, per groep (sollicitant, seizoen, selectiedag,</w:t>
+      </w:r>
+      <w:r>
+        <w:rPr>
+          <w:lang w:val="nl"/>
+        </w:rPr>
+        <w:t xml:space="preserve"> </w:t>
+      </w:r>
+      <w:r>
+        <w:rPr>
+          <w:lang w:val="nl"/>
+        </w:rPr>
+        <w:t xml:space="preserve">trainingsweekend, links en contact) en doorzoekbaar. Een klik zet de variabele in het veld waar</w:t>
+      </w:r>
+      <w:r>
+        <w:rPr>
+          <w:lang w:val="nl"/>
+        </w:rPr>
+        <w:t xml:space="preserve"> </w:t>
+      </w:r>
+      <w:r>
+        <w:rPr>
+          <w:lang w:val="nl"/>
+        </w:rPr>
+        <w:t xml:space="preserve">je het laatst typte. Is een waarde onbekend, dan blijft die plek leeg.</w:t>
       </w:r>
     </w:p>
     <w:p>
@@ -32371,41 +32877,6 @@
           <w:bCs/>
           <w:lang w:val="nl"/>
         </w:rPr>
-        <w:t xml:space="preserve">Korte tekst (WhatsApp/sms)</w:t>
-      </w:r>
-      <w:r>
-        <w:rPr>
-          <w:lang w:val="nl"/>
-        </w:rPr>
-        <w:t xml:space="preserve">: platte tekst, maximaal 400 tekens, verplicht als je een kort</w:t>
-      </w:r>
-      <w:r>
-        <w:rPr>
-          <w:lang w:val="nl"/>
-        </w:rPr>
-        <w:t xml:space="preserve"> </w:t>
-      </w:r>
-      <w:r>
-        <w:rPr>
-          <w:lang w:val="nl"/>
-        </w:rPr>
-        <w:t xml:space="preserve">kanaal kiest;</w:t>
-      </w:r>
-    </w:p>
-    <w:p>
-      <w:pPr>
-        <w:pStyle w:val="Compact"/>
-        <w:numPr>
-          <w:ilvl w:val="1"/>
-          <w:numId w:val="1071"/>
-        </w:numPr>
-      </w:pPr>
-      <w:r>
-        <w:rPr>
-          <w:b/>
-          <w:bCs/>
-          <w:lang w:val="nl"/>
-        </w:rPr>
         <w:t xml:space="preserve">Bijlagen</w:t>
       </w:r>
       <w:r>
@@ -32430,7 +32901,7 @@
         <w:rPr>
           <w:lang w:val="nl"/>
         </w:rPr>
-        <w:t xml:space="preserve">(standaard 15 MB) wordt een bijlage een downloadknop. Bij WhatsApp en SMS krijgt de</w:t>
+        <w:t xml:space="preserve">(standaard 15 MB) wordt een bijlage een downloadknop. Bij WhatsApp en sms krijgt de</w:t>
       </w:r>
       <w:r>
         <w:rPr>
@@ -32497,203 +32968,69 @@
           <w:bCs/>
           <w:lang w:val="nl"/>
         </w:rPr>
-        <w:t xml:space="preserve">Aan</w:t>
-      </w:r>
-      <w:r>
-        <w:rPr>
-          <w:lang w:val="nl"/>
-        </w:rPr>
-        <w:t xml:space="preserve">: typ een naam in het zoekveld, of klik op een snelknop zoals</w:t>
-      </w:r>
-      <w:r>
-        <w:rPr>
-          <w:lang w:val="nl"/>
-        </w:rPr>
-        <w:t xml:space="preserve"> </w:t>
-      </w:r>
-      <w:r>
-        <w:rPr>
-          <w:b/>
-          <w:bCs/>
-          <w:lang w:val="nl"/>
-        </w:rPr>
-        <w:t xml:space="preserve">+ Aangemeld (12)</w:t>
-      </w:r>
-      <w:r>
-        <w:rPr>
-          <w:lang w:val="nl"/>
-        </w:rPr>
-        <w:t xml:space="preserve"> </w:t>
-      </w:r>
-      <w:r>
-        <w:rPr>
-          <w:lang w:val="nl"/>
-        </w:rPr>
-        <w:t xml:space="preserve">of</w:t>
-      </w:r>
-      <w:r>
-        <w:rPr>
-          <w:lang w:val="nl"/>
-        </w:rPr>
-        <w:t xml:space="preserve"> </w:t>
-      </w:r>
-      <w:r>
-        <w:rPr>
-          <w:b/>
-          <w:bCs/>
-          <w:lang w:val="nl"/>
-        </w:rPr>
-        <w:t xml:space="preserve">+ Seintje gevraagd (4)</w:t>
-      </w:r>
-      <w:r>
-        <w:rPr>
-          <w:lang w:val="nl"/>
-        </w:rPr>
-        <w:t xml:space="preserve">.</w:t>
-      </w:r>
-      <w:r>
-        <w:rPr>
-          <w:lang w:val="nl"/>
-        </w:rPr>
-        <w:t xml:space="preserve"> </w:t>
-      </w:r>
-      <w:r>
-        <w:rPr>
-          <w:b/>
-          <w:bCs/>
-          <w:lang w:val="nl"/>
-        </w:rPr>
-        <w:t xml:space="preserve">Alles</w:t>
-      </w:r>
-      <w:r>
-        <w:rPr>
-          <w:lang w:val="nl"/>
-        </w:rPr>
-        <w:t xml:space="preserve"> </w:t>
-      </w:r>
-      <w:r>
-        <w:rPr>
-          <w:lang w:val="nl"/>
-        </w:rPr>
-        <w:t xml:space="preserve">en</w:t>
-      </w:r>
-      <w:r>
-        <w:rPr>
-          <w:lang w:val="nl"/>
-        </w:rPr>
-        <w:t xml:space="preserve"> </w:t>
-      </w:r>
-      <w:r>
-        <w:rPr>
-          <w:b/>
-          <w:bCs/>
-          <w:lang w:val="nl"/>
-        </w:rPr>
-        <w:t xml:space="preserve">Geen</w:t>
-      </w:r>
-      <w:r>
-        <w:rPr>
-          <w:lang w:val="nl"/>
-        </w:rPr>
-        <w:t xml:space="preserve"> </w:t>
-      </w:r>
-      <w:r>
-        <w:rPr>
-          <w:lang w:val="nl"/>
-        </w:rPr>
-        <w:t xml:space="preserve">zetten de hele lijst aan of uit. Onder</w:t>
-      </w:r>
-      <w:r>
-        <w:rPr>
-          <w:lang w:val="nl"/>
-        </w:rPr>
-        <w:t xml:space="preserve"> </w:t>
-      </w:r>
-      <w:r>
-        <w:rPr>
-          <w:b/>
-          <w:bCs/>
-          <w:lang w:val="nl"/>
-        </w:rPr>
-        <w:t xml:space="preserve">Of</w:t>
-      </w:r>
-      <w:r>
-        <w:rPr>
-          <w:b/>
-          <w:bCs/>
-          <w:lang w:val="nl"/>
-        </w:rPr>
-        <w:t xml:space="preserve"> </w:t>
-      </w:r>
-      <w:r>
-        <w:rPr>
-          <w:b/>
-          <w:bCs/>
-          <w:lang w:val="nl"/>
-        </w:rPr>
-        <w:t xml:space="preserve">kies uit de volledige lijst</w:t>
-      </w:r>
-      <w:r>
-        <w:rPr>
-          <w:lang w:val="nl"/>
-        </w:rPr>
-        <w:t xml:space="preserve"> </w:t>
-      </w:r>
-      <w:r>
-        <w:rPr>
-          <w:lang w:val="nl"/>
-        </w:rPr>
-        <w:t xml:space="preserve">staan alle sollicitanten van het seizoen per fase, met een vinkje</w:t>
-      </w:r>
-      <w:r>
-        <w:rPr>
-          <w:lang w:val="nl"/>
-        </w:rPr>
-        <w:t xml:space="preserve"> </w:t>
-      </w:r>
-      <w:r>
-        <w:rPr>
-          <w:lang w:val="nl"/>
-        </w:rPr>
-        <w:t xml:space="preserve">voor de hele fase. Bij elke naam staan het e-mailadres en het kanaal ("WhatsApp", "sms",</w:t>
-      </w:r>
-      <w:r>
-        <w:rPr>
-          <w:lang w:val="nl"/>
-        </w:rPr>
-        <w:t xml:space="preserve"> </w:t>
-      </w:r>
-      <w:r>
-        <w:rPr>
-          <w:lang w:val="nl"/>
-        </w:rPr>
-        <w:t xml:space="preserve">"alleen e-mail" of "geen telefoon"), en eventueel het label "afgemeld". Kom je via</w:t>
-      </w:r>
-      <w:r>
-        <w:rPr>
-          <w:lang w:val="nl"/>
-        </w:rPr>
-        <w:t xml:space="preserve"> </w:t>
-      </w:r>
-      <w:r>
-        <w:rPr>
-          <w:b/>
-          <w:bCs/>
-          <w:lang w:val="nl"/>
-        </w:rPr>
-        <w:t xml:space="preserve">Bericht</w:t>
-      </w:r>
-      <w:r>
-        <w:rPr>
-          <w:lang w:val="nl"/>
-        </w:rPr>
-        <w:t xml:space="preserve"> </w:t>
-      </w:r>
-      <w:r>
-        <w:rPr>
-          <w:lang w:val="nl"/>
-        </w:rPr>
-        <w:t xml:space="preserve">in een dossier of via een bulkactie, dan staan die mensen al aangevinkt.</w:t>
+        <w:t xml:space="preserve">Voorbeeld</w:t>
+      </w:r>
+      <w:r>
+        <w:rPr>
+          <w:lang w:val="nl"/>
+        </w:rPr>
+        <w:t xml:space="preserve"> </w:t>
+      </w:r>
+      <w:r>
+        <w:rPr>
+          <w:lang w:val="nl"/>
+        </w:rPr>
+        <w:t xml:space="preserve">toont de e-mail en de korte tekst zoals de eerste aangevinkte ontvanger ze krijgt</w:t>
+      </w:r>
+      <w:r>
+        <w:rPr>
+          <w:lang w:val="nl"/>
+        </w:rPr>
+        <w:t xml:space="preserve"> </w:t>
+      </w:r>
+      <w:r>
+        <w:rPr>
+          <w:lang w:val="nl"/>
+        </w:rPr>
+        <w:t xml:space="preserve">(zonder ontvanger met voorbeeldnaam Lieke de Vries).</w:t>
+      </w:r>
+      <w:r>
+        <w:rPr>
+          <w:lang w:val="nl"/>
+        </w:rPr>
+        <w:t xml:space="preserve"> </w:t>
+      </w:r>
+      <w:r>
+        <w:rPr>
+          <w:b/>
+          <w:bCs/>
+          <w:lang w:val="nl"/>
+        </w:rPr>
+        <w:t xml:space="preserve">Testmail naar mij</w:t>
+      </w:r>
+      <w:r>
+        <w:rPr>
+          <w:lang w:val="nl"/>
+        </w:rPr>
+        <w:t xml:space="preserve"> </w:t>
+      </w:r>
+      <w:r>
+        <w:rPr>
+          <w:lang w:val="nl"/>
+        </w:rPr>
+        <w:t xml:space="preserve">gaat altijd per e-mail</w:t>
+      </w:r>
+      <w:r>
+        <w:rPr>
+          <w:lang w:val="nl"/>
+        </w:rPr>
+        <w:t xml:space="preserve"> </w:t>
+      </w:r>
+      <w:r>
+        <w:rPr>
+          <w:lang w:val="nl"/>
+        </w:rPr>
+        <w:t xml:space="preserve">naar je eigen adres.</w:t>
       </w:r>
     </w:p>
     <w:p>
@@ -32706,65 +33043,6 @@
       </w:pPr>
       <w:r>
         <w:rPr>
-          <w:b/>
-          <w:bCs/>
-          <w:lang w:val="nl"/>
-        </w:rPr>
-        <w:t xml:space="preserve">Variabelen</w:t>
-      </w:r>
-      <w:r>
-        <w:rPr>
-          <w:lang w:val="nl"/>
-        </w:rPr>
-        <w:t xml:space="preserve">: klik op een chip om hem in de e-mailtekst te zetten: voornaam, achternaam,</w:t>
-      </w:r>
-      <w:r>
-        <w:rPr>
-          <w:lang w:val="nl"/>
-        </w:rPr>
-        <w:t xml:space="preserve"> </w:t>
-      </w:r>
-      <w:r>
-        <w:rPr>
-          <w:lang w:val="nl"/>
-        </w:rPr>
-        <w:t xml:space="preserve">volledige_naam, seizoen_naam, selectiedag_datum, selectiedag_locatie, tw_datum_start,</w:t>
-      </w:r>
-      <w:r>
-        <w:rPr>
-          <w:lang w:val="nl"/>
-        </w:rPr>
-        <w:t xml:space="preserve"> </w:t>
-      </w:r>
-      <w:r>
-        <w:rPr>
-          <w:lang w:val="nl"/>
-        </w:rPr>
-        <w:t xml:space="preserve">tw_locatie, portaal_url, aanmeld_url en bestuur_email. In het onderwerp en de korte tekst typ</w:t>
-      </w:r>
-      <w:r>
-        <w:rPr>
-          <w:lang w:val="nl"/>
-        </w:rPr>
-        <w:t xml:space="preserve"> </w:t>
-      </w:r>
-      <w:r>
-        <w:rPr>
-          <w:lang w:val="nl"/>
-        </w:rPr>
-        <w:t xml:space="preserve">je ze zelf, bijvoorbeeld {{voornaam}}. {{aanmeld_url}} is de link naar het aanmeldformulier.</w:t>
-      </w:r>
-    </w:p>
-    <w:p>
-      <w:pPr>
-        <w:pStyle w:val="Compact"/>
-        <w:numPr>
-          <w:ilvl w:val="0"/>
-          <w:numId w:val="1070"/>
-        </w:numPr>
-      </w:pPr>
-      <w:r>
-        <w:rPr>
           <w:lang w:val="nl"/>
         </w:rPr>
         <w:t xml:space="preserve">Klik op</w:t>
@@ -32781,88 +33059,6 @@
           <w:bCs/>
           <w:lang w:val="nl"/>
         </w:rPr>
-        <w:t xml:space="preserve">Voorbeeld bekijken</w:t>
-      </w:r>
-      <w:r>
-        <w:rPr>
-          <w:lang w:val="nl"/>
-        </w:rPr>
-        <w:t xml:space="preserve">. Je ziet de e-mail en de korte tekst zoals de eerste aangevinkte</w:t>
-      </w:r>
-      <w:r>
-        <w:rPr>
-          <w:lang w:val="nl"/>
-        </w:rPr>
-        <w:t xml:space="preserve"> </w:t>
-      </w:r>
-      <w:r>
-        <w:rPr>
-          <w:lang w:val="nl"/>
-        </w:rPr>
-        <w:t xml:space="preserve">ontvanger ze krijgt (zonder ontvanger met voorbeeldnaam Lieke de Vries).</w:t>
-      </w:r>
-    </w:p>
-    <w:p>
-      <w:pPr>
-        <w:pStyle w:val="Compact"/>
-        <w:numPr>
-          <w:ilvl w:val="0"/>
-          <w:numId w:val="1070"/>
-        </w:numPr>
-      </w:pPr>
-      <w:r>
-        <w:rPr>
-          <w:lang w:val="nl"/>
-        </w:rPr>
-        <w:t xml:space="preserve">Klik eventueel op</w:t>
-      </w:r>
-      <w:r>
-        <w:rPr>
-          <w:lang w:val="nl"/>
-        </w:rPr>
-        <w:t xml:space="preserve"> </w:t>
-      </w:r>
-      <w:r>
-        <w:rPr>
-          <w:b/>
-          <w:bCs/>
-          <w:lang w:val="nl"/>
-        </w:rPr>
-        <w:t xml:space="preserve">Testmail naar mijzelf</w:t>
-      </w:r>
-      <w:r>
-        <w:rPr>
-          <w:lang w:val="nl"/>
-        </w:rPr>
-        <w:t xml:space="preserve">. Die gaat altijd per e-mail naar je eigen adres.</w:t>
-      </w:r>
-    </w:p>
-    <w:p>
-      <w:pPr>
-        <w:pStyle w:val="Compact"/>
-        <w:numPr>
-          <w:ilvl w:val="0"/>
-          <w:numId w:val="1070"/>
-        </w:numPr>
-      </w:pPr>
-      <w:r>
-        <w:rPr>
-          <w:lang w:val="nl"/>
-        </w:rPr>
-        <w:t xml:space="preserve">Klik op</w:t>
-      </w:r>
-      <w:r>
-        <w:rPr>
-          <w:lang w:val="nl"/>
-        </w:rPr>
-        <w:t xml:space="preserve"> </w:t>
-      </w:r>
-      <w:r>
-        <w:rPr>
-          <w:b/>
-          <w:bCs/>
-          <w:lang w:val="nl"/>
-        </w:rPr>
         <w:t xml:space="preserve">Versturen naar N personen</w:t>
       </w:r>
       <w:r>
@@ -32875,7 +33071,19 @@
         <w:rPr>
           <w:lang w:val="nl"/>
         </w:rPr>
-        <w:t xml:space="preserve">en bevestig met</w:t>
+        <w:t xml:space="preserve">(op een telefoon blijft die knop onderin staan) en bevestig</w:t>
+      </w:r>
+      <w:r>
+        <w:rPr>
+          <w:lang w:val="nl"/>
+        </w:rPr>
+        <w:t xml:space="preserve"> </w:t>
+      </w:r>
+      <w:r>
+        <w:rPr>
+          <w:lang w:val="nl"/>
+        </w:rPr>
+        <w:t xml:space="preserve">met</w:t>
       </w:r>
       <w:r>
         <w:rPr>
@@ -32895,13 +33103,14 @@
         <w:rPr>
           <w:lang w:val="nl"/>
         </w:rPr>
-        <w:t xml:space="preserve">.</w:t>
-      </w:r>
-    </w:p>
-    <w:p>
-      <w:pPr>
-        <w:pStyle w:val="FirstParagraph"/>
-      </w:pPr>
+        <w:t xml:space="preserve">. De bevestiging noemt ook hoeveel mensen het per e-mail krijgen.</w:t>
+      </w:r>
+      <w:r>
+        <w:rPr>
+          <w:lang w:val="nl"/>
+        </w:rPr>
+        <w:t xml:space="preserve"> </w:t>
+      </w:r>
       <w:r>
         <w:rPr>
           <w:lang w:val="nl"/>

</xml_diff>

<commit_message>
2.139.0: beschikbaarheid met dagweergave, liever vrij, filters en sorteren
includes/beheer/beschikbaarheid.php: filters van/tot/min/lv/sort/weergave, bh_besch_weken_bereik()
(ook over de jaargrens; dagweergave standaard twee weken), bh_besch_liever_vrij() (één query),
bh_besch_liever_tekst(), bh_besch_dagen() (uit beschikbaarheid_per_dag, alleen in de dagweergave),
dagen_totaal en sortering in bh_besch_raster(). Export: kolom Liever vrij en de nieuwe filters in de
uitleg. _dekkinggrafiek.php kan inklappen ($_klap) en is een echte kaart (bh-kaart bestond niet).
Scherm: voorlopig ingeklapt, filterbalk v2 met weergave/sorteren/meer, exportmenu, kolom Liever
vrij + "N lv" in de cel, dagraster.
</commit_message>
<xml_diff>
--- a/docs/handleiding/word/handleiding_beheer.docx
+++ b/docs/handleiding/word/handleiding_beheer.docx
@@ -27079,19 +27079,19 @@
         <w:rPr>
           <w:lang w:val="nl"/>
         </w:rPr>
-        <w:t xml:space="preserve">(alleen als die er zijn): wie de beschikbaarheid nog niet</w:t>
-      </w:r>
-      <w:r>
-        <w:rPr>
-          <w:lang w:val="nl"/>
-        </w:rPr>
-        <w:t xml:space="preserve"> </w:t>
-      </w:r>
-      <w:r>
-        <w:rPr>
-          <w:lang w:val="nl"/>
-        </w:rPr>
-        <w:t xml:space="preserve">definitief heeft gemaakt. Er staat de deadline bij, met het aantal dagen dat nog rest of</w:t>
+        <w:t xml:space="preserve">(alleen als die er zijn, ingeklapt): wie de beschikbaarheid nog niet</w:t>
+      </w:r>
+      <w:r>
+        <w:rPr>
+          <w:lang w:val="nl"/>
+        </w:rPr>
+        <w:t xml:space="preserve"> </w:t>
+      </w:r>
+      <w:r>
+        <w:rPr>
+          <w:lang w:val="nl"/>
+        </w:rPr>
+        <w:t xml:space="preserve">definitief heeft gemaakt. In de kop staat de deadline, met het aantal dagen dat nog rest of</w:t>
       </w:r>
       <w:r>
         <w:rPr>
@@ -27115,7 +27115,7 @@
         <w:rPr>
           <w:lang w:val="nl"/>
         </w:rPr>
-        <w:t xml:space="preserve">hoeft ze niet zelf na te bellen. Met het envelopje bij een naam mail je iemand direct.</w:t>
+        <w:t xml:space="preserve">hoeft ze niet zelf na te bellen. Klap open voor de namen; met het envelopje mail je iemand direct.</w:t>
       </w:r>
     </w:p>
     <w:p>
@@ -27132,113 +27132,121 @@
           <w:bCs/>
           <w:lang w:val="nl"/>
         </w:rPr>
-        <w:t xml:space="preserve">Filters en export</w:t>
-      </w:r>
-      <w:r>
-        <w:rPr>
-          <w:lang w:val="nl"/>
-        </w:rPr>
-        <w:t xml:space="preserve">: zoek op naam, kies wie (iedereen, nog in de procedure, aangenomen), nieuw</w:t>
-      </w:r>
-      <w:r>
-        <w:rPr>
-          <w:lang w:val="nl"/>
-        </w:rPr>
-        <w:t xml:space="preserve"> </w:t>
-      </w:r>
-      <w:r>
-        <w:rPr>
-          <w:lang w:val="nl"/>
-        </w:rPr>
-        <w:t xml:space="preserve">of terugkerend, en toon alleen wie een open verzoek heeft of nog voorlopig is. Grafiek, raster</w:t>
-      </w:r>
-      <w:r>
-        <w:rPr>
-          <w:lang w:val="nl"/>
-        </w:rPr>
-        <w:t xml:space="preserve"> </w:t>
-      </w:r>
-      <w:r>
-        <w:rPr>
-          <w:lang w:val="nl"/>
-        </w:rPr>
-        <w:t xml:space="preserve">en totalen volgen de filter.</w:t>
-      </w:r>
-      <w:r>
-        <w:rPr>
-          <w:lang w:val="nl"/>
-        </w:rPr>
-        <w:t xml:space="preserve"> </w:t>
-      </w:r>
-      <w:r>
-        <w:rPr>
-          <w:b/>
-          <w:bCs/>
-          <w:lang w:val="nl"/>
-        </w:rPr>
-        <w:t xml:space="preserve">Export per week</w:t>
-      </w:r>
-      <w:r>
-        <w:rPr>
-          <w:lang w:val="nl"/>
-        </w:rPr>
-        <w:t xml:space="preserve"> </w:t>
-      </w:r>
-      <w:r>
-        <w:rPr>
-          <w:lang w:val="nl"/>
-        </w:rPr>
-        <w:t xml:space="preserve">geeft een Excel met per persoon per week het</w:t>
-      </w:r>
-      <w:r>
-        <w:rPr>
-          <w:lang w:val="nl"/>
-        </w:rPr>
-        <w:t xml:space="preserve"> </w:t>
-      </w:r>
-      <w:r>
-        <w:rPr>
-          <w:lang w:val="nl"/>
-        </w:rPr>
-        <w:t xml:space="preserve">aantal dagen;</w:t>
-      </w:r>
-      <w:r>
-        <w:rPr>
-          <w:lang w:val="nl"/>
-        </w:rPr>
-        <w:t xml:space="preserve"> </w:t>
-      </w:r>
-      <w:r>
-        <w:rPr>
-          <w:b/>
-          <w:bCs/>
-          <w:lang w:val="nl"/>
-        </w:rPr>
-        <w:t xml:space="preserve">Export per dag</w:t>
-      </w:r>
-      <w:r>
-        <w:rPr>
-          <w:lang w:val="nl"/>
-        </w:rPr>
-        <w:t xml:space="preserve"> </w:t>
-      </w:r>
-      <w:r>
-        <w:rPr>
-          <w:lang w:val="nl"/>
-        </w:rPr>
-        <w:t xml:space="preserve">per persoon per datum ja / nee / liever niet, met een tabblad</w:t>
-      </w:r>
-      <w:r>
-        <w:rPr>
-          <w:lang w:val="nl"/>
-        </w:rPr>
-        <w:t xml:space="preserve"> </w:t>
-      </w:r>
-      <w:r>
-        <w:rPr>
-          <w:lang w:val="nl"/>
-        </w:rPr>
-        <w:t xml:space="preserve">met de redenen. Beide exports volgen de filter en komen in het logboek.</w:t>
+        <w:t xml:space="preserve">Filters</w:t>
+      </w:r>
+      <w:r>
+        <w:rPr>
+          <w:lang w:val="nl"/>
+        </w:rPr>
+        <w:t xml:space="preserve">: zoek op naam, kies wie (iedereen, nog in de procedure, aangenomen), de</w:t>
+      </w:r>
+      <w:r>
+        <w:rPr>
+          <w:lang w:val="nl"/>
+        </w:rPr>
+        <w:t xml:space="preserve"> </w:t>
+      </w:r>
+      <w:r>
+        <w:rPr>
+          <w:b/>
+          <w:bCs/>
+          <w:lang w:val="nl"/>
+        </w:rPr>
+        <w:t xml:space="preserve">weergave</w:t>
+      </w:r>
+      <w:r>
+        <w:rPr>
+          <w:lang w:val="nl"/>
+        </w:rPr>
+        <w:t xml:space="preserve"> </w:t>
+      </w:r>
+      <w:r>
+        <w:rPr>
+          <w:lang w:val="nl"/>
+        </w:rPr>
+        <w:t xml:space="preserve">(per week of per dag) en de</w:t>
+      </w:r>
+      <w:r>
+        <w:rPr>
+          <w:lang w:val="nl"/>
+        </w:rPr>
+        <w:t xml:space="preserve"> </w:t>
+      </w:r>
+      <w:r>
+        <w:rPr>
+          <w:b/>
+          <w:bCs/>
+          <w:lang w:val="nl"/>
+        </w:rPr>
+        <w:t xml:space="preserve">sortering</w:t>
+      </w:r>
+      <w:r>
+        <w:rPr>
+          <w:lang w:val="nl"/>
+        </w:rPr>
+        <w:t xml:space="preserve"> </w:t>
+      </w:r>
+      <w:r>
+        <w:rPr>
+          <w:lang w:val="nl"/>
+        </w:rPr>
+        <w:t xml:space="preserve">(naam, meeste weken, meeste dagen, minste weken, laatst</w:t>
+      </w:r>
+      <w:r>
+        <w:rPr>
+          <w:lang w:val="nl"/>
+        </w:rPr>
+        <w:t xml:space="preserve"> </w:t>
+      </w:r>
+      <w:r>
+        <w:rPr>
+          <w:lang w:val="nl"/>
+        </w:rPr>
+        <w:t xml:space="preserve">aangemeld). Onder</w:t>
+      </w:r>
+      <w:r>
+        <w:rPr>
+          <w:lang w:val="nl"/>
+        </w:rPr>
+        <w:t xml:space="preserve"> </w:t>
+      </w:r>
+      <w:r>
+        <w:rPr>
+          <w:b/>
+          <w:bCs/>
+          <w:lang w:val="nl"/>
+        </w:rPr>
+        <w:t xml:space="preserve">Meer filters</w:t>
+      </w:r>
+      <w:r>
+        <w:rPr>
+          <w:lang w:val="nl"/>
+        </w:rPr>
+        <w:t xml:space="preserve">: een weekbereik (vanaf / tot en met), minimaal zoveel weken</w:t>
+      </w:r>
+      <w:r>
+        <w:rPr>
+          <w:lang w:val="nl"/>
+        </w:rPr>
+        <w:t xml:space="preserve"> </w:t>
+      </w:r>
+      <w:r>
+        <w:rPr>
+          <w:lang w:val="nl"/>
+        </w:rPr>
+        <w:t xml:space="preserve">beschikbaar, nieuw of terugkerend, alleen wie een open verzoek heeft of nog voorlopig is, en alleen</w:t>
+      </w:r>
+      <w:r>
+        <w:rPr>
+          <w:lang w:val="nl"/>
+        </w:rPr>
+        <w:t xml:space="preserve"> </w:t>
+      </w:r>
+      <w:r>
+        <w:rPr>
+          <w:lang w:val="nl"/>
+        </w:rPr>
+        <w:t xml:space="preserve">wie ergens liever vrij is. Grafiek, raster en totalen volgen de filter.</w:t>
       </w:r>
     </w:p>
     <w:p>
@@ -27255,73 +27263,204 @@
           <w:bCs/>
           <w:lang w:val="nl"/>
         </w:rPr>
+        <w:t xml:space="preserve">Exporteren</w:t>
+      </w:r>
+      <w:r>
+        <w:rPr>
+          <w:lang w:val="nl"/>
+        </w:rPr>
+        <w:t xml:space="preserve"> </w:t>
+      </w:r>
+      <w:r>
+        <w:rPr>
+          <w:lang w:val="nl"/>
+        </w:rPr>
+        <w:t xml:space="preserve">(menu rechts):</w:t>
+      </w:r>
+      <w:r>
+        <w:rPr>
+          <w:lang w:val="nl"/>
+        </w:rPr>
+        <w:t xml:space="preserve"> </w:t>
+      </w:r>
+      <w:r>
+        <w:rPr>
+          <w:b/>
+          <w:bCs/>
+          <w:lang w:val="nl"/>
+        </w:rPr>
+        <w:t xml:space="preserve">Excel per week</w:t>
+      </w:r>
+      <w:r>
+        <w:rPr>
+          <w:lang w:val="nl"/>
+        </w:rPr>
+        <w:t xml:space="preserve"> </w:t>
+      </w:r>
+      <w:r>
+        <w:rPr>
+          <w:lang w:val="nl"/>
+        </w:rPr>
+        <w:t xml:space="preserve">met per persoon per week het aantal dagen en een</w:t>
+      </w:r>
+      <w:r>
+        <w:rPr>
+          <w:lang w:val="nl"/>
+        </w:rPr>
+        <w:t xml:space="preserve"> </w:t>
+      </w:r>
+      <w:r>
+        <w:rPr>
+          <w:lang w:val="nl"/>
+        </w:rPr>
+        <w:t xml:space="preserve">kolom Liever vrij;</w:t>
+      </w:r>
+      <w:r>
+        <w:rPr>
+          <w:lang w:val="nl"/>
+        </w:rPr>
+        <w:t xml:space="preserve"> </w:t>
+      </w:r>
+      <w:r>
+        <w:rPr>
+          <w:b/>
+          <w:bCs/>
+          <w:lang w:val="nl"/>
+        </w:rPr>
+        <w:t xml:space="preserve">Excel per dag</w:t>
+      </w:r>
+      <w:r>
+        <w:rPr>
+          <w:lang w:val="nl"/>
+        </w:rPr>
+        <w:t xml:space="preserve"> </w:t>
+      </w:r>
+      <w:r>
+        <w:rPr>
+          <w:lang w:val="nl"/>
+        </w:rPr>
+        <w:t xml:space="preserve">per persoon per datum ja / nee / liever niet, met een tabblad</w:t>
+      </w:r>
+      <w:r>
+        <w:rPr>
+          <w:lang w:val="nl"/>
+        </w:rPr>
+        <w:t xml:space="preserve"> </w:t>
+      </w:r>
+      <w:r>
+        <w:rPr>
+          <w:lang w:val="nl"/>
+        </w:rPr>
+        <w:t xml:space="preserve">met de redenen; en, met de loonplanning aan, de</w:t>
+      </w:r>
+      <w:r>
+        <w:rPr>
+          <w:lang w:val="nl"/>
+        </w:rPr>
+        <w:t xml:space="preserve"> </w:t>
+      </w:r>
+      <w:r>
+        <w:rPr>
+          <w:b/>
+          <w:bCs/>
+          <w:lang w:val="nl"/>
+        </w:rPr>
+        <w:t xml:space="preserve">Export voor het rooster</w:t>
+      </w:r>
+      <w:r>
+        <w:rPr>
+          <w:lang w:val="nl"/>
+        </w:rPr>
+        <w:t xml:space="preserve">. De exports volgen de</w:t>
+      </w:r>
+      <w:r>
+        <w:rPr>
+          <w:lang w:val="nl"/>
+        </w:rPr>
+        <w:t xml:space="preserve"> </w:t>
+      </w:r>
+      <w:r>
+        <w:rPr>
+          <w:lang w:val="nl"/>
+        </w:rPr>
+        <w:t xml:space="preserve">filter en het weekbereik, en komen in het logboek.</w:t>
+      </w:r>
+    </w:p>
+    <w:p>
+      <w:pPr>
+        <w:pStyle w:val="Compact"/>
+        <w:numPr>
+          <w:ilvl w:val="0"/>
+          <w:numId w:val="1058"/>
+        </w:numPr>
+      </w:pPr>
+      <w:r>
+        <w:rPr>
+          <w:b/>
+          <w:bCs/>
+          <w:lang w:val="nl"/>
+        </w:rPr>
         <w:t xml:space="preserve">Dekking per week</w:t>
       </w:r>
       <w:r>
         <w:rPr>
           <w:lang w:val="nl"/>
         </w:rPr>
-        <w:t xml:space="preserve">: een staafgrafiek met per week het aantal mensen dat telt. In het</w:t>
-      </w:r>
-      <w:r>
-        <w:rPr>
-          <w:lang w:val="nl"/>
-        </w:rPr>
-        <w:t xml:space="preserve"> </w:t>
-      </w:r>
-      <w:r>
-        <w:rPr>
-          <w:lang w:val="nl"/>
-        </w:rPr>
-        <w:t xml:space="preserve">hoofdseizoen is dat het weektotaal. In het voor- en naseizoen zijn de posten alleen in het</w:t>
-      </w:r>
-      <w:r>
-        <w:rPr>
-          <w:lang w:val="nl"/>
-        </w:rPr>
-        <w:t xml:space="preserve"> </w:t>
-      </w:r>
-      <w:r>
-        <w:rPr>
-          <w:lang w:val="nl"/>
-        </w:rPr>
-        <w:t xml:space="preserve">weekend bemand, dus telt dan het aantal dat het weekend dekt. De norm is de optelsom van alle</w:t>
-      </w:r>
-      <w:r>
-        <w:rPr>
-          <w:lang w:val="nl"/>
-        </w:rPr>
-        <w:t xml:space="preserve"> </w:t>
-      </w:r>
-      <w:r>
-        <w:rPr>
-          <w:lang w:val="nl"/>
-        </w:rPr>
-        <w:t xml:space="preserve">rollen onder Instellingen › Posten &amp; bezetting. Rechtsboven staat in woorden welke weken onder</w:t>
-      </w:r>
-      <w:r>
-        <w:rPr>
-          <w:lang w:val="nl"/>
-        </w:rPr>
-        <w:t xml:space="preserve"> </w:t>
-      </w:r>
-      <w:r>
-        <w:rPr>
-          <w:lang w:val="nl"/>
-        </w:rPr>
-        <w:t xml:space="preserve">de norm zitten, of "Alle weken gedekt". Is er nog geen post ingesteld, dan staat er dat er geen</w:t>
-      </w:r>
-      <w:r>
-        <w:rPr>
-          <w:lang w:val="nl"/>
-        </w:rPr>
-        <w:t xml:space="preserve"> </w:t>
-      </w:r>
-      <w:r>
-        <w:rPr>
-          <w:lang w:val="nl"/>
-        </w:rPr>
-        <w:t xml:space="preserve">norm is.</w:t>
+        <w:t xml:space="preserve"> </w:t>
+      </w:r>
+      <w:r>
+        <w:rPr>
+          <w:lang w:val="nl"/>
+        </w:rPr>
+        <w:t xml:space="preserve">(ingeklapt; de kop zegt al "Alle weken gedekt" of welke weken te krap zijn):</w:t>
+      </w:r>
+      <w:r>
+        <w:rPr>
+          <w:lang w:val="nl"/>
+        </w:rPr>
+        <w:t xml:space="preserve"> </w:t>
+      </w:r>
+      <w:r>
+        <w:rPr>
+          <w:lang w:val="nl"/>
+        </w:rPr>
+        <w:t xml:space="preserve">een staafgrafiek met per week het aantal mensen dat telt. In het hoofdseizoen is dat het</w:t>
+      </w:r>
+      <w:r>
+        <w:rPr>
+          <w:lang w:val="nl"/>
+        </w:rPr>
+        <w:t xml:space="preserve"> </w:t>
+      </w:r>
+      <w:r>
+        <w:rPr>
+          <w:lang w:val="nl"/>
+        </w:rPr>
+        <w:t xml:space="preserve">weektotaal. In het voor- en naseizoen zijn de posten alleen in het weekend bemand, dus telt dan</w:t>
+      </w:r>
+      <w:r>
+        <w:rPr>
+          <w:lang w:val="nl"/>
+        </w:rPr>
+        <w:t xml:space="preserve"> </w:t>
+      </w:r>
+      <w:r>
+        <w:rPr>
+          <w:lang w:val="nl"/>
+        </w:rPr>
+        <w:t xml:space="preserve">het aantal dat het weekend dekt. De norm is de optelsom van alle rollen onder Instellingen ›</w:t>
+      </w:r>
+      <w:r>
+        <w:rPr>
+          <w:lang w:val="nl"/>
+        </w:rPr>
+        <w:t xml:space="preserve"> </w:t>
+      </w:r>
+      <w:r>
+        <w:rPr>
+          <w:lang w:val="nl"/>
+        </w:rPr>
+        <w:t xml:space="preserve">Posten &amp; bezetting. Is er nog geen post ingesteld, dan staat er dat er geen norm is.</w:t>
       </w:r>
     </w:p>
     <w:p>
@@ -27412,25 +27551,212 @@
           <w:bCs/>
           <w:lang w:val="nl"/>
         </w:rPr>
-        <w:t xml:space="preserve">Raster</w:t>
-      </w:r>
-      <w:r>
-        <w:rPr>
-          <w:lang w:val="nl"/>
-        </w:rPr>
-        <w:t xml:space="preserve">: een rij per sollicitant en een kolom per week van de werkperiode. De kolom "wkn"</w:t>
-      </w:r>
-      <w:r>
-        <w:rPr>
-          <w:lang w:val="nl"/>
-        </w:rPr>
-        <w:t xml:space="preserve"> </w:t>
-      </w:r>
-      <w:r>
-        <w:rPr>
-          <w:lang w:val="nl"/>
-        </w:rPr>
-        <w:t xml:space="preserve">telt het aantal beschikbare weken.</w:t>
+        <w:t xml:space="preserve">Raster per week</w:t>
+      </w:r>
+      <w:r>
+        <w:rPr>
+          <w:lang w:val="nl"/>
+        </w:rPr>
+        <w:t xml:space="preserve">: een rij per sollicitant en een kolom per week. De kolom "wkn" telt het aantal</w:t>
+      </w:r>
+      <w:r>
+        <w:rPr>
+          <w:lang w:val="nl"/>
+        </w:rPr>
+        <w:t xml:space="preserve"> </w:t>
+      </w:r>
+      <w:r>
+        <w:rPr>
+          <w:lang w:val="nl"/>
+        </w:rPr>
+        <w:t xml:space="preserve">beschikbare weken (wijs aan voor het aantal dagen). De kolom</w:t>
+      </w:r>
+      <w:r>
+        <w:rPr>
+          <w:lang w:val="nl"/>
+        </w:rPr>
+        <w:t xml:space="preserve"> </w:t>
+      </w:r>
+      <w:r>
+        <w:rPr>
+          <w:b/>
+          <w:bCs/>
+          <w:lang w:val="nl"/>
+        </w:rPr>
+        <w:t xml:space="preserve">Liever vrij</w:t>
+      </w:r>
+      <w:r>
+        <w:rPr>
+          <w:lang w:val="nl"/>
+        </w:rPr>
+        <w:t xml:space="preserve"> </w:t>
+      </w:r>
+      <w:r>
+        <w:rPr>
+          <w:lang w:val="nl"/>
+        </w:rPr>
+        <w:t xml:space="preserve">toont de vaste</w:t>
+      </w:r>
+      <w:r>
+        <w:rPr>
+          <w:lang w:val="nl"/>
+        </w:rPr>
+        <w:t xml:space="preserve"> </w:t>
+      </w:r>
+      <w:r>
+        <w:rPr>
+          <w:lang w:val="nl"/>
+        </w:rPr>
+        <w:t xml:space="preserve">weekdagen die iemand liever vrij heeft (paars, bijvoorbeeld "wo za") en het aantal losse datums;</w:t>
+      </w:r>
+      <w:r>
+        <w:rPr>
+          <w:lang w:val="nl"/>
+        </w:rPr>
+        <w:t xml:space="preserve"> </w:t>
+      </w:r>
+      <w:r>
+        <w:rPr>
+          <w:lang w:val="nl"/>
+        </w:rPr>
+        <w:t xml:space="preserve">wijs aan voor de datums.</w:t>
+      </w:r>
+    </w:p>
+    <w:p>
+      <w:pPr>
+        <w:pStyle w:val="Compact"/>
+        <w:numPr>
+          <w:ilvl w:val="0"/>
+          <w:numId w:val="1058"/>
+        </w:numPr>
+      </w:pPr>
+      <w:r>
+        <w:rPr>
+          <w:b/>
+          <w:bCs/>
+          <w:lang w:val="nl"/>
+        </w:rPr>
+        <w:t xml:space="preserve">Raster per dag</w:t>
+      </w:r>
+      <w:r>
+        <w:rPr>
+          <w:lang w:val="nl"/>
+        </w:rPr>
+        <w:t xml:space="preserve">: een rij per sollicitant en een kolom per dag, standaard deze en volgende week</w:t>
+      </w:r>
+      <w:r>
+        <w:rPr>
+          <w:lang w:val="nl"/>
+        </w:rPr>
+        <w:t xml:space="preserve"> </w:t>
+      </w:r>
+      <w:r>
+        <w:rPr>
+          <w:lang w:val="nl"/>
+        </w:rPr>
+        <w:t xml:space="preserve">(kies andere weken onder Meer filters).</w:t>
+      </w:r>
+      <w:r>
+        <w:rPr>
+          <w:lang w:val="nl"/>
+        </w:rPr>
+        <w:t xml:space="preserve"> </w:t>
+      </w:r>
+      <w:r>
+        <w:rPr>
+          <w:b/>
+          <w:bCs/>
+          <w:lang w:val="nl"/>
+        </w:rPr>
+        <w:t xml:space="preserve">ja</w:t>
+      </w:r>
+      <w:r>
+        <w:rPr>
+          <w:lang w:val="nl"/>
+        </w:rPr>
+        <w:t xml:space="preserve"> </w:t>
+      </w:r>
+      <w:r>
+        <w:rPr>
+          <w:lang w:val="nl"/>
+        </w:rPr>
+        <w:t xml:space="preserve">= kan,</w:t>
+      </w:r>
+      <w:r>
+        <w:rPr>
+          <w:lang w:val="nl"/>
+        </w:rPr>
+        <w:t xml:space="preserve"> </w:t>
+      </w:r>
+      <w:r>
+        <w:rPr>
+          <w:b/>
+          <w:bCs/>
+          <w:lang w:val="nl"/>
+        </w:rPr>
+        <w:t xml:space="preserve">lv</w:t>
+      </w:r>
+      <w:r>
+        <w:rPr>
+          <w:lang w:val="nl"/>
+        </w:rPr>
+        <w:t xml:space="preserve"> </w:t>
+      </w:r>
+      <w:r>
+        <w:rPr>
+          <w:lang w:val="nl"/>
+        </w:rPr>
+        <w:t xml:space="preserve">= liever niet,</w:t>
+      </w:r>
+      <w:r>
+        <w:rPr>
+          <w:lang w:val="nl"/>
+        </w:rPr>
+        <w:t xml:space="preserve"> </w:t>
+      </w:r>
+      <w:r>
+        <w:rPr>
+          <w:b/>
+          <w:bCs/>
+          <w:lang w:val="nl"/>
+        </w:rPr>
+        <w:t xml:space="preserve">—</w:t>
+      </w:r>
+      <w:r>
+        <w:rPr>
+          <w:lang w:val="nl"/>
+        </w:rPr>
+        <w:t xml:space="preserve"> </w:t>
+      </w:r>
+      <w:r>
+        <w:rPr>
+          <w:lang w:val="nl"/>
+        </w:rPr>
+        <w:t xml:space="preserve">= kan niet;</w:t>
+      </w:r>
+      <w:r>
+        <w:rPr>
+          <w:lang w:val="nl"/>
+        </w:rPr>
+        <w:t xml:space="preserve"> </w:t>
+      </w:r>
+      <w:r>
+        <w:rPr>
+          <w:lang w:val="nl"/>
+        </w:rPr>
+        <w:t xml:space="preserve">wijs een cel aan voor de reden. Het komt uit dezelfde bron als het rooster. Corrigeren doe je in</w:t>
+      </w:r>
+      <w:r>
+        <w:rPr>
+          <w:lang w:val="nl"/>
+        </w:rPr>
+        <w:t xml:space="preserve"> </w:t>
+      </w:r>
+      <w:r>
+        <w:rPr>
+          <w:lang w:val="nl"/>
+        </w:rPr>
+        <w:t xml:space="preserve">de weekweergave.</w:t>
       </w:r>
     </w:p>
     <w:p>
@@ -27441,7 +27767,7 @@
         <w:rPr>
           <w:lang w:val="nl"/>
         </w:rPr>
-        <w:t xml:space="preserve">Een cel in het raster betekent het volgende:</w:t>
+        <w:t xml:space="preserve">Een cel in het raster per week betekent het volgende:</w:t>
       </w:r>
     </w:p>
     <w:tbl>
@@ -27618,7 +27944,7 @@
               <w:rPr>
                 <w:lang w:val="nl"/>
               </w:rPr>
-              <w:t xml:space="preserve">—</w:t>
+              <w:t xml:space="preserve">"2 lv" klein eronder</w:t>
             </w:r>
           </w:p>
         </w:tc>
@@ -27632,6 +27958,36 @@
               <w:rPr>
                 <w:lang w:val="nl"/>
               </w:rPr>
+              <w:t xml:space="preserve">die week twee dagen liever vrij (een voorkeur, de planner beslist)</w:t>
+            </w:r>
+          </w:p>
+        </w:tc>
+      </w:tr>
+      <w:tr>
+        <w:tc>
+          <w:tcPr/>
+          <w:p>
+            <w:pPr>
+              <w:pStyle w:val="Compact"/>
+            </w:pPr>
+            <w:r>
+              <w:rPr>
+                <w:lang w:val="nl"/>
+              </w:rPr>
+              <w:t xml:space="preserve">—</w:t>
+            </w:r>
+          </w:p>
+        </w:tc>
+        <w:tc>
+          <w:tcPr/>
+          <w:p>
+            <w:pPr>
+              <w:pStyle w:val="Compact"/>
+            </w:pPr>
+            <w:r>
+              <w:rPr>
+                <w:lang w:val="nl"/>
+              </w:rPr>
               <w:t xml:space="preserve">niet beschikbaar</w:t>
             </w:r>
           </w:p>
@@ -27672,7 +28028,7 @@
         <w:rPr>
           <w:lang w:val="nl"/>
         </w:rPr>
-        <w:t xml:space="preserve">(terugkerende sollicitant), een oranje label</w:t>
+        <w:t xml:space="preserve">(terugkerende sollicitant) en een oranje label</w:t>
       </w:r>
       <w:r>
         <w:rPr>
@@ -27710,33 +28066,7 @@
         <w:rPr>
           <w:lang w:val="nl"/>
         </w:rPr>
-        <w:t xml:space="preserve">(afwijkende norm van dat aantal dagen per week) en een paars label</w:t>
-      </w:r>
-      <w:r>
-        <w:rPr>
-          <w:lang w:val="nl"/>
-        </w:rPr>
-        <w:t xml:space="preserve"> </w:t>
-      </w:r>
-      <w:r>
-        <w:rPr>
-          <w:b/>
-          <w:bCs/>
-          <w:lang w:val="nl"/>
-        </w:rPr>
-        <w:t xml:space="preserve">vrij ma di</w:t>
-      </w:r>
-      <w:r>
-        <w:rPr>
-          <w:lang w:val="nl"/>
-        </w:rPr>
-        <w:t xml:space="preserve"> </w:t>
-      </w:r>
-      <w:r>
-        <w:rPr>
-          <w:lang w:val="nl"/>
-        </w:rPr>
-        <w:t xml:space="preserve">(de dagen die iemand liever vrij heeft; de planner beslist). De onderste rij toont per week</w:t>
+        <w:t xml:space="preserve">(afwijkende norm van dat aantal dagen per week). De onderste rij toont per week</w:t>
       </w:r>
       <w:r>
         <w:rPr>
@@ -27762,11 +28092,12 @@
         </w:rPr>
         <w:t xml:space="preserve">staat wanneer de gegevens voor het laatst veranderden.</w:t>
       </w:r>
-    </w:p>
-    <w:p>
-      <w:pPr>
-        <w:pStyle w:val="BodyText"/>
-      </w:pPr>
+      <w:r>
+        <w:rPr>
+          <w:lang w:val="nl"/>
+        </w:rPr>
+        <w:t xml:space="preserve"> </w:t>
+      </w:r>
       <w:r>
         <w:rPr>
           <w:lang w:val="nl"/>

</xml_diff>

<commit_message>
2.141.0 Taakrechten per module; Beheerders heet nu Accounts
- includes/rechten_taken.php: taken per module (label, uitleg, basis). Zonder opgeslagen taken
  volgt elke taak het oude recht; na opslaan worden lezen/bewerken/verwijderen afgeleid
  (lezen = een taak aan, bewerken/verwijderen = alle taken met die basis aan). Tabel rol_taak.
- mag($module, $taak): onbekende taak = nee (ook admin), met foutlog.
- Eigen taken: selectiedag/trainingsweekend (bekijken, inchecken, beoordelen, voorbereiden,
  nabespreken/gesprekken), berichten (versturen, sjablonen), loonplanning (plannen, definitief),
  sollicitanten (exporteren). Schermen, api_incheck, afmeldingen en afspraak-editor omgezet.
- Matrix in admin/rollen.php per onderdeel inklapbaar, "Alles" per rol (assets/js/rollen.js).
- Menu, tabbladen en handleiding: Accounts & rechten.
- Test: docs/ai/harnas/taakrechten_test.php (26 ok): opslaan zoals het staat verandert geen oud recht.
</commit_message>
<xml_diff>
--- a/docs/handleiding/word/handleiding_beheer.docx
+++ b/docs/handleiding/word/handleiding_beheer.docx
@@ -1584,7 +1584,7 @@
               <w:rPr>
                 <w:lang w:val="nl"/>
               </w:rPr>
-              <w:t xml:space="preserve">Alles behalve Loondossiers, Beheerders &amp; rechten en Logboek</w:t>
+              <w:t xml:space="preserve">Alles behalve Loondossiers, Accounts &amp; rechten en Logboek</w:t>
             </w:r>
           </w:p>
         </w:tc>
@@ -1798,7 +1798,7 @@
         <w:rPr>
           <w:lang w:val="nl"/>
         </w:rPr>
-        <w:t xml:space="preserve">Goed om te weten over de begeleider: met de standaardrechten (Selectiedag: alleen lezen) kan een</w:t>
+        <w:t xml:space="preserve">Goed om te weten over de begeleider: met de standaardrechten (Selectiedag: Bekijken, Inchecken en Beoordelen) kan een</w:t>
       </w:r>
       <w:r>
         <w:rPr>
@@ -1886,7 +1886,7 @@
         <w:rPr>
           <w:lang w:val="nl"/>
         </w:rPr>
-        <w:t xml:space="preserve">bestuur. Bijzonderheden uit het kennismakingsformulier (vaak medisch) ziet een begeleider niet; wel</w:t>
+        <w:t xml:space="preserve">bestuur, tenzij je de begeleider die taken geeft onder Rollen &amp; rechten. Bijzonderheden uit het kennismakingsformulier (vaak medisch) ziet een begeleider niet; wel</w:t>
       </w:r>
       <w:r>
         <w:rPr>
@@ -6867,7 +6867,7 @@
         <w:rPr>
           <w:lang w:val="nl"/>
         </w:rPr>
-        <w:t xml:space="preserve">Beheerders &amp; rechten › Rollen (standaard app-sol-admin = Beheerder, app-sol-bestuur = Bestuur,</w:t>
+        <w:t xml:space="preserve">Accounts &amp; rechten › Rollen (standaard app-sol-admin = Beheerder, app-sol-bestuur = Bestuur,</w:t>
       </w:r>
       <w:r>
         <w:rPr>
@@ -7755,7 +7755,7 @@
               <w:rPr>
                 <w:lang w:val="nl"/>
               </w:rPr>
-              <w:t xml:space="preserve">Seizoen, Instellingen, Beheerders &amp; rechten, Logboek</w:t>
+              <w:t xml:space="preserve">Seizoen, Instellingen, Accounts &amp; rechten, Logboek</w:t>
             </w:r>
           </w:p>
         </w:tc>
@@ -41753,21 +41753,21 @@
         <w:rPr>
           <w:lang w:val="nl"/>
         </w:rPr>
-        <w:t xml:space="preserve">zijbalk › Systeem › Beheerders &amp; rechten, met de tabbladen</w:t>
-      </w:r>
-      <w:r>
-        <w:rPr>
-          <w:lang w:val="nl"/>
-        </w:rPr>
-        <w:t xml:space="preserve"> </w:t>
-      </w:r>
-      <w:r>
-        <w:rPr>
-          <w:b/>
-          <w:bCs/>
-          <w:lang w:val="nl"/>
-        </w:rPr>
-        <w:t xml:space="preserve">Beheerders</w:t>
+        <w:t xml:space="preserve">zijbalk › Systeem › Accounts &amp; rechten, met de tabbladen</w:t>
+      </w:r>
+      <w:r>
+        <w:rPr>
+          <w:lang w:val="nl"/>
+        </w:rPr>
+        <w:t xml:space="preserve"> </w:t>
+      </w:r>
+      <w:r>
+        <w:rPr>
+          <w:b/>
+          <w:bCs/>
+          <w:lang w:val="nl"/>
+        </w:rPr>
+        <w:t xml:space="preserve">Accounts</w:t>
       </w:r>
       <w:r>
         <w:rPr>
@@ -41816,7 +41816,7 @@
         <w:rPr>
           <w:lang w:val="nl"/>
         </w:rPr>
-        <w:t xml:space="preserve">bewerkrecht op Beheerders &amp; rollen (standaard alleen admin).</w:t>
+        <w:t xml:space="preserve">bewerkrecht op Accounts &amp; rollen (standaard alleen admin). Tot versie 2.141 heette dit Beheerders &amp; rechten.</w:t>
       </w:r>
     </w:p>
     <w:p>
@@ -41877,7 +41877,7 @@
         <w:rPr>
           <w:lang w:val="nl"/>
         </w:rPr>
-        <w:t xml:space="preserve">onderdeel in wat een rol mag. Admin heeft altijd alles.</w:t>
+        <w:t xml:space="preserve">onderdeel per taak in wat een rol mag. Admin heeft altijd alles.</w:t>
       </w:r>
     </w:p>
     <w:bookmarkStart w:id="128" w:name="iemand-toegang-geven"/>
@@ -42255,7 +42255,7 @@
       </w:r>
     </w:p>
     <w:bookmarkEnd w:id="129"/>
-    <w:bookmarkStart w:id="130" w:name="het-tabblad-beheerders"/>
+    <w:bookmarkStart w:id="130" w:name="het-tabblad-accounts"/>
     <w:p>
       <w:pPr>
         <w:pStyle w:val="Heading2"/>
@@ -42264,7 +42264,7 @@
         <w:rPr>
           <w:lang w:val="nl"/>
         </w:rPr>
-        <w:t xml:space="preserve">Het tabblad Beheerders</w:t>
+        <w:t xml:space="preserve">Het tabblad Accounts</w:t>
       </w:r>
     </w:p>
     <w:p>
@@ -42691,7 +42691,7 @@
         <w:rPr>
           <w:lang w:val="nl"/>
         </w:rPr>
-        <w:t xml:space="preserve">Beheerder (admin) heeft; het recht op Beheerders &amp; rollen is niet genoeg. Gebruik het alleen als</w:t>
+        <w:t xml:space="preserve">Beheerder (admin) heeft; het recht op Accounts &amp; rollen is niet genoeg. Gebruik het alleen als</w:t>
       </w:r>
       <w:r>
         <w:rPr>
@@ -43473,31 +43473,107 @@
         <w:rPr>
           <w:lang w:val="nl"/>
         </w:rPr>
-        <w:t xml:space="preserve">toont per onderdeel en per rol de vinkjes Lezen, Bewerken en</w:t>
-      </w:r>
-      <w:r>
-        <w:rPr>
-          <w:lang w:val="nl"/>
-        </w:rPr>
-        <w:t xml:space="preserve"> </w:t>
-      </w:r>
-      <w:r>
-        <w:rPr>
-          <w:lang w:val="nl"/>
-        </w:rPr>
-        <w:t xml:space="preserve">Verwijderen. Een streepje betekent dat die actie voor dat onderdeel niet bestaat. Bewerken of</w:t>
-      </w:r>
-      <w:r>
-        <w:rPr>
-          <w:lang w:val="nl"/>
-        </w:rPr>
-        <w:t xml:space="preserve"> </w:t>
-      </w:r>
-      <w:r>
-        <w:rPr>
-          <w:lang w:val="nl"/>
-        </w:rPr>
-        <w:t xml:space="preserve">verwijderen zet lezen vanzelf aan. Admin staat vast op alles.</w:t>
+        <w:t xml:space="preserve">staat per onderdeel ingeklapt; de kop zegt per rol hoeveel taken</w:t>
+      </w:r>
+      <w:r>
+        <w:rPr>
+          <w:lang w:val="nl"/>
+        </w:rPr>
+        <w:t xml:space="preserve"> </w:t>
+      </w:r>
+      <w:r>
+        <w:rPr>
+          <w:lang w:val="nl"/>
+        </w:rPr>
+        <w:t xml:space="preserve">aanstaan ("Begeleider 3/5 · Bestuur 5/5"). Uitgeklapt zie je per</w:t>
+      </w:r>
+      <w:r>
+        <w:rPr>
+          <w:lang w:val="nl"/>
+        </w:rPr>
+        <w:t xml:space="preserve"> </w:t>
+      </w:r>
+      <w:r>
+        <w:rPr>
+          <w:b/>
+          <w:bCs/>
+          <w:lang w:val="nl"/>
+        </w:rPr>
+        <w:t xml:space="preserve">taak</w:t>
+      </w:r>
+      <w:r>
+        <w:rPr>
+          <w:lang w:val="nl"/>
+        </w:rPr>
+        <w:t xml:space="preserve"> </w:t>
+      </w:r>
+      <w:r>
+        <w:rPr>
+          <w:lang w:val="nl"/>
+        </w:rPr>
+        <w:t xml:space="preserve">een regel met uitleg en</w:t>
+      </w:r>
+      <w:r>
+        <w:rPr>
+          <w:lang w:val="nl"/>
+        </w:rPr>
+        <w:t xml:space="preserve"> </w:t>
+      </w:r>
+      <w:r>
+        <w:rPr>
+          <w:lang w:val="nl"/>
+        </w:rPr>
+        <w:t xml:space="preserve">per rol een vinkje. Met</w:t>
+      </w:r>
+      <w:r>
+        <w:rPr>
+          <w:lang w:val="nl"/>
+        </w:rPr>
+        <w:t xml:space="preserve"> </w:t>
+      </w:r>
+      <w:r>
+        <w:rPr>
+          <w:b/>
+          <w:bCs/>
+          <w:lang w:val="nl"/>
+        </w:rPr>
+        <w:t xml:space="preserve">Alles bij …</w:t>
+      </w:r>
+      <w:r>
+        <w:rPr>
+          <w:lang w:val="nl"/>
+        </w:rPr>
+        <w:t xml:space="preserve"> </w:t>
+      </w:r>
+      <w:r>
+        <w:rPr>
+          <w:lang w:val="nl"/>
+        </w:rPr>
+        <w:t xml:space="preserve">zet je in één keer alle taken van dat onderdeel aan of uit</w:t>
+      </w:r>
+      <w:r>
+        <w:rPr>
+          <w:lang w:val="nl"/>
+        </w:rPr>
+        <w:t xml:space="preserve"> </w:t>
+      </w:r>
+      <w:r>
+        <w:rPr>
+          <w:lang w:val="nl"/>
+        </w:rPr>
+        <w:t xml:space="preserve">voor een rol (half gevuld = een deel staat aan). Elke taak houdt in dat de rol het onderdeel mag</w:t>
+      </w:r>
+      <w:r>
+        <w:rPr>
+          <w:lang w:val="nl"/>
+        </w:rPr>
+        <w:t xml:space="preserve"> </w:t>
+      </w:r>
+      <w:r>
+        <w:rPr>
+          <w:lang w:val="nl"/>
+        </w:rPr>
+        <w:t xml:space="preserve">bekijken. Admin staat vast op alles.</w:t>
       </w:r>
       <w:r>
         <w:rPr>
@@ -43523,19 +43599,19 @@
         <w:rPr>
           <w:lang w:val="nl"/>
         </w:rPr>
-        <w:t xml:space="preserve">bewaart de hele</w:t>
-      </w:r>
-      <w:r>
-        <w:rPr>
-          <w:lang w:val="nl"/>
-        </w:rPr>
-        <w:t xml:space="preserve"> </w:t>
-      </w:r>
-      <w:r>
-        <w:rPr>
-          <w:lang w:val="nl"/>
-        </w:rPr>
-        <w:t xml:space="preserve">matrix in één keer; elke wijziging komt in het logboek.</w:t>
+        <w:t xml:space="preserve">bewaart de hele matrix in één keer; elke</w:t>
+      </w:r>
+      <w:r>
+        <w:rPr>
+          <w:lang w:val="nl"/>
+        </w:rPr>
+        <w:t xml:space="preserve"> </w:t>
+      </w:r>
+      <w:r>
+        <w:rPr>
+          <w:lang w:val="nl"/>
+        </w:rPr>
+        <w:t xml:space="preserve">wijziging komt in het logboek als rolwijziging met de taken van voor en na.</w:t>
       </w:r>
     </w:p>
     <w:p>
@@ -43546,7 +43622,73 @@
         <w:rPr>
           <w:lang w:val="nl"/>
         </w:rPr>
-        <w:t xml:space="preserve">Zo staat het op een nieuwe installatie (l = lezen, b = bewerken, v = verwijderen):</w:t>
+        <w:t xml:space="preserve">Onderdelen met eigen taken (de rest heeft</w:t>
+      </w:r>
+      <w:r>
+        <w:rPr>
+          <w:lang w:val="nl"/>
+        </w:rPr>
+        <w:t xml:space="preserve"> </w:t>
+      </w:r>
+      <w:r>
+        <w:rPr>
+          <w:b/>
+          <w:bCs/>
+          <w:lang w:val="nl"/>
+        </w:rPr>
+        <w:t xml:space="preserve">Bekijken</w:t>
+      </w:r>
+      <w:r>
+        <w:rPr>
+          <w:lang w:val="nl"/>
+        </w:rPr>
+        <w:t xml:space="preserve">,</w:t>
+      </w:r>
+      <w:r>
+        <w:rPr>
+          <w:lang w:val="nl"/>
+        </w:rPr>
+        <w:t xml:space="preserve"> </w:t>
+      </w:r>
+      <w:r>
+        <w:rPr>
+          <w:b/>
+          <w:bCs/>
+          <w:lang w:val="nl"/>
+        </w:rPr>
+        <w:t xml:space="preserve">Wijzigen</w:t>
+      </w:r>
+      <w:r>
+        <w:rPr>
+          <w:lang w:val="nl"/>
+        </w:rPr>
+        <w:t xml:space="preserve"> </w:t>
+      </w:r>
+      <w:r>
+        <w:rPr>
+          <w:lang w:val="nl"/>
+        </w:rPr>
+        <w:t xml:space="preserve">en waar het bestaat</w:t>
+      </w:r>
+      <w:r>
+        <w:rPr>
+          <w:lang w:val="nl"/>
+        </w:rPr>
+        <w:t xml:space="preserve"> </w:t>
+      </w:r>
+      <w:r>
+        <w:rPr>
+          <w:b/>
+          <w:bCs/>
+          <w:lang w:val="nl"/>
+        </w:rPr>
+        <w:t xml:space="preserve">Verwijderen</w:t>
+      </w:r>
+      <w:r>
+        <w:rPr>
+          <w:lang w:val="nl"/>
+        </w:rPr>
+        <w:t xml:space="preserve">):</w:t>
       </w:r>
     </w:p>
     <w:tbl>
@@ -43556,11 +43698,8 @@
         <w:tblLook w:firstRow="1" w:lastRow="0" w:firstColumn="0" w:lastColumn="0" w:noHBand="0" w:noVBand="0" w:val="0020"/>
       </w:tblPr>
       <w:tblGrid>
-        <w:gridCol w:w="1584"/>
-        <w:gridCol w:w="1584"/>
-        <w:gridCol w:w="1584"/>
-        <w:gridCol w:w="1584"/>
-        <w:gridCol w:w="1584"/>
+        <w:gridCol w:w="3960"/>
+        <w:gridCol w:w="3960"/>
       </w:tblGrid>
       <w:tr>
         <w:trPr>
@@ -43590,49 +43729,7 @@
               <w:rPr>
                 <w:lang w:val="nl"/>
               </w:rPr>
-              <w:t xml:space="preserve">Begeleider</w:t>
-            </w:r>
-          </w:p>
-        </w:tc>
-        <w:tc>
-          <w:tcPr/>
-          <w:p>
-            <w:pPr>
-              <w:pStyle w:val="Compact"/>
-            </w:pPr>
-            <w:r>
-              <w:rPr>
-                <w:lang w:val="nl"/>
-              </w:rPr>
-              <w:t xml:space="preserve">Bestuur</w:t>
-            </w:r>
-          </w:p>
-        </w:tc>
-        <w:tc>
-          <w:tcPr/>
-          <w:p>
-            <w:pPr>
-              <w:pStyle w:val="Compact"/>
-            </w:pPr>
-            <w:r>
-              <w:rPr>
-                <w:lang w:val="nl"/>
-              </w:rPr>
-              <w:t xml:space="preserve">Penningmeester</w:t>
-            </w:r>
-          </w:p>
-        </w:tc>
-        <w:tc>
-          <w:tcPr/>
-          <w:p>
-            <w:pPr>
-              <w:pStyle w:val="Compact"/>
-            </w:pPr>
-            <w:r>
-              <w:rPr>
-                <w:lang w:val="nl"/>
-              </w:rPr>
-              <w:t xml:space="preserve">Admin</w:t>
+              <w:t xml:space="preserve">Taken</w:t>
             </w:r>
           </w:p>
         </w:tc>
@@ -43648,7 +43745,7 @@
               <w:rPr>
                 <w:lang w:val="nl"/>
               </w:rPr>
-              <w:t xml:space="preserve">Sollicitanten</w:t>
+              <w:t xml:space="preserve">Selectiedag</w:t>
             </w:r>
           </w:p>
         </w:tc>
@@ -43662,49 +43759,7 @@
               <w:rPr>
                 <w:lang w:val="nl"/>
               </w:rPr>
-              <w:t xml:space="preserve">–</w:t>
-            </w:r>
-          </w:p>
-        </w:tc>
-        <w:tc>
-          <w:tcPr/>
-          <w:p>
-            <w:pPr>
-              <w:pStyle w:val="Compact"/>
-            </w:pPr>
-            <w:r>
-              <w:rPr>
-                <w:lang w:val="nl"/>
-              </w:rPr>
-              <w:t xml:space="preserve">l b v</w:t>
-            </w:r>
-          </w:p>
-        </w:tc>
-        <w:tc>
-          <w:tcPr/>
-          <w:p>
-            <w:pPr>
-              <w:pStyle w:val="Compact"/>
-            </w:pPr>
-            <w:r>
-              <w:rPr>
-                <w:lang w:val="nl"/>
-              </w:rPr>
-              <w:t xml:space="preserve">l</w:t>
-            </w:r>
-          </w:p>
-        </w:tc>
-        <w:tc>
-          <w:tcPr/>
-          <w:p>
-            <w:pPr>
-              <w:pStyle w:val="Compact"/>
-            </w:pPr>
-            <w:r>
-              <w:rPr>
-                <w:lang w:val="nl"/>
-              </w:rPr>
-              <w:t xml:space="preserve">alles</w:t>
+              <w:t xml:space="preserve">Bekijken · Inchecken · Beoordelen · Voorbereiden (wie komt er, groepen, afmeldingen, tablet en pincode, afsluiten) · Nabespreken en besluiten (nabespreking, bellijst, observaties van anderen weghalen)</w:t>
             </w:r>
           </w:p>
         </w:tc>
@@ -43720,7 +43775,7 @@
               <w:rPr>
                 <w:lang w:val="nl"/>
               </w:rPr>
-              <w:t xml:space="preserve">Landingspagina's</w:t>
+              <w:t xml:space="preserve">Trainingsweekend</w:t>
             </w:r>
           </w:p>
         </w:tc>
@@ -43734,49 +43789,7 @@
               <w:rPr>
                 <w:lang w:val="nl"/>
               </w:rPr>
-              <w:t xml:space="preserve">–</w:t>
-            </w:r>
-          </w:p>
-        </w:tc>
-        <w:tc>
-          <w:tcPr/>
-          <w:p>
-            <w:pPr>
-              <w:pStyle w:val="Compact"/>
-            </w:pPr>
-            <w:r>
-              <w:rPr>
-                <w:lang w:val="nl"/>
-              </w:rPr>
-              <w:t xml:space="preserve">l b v</w:t>
-            </w:r>
-          </w:p>
-        </w:tc>
-        <w:tc>
-          <w:tcPr/>
-          <w:p>
-            <w:pPr>
-              <w:pStyle w:val="Compact"/>
-            </w:pPr>
-            <w:r>
-              <w:rPr>
-                <w:lang w:val="nl"/>
-              </w:rPr>
-              <w:t xml:space="preserve">–</w:t>
-            </w:r>
-          </w:p>
-        </w:tc>
-        <w:tc>
-          <w:tcPr/>
-          <w:p>
-            <w:pPr>
-              <w:pStyle w:val="Compact"/>
-            </w:pPr>
-            <w:r>
-              <w:rPr>
-                <w:lang w:val="nl"/>
-              </w:rPr>
-              <w:t xml:space="preserve">alles</w:t>
+              <w:t xml:space="preserve">Bekijken · Inchecken · Beoordelen · Voorbereiden · Gesprekken en besluiten (evaluatie, gesprekken, aannemen of afwijzen)</w:t>
             </w:r>
           </w:p>
         </w:tc>
@@ -43792,7 +43805,7 @@
               <w:rPr>
                 <w:lang w:val="nl"/>
               </w:rPr>
-              <w:t xml:space="preserve">Kennismakingsformulier</w:t>
+              <w:t xml:space="preserve">Sollicitanten</w:t>
             </w:r>
           </w:p>
         </w:tc>
@@ -43806,49 +43819,7 @@
               <w:rPr>
                 <w:lang w:val="nl"/>
               </w:rPr>
-              <w:t xml:space="preserve">–</w:t>
-            </w:r>
-          </w:p>
-        </w:tc>
-        <w:tc>
-          <w:tcPr/>
-          <w:p>
-            <w:pPr>
-              <w:pStyle w:val="Compact"/>
-            </w:pPr>
-            <w:r>
-              <w:rPr>
-                <w:lang w:val="nl"/>
-              </w:rPr>
-              <w:t xml:space="preserve">l b</w:t>
-            </w:r>
-          </w:p>
-        </w:tc>
-        <w:tc>
-          <w:tcPr/>
-          <w:p>
-            <w:pPr>
-              <w:pStyle w:val="Compact"/>
-            </w:pPr>
-            <w:r>
-              <w:rPr>
-                <w:lang w:val="nl"/>
-              </w:rPr>
-              <w:t xml:space="preserve">–</w:t>
-            </w:r>
-          </w:p>
-        </w:tc>
-        <w:tc>
-          <w:tcPr/>
-          <w:p>
-            <w:pPr>
-              <w:pStyle w:val="Compact"/>
-            </w:pPr>
-            <w:r>
-              <w:rPr>
-                <w:lang w:val="nl"/>
-              </w:rPr>
-              <w:t xml:space="preserve">alles</w:t>
+              <w:t xml:space="preserve">Bekijken · Exporteren · Wijzigen (gegevens, fase, uitnodigen, afwijzen, herinneren) · Verwijderen</w:t>
             </w:r>
           </w:p>
         </w:tc>
@@ -43864,7 +43835,7 @@
               <w:rPr>
                 <w:lang w:val="nl"/>
               </w:rPr>
-              <w:t xml:space="preserve">Selectiedag</w:t>
+              <w:t xml:space="preserve">Berichten &amp; sjablonen</w:t>
             </w:r>
           </w:p>
         </w:tc>
@@ -43878,49 +43849,7 @@
               <w:rPr>
                 <w:lang w:val="nl"/>
               </w:rPr>
-              <w:t xml:space="preserve">l</w:t>
-            </w:r>
-          </w:p>
-        </w:tc>
-        <w:tc>
-          <w:tcPr/>
-          <w:p>
-            <w:pPr>
-              <w:pStyle w:val="Compact"/>
-            </w:pPr>
-            <w:r>
-              <w:rPr>
-                <w:lang w:val="nl"/>
-              </w:rPr>
-              <w:t xml:space="preserve">l b</w:t>
-            </w:r>
-          </w:p>
-        </w:tc>
-        <w:tc>
-          <w:tcPr/>
-          <w:p>
-            <w:pPr>
-              <w:pStyle w:val="Compact"/>
-            </w:pPr>
-            <w:r>
-              <w:rPr>
-                <w:lang w:val="nl"/>
-              </w:rPr>
-              <w:t xml:space="preserve">–</w:t>
-            </w:r>
-          </w:p>
-        </w:tc>
-        <w:tc>
-          <w:tcPr/>
-          <w:p>
-            <w:pPr>
-              <w:pStyle w:val="Compact"/>
-            </w:pPr>
-            <w:r>
-              <w:rPr>
-                <w:lang w:val="nl"/>
-              </w:rPr>
-              <w:t xml:space="preserve">alles</w:t>
+              <w:t xml:space="preserve">Bekijken · Versturen · Sjablonen en gepland</w:t>
             </w:r>
           </w:p>
         </w:tc>
@@ -43936,7 +43865,7 @@
               <w:rPr>
                 <w:lang w:val="nl"/>
               </w:rPr>
-              <w:t xml:space="preserve">Ondertekeningen</w:t>
+              <w:t xml:space="preserve">Loonplanning</w:t>
             </w:r>
           </w:p>
         </w:tc>
@@ -43950,7 +43879,151 @@
               <w:rPr>
                 <w:lang w:val="nl"/>
               </w:rPr>
-              <w:t xml:space="preserve">–</w:t>
+              <w:t xml:space="preserve">Bekijken · Plannen (weken, scenario's, extra personen, afspraak in het TW-gesprek) · Definitief maken (afspraken vastleggen, vastzetten en ontgrendelen)</w:t>
+            </w:r>
+          </w:p>
+        </w:tc>
+      </w:tr>
+    </w:tbl>
+    <w:p>
+      <w:pPr>
+        <w:pStyle w:val="BodyText"/>
+      </w:pPr>
+      <w:r>
+        <w:rPr>
+          <w:lang w:val="nl"/>
+        </w:rPr>
+        <w:t xml:space="preserve">Voorbeeld: een ervaren begeleider die mag meepraten bij de nabespreking maar niet mag indelen,</w:t>
+      </w:r>
+      <w:r>
+        <w:rPr>
+          <w:lang w:val="nl"/>
+        </w:rPr>
+        <w:t xml:space="preserve"> </w:t>
+      </w:r>
+      <w:r>
+        <w:rPr>
+          <w:lang w:val="nl"/>
+        </w:rPr>
+        <w:t xml:space="preserve">krijgt bij Selectiedag</w:t>
+      </w:r>
+      <w:r>
+        <w:rPr>
+          <w:lang w:val="nl"/>
+        </w:rPr>
+        <w:t xml:space="preserve"> </w:t>
+      </w:r>
+      <w:r>
+        <w:rPr>
+          <w:b/>
+          <w:bCs/>
+          <w:lang w:val="nl"/>
+        </w:rPr>
+        <w:t xml:space="preserve">Nabespreken en besluiten</w:t>
+      </w:r>
+      <w:r>
+        <w:rPr>
+          <w:lang w:val="nl"/>
+        </w:rPr>
+        <w:t xml:space="preserve"> </w:t>
+      </w:r>
+      <w:r>
+        <w:rPr>
+          <w:lang w:val="nl"/>
+        </w:rPr>
+        <w:t xml:space="preserve">erbij en houdt</w:t>
+      </w:r>
+      <w:r>
+        <w:rPr>
+          <w:lang w:val="nl"/>
+        </w:rPr>
+        <w:t xml:space="preserve"> </w:t>
+      </w:r>
+      <w:r>
+        <w:rPr>
+          <w:b/>
+          <w:bCs/>
+          <w:lang w:val="nl"/>
+        </w:rPr>
+        <w:t xml:space="preserve">Voorbereiden</w:t>
+      </w:r>
+      <w:r>
+        <w:rPr>
+          <w:lang w:val="nl"/>
+        </w:rPr>
+        <w:t xml:space="preserve"> </w:t>
+      </w:r>
+      <w:r>
+        <w:rPr>
+          <w:lang w:val="nl"/>
+        </w:rPr>
+        <w:t xml:space="preserve">uit.</w:t>
+      </w:r>
+    </w:p>
+    <w:p>
+      <w:pPr>
+        <w:pStyle w:val="BodyText"/>
+      </w:pPr>
+      <w:r>
+        <w:rPr>
+          <w:lang w:val="nl"/>
+        </w:rPr>
+        <w:t xml:space="preserve">Zo staat het op een nieuwe installatie (l = lezen, b = bewerken, v = verwijderen; een taak volgt</w:t>
+      </w:r>
+      <w:r>
+        <w:rPr>
+          <w:lang w:val="nl"/>
+        </w:rPr>
+        <w:t xml:space="preserve"> </w:t>
+      </w:r>
+      <w:r>
+        <w:rPr>
+          <w:lang w:val="nl"/>
+        </w:rPr>
+        <w:t xml:space="preserve">het recht waar hij bij hoort, dus "l" = alle taken die bij bekijken horen, zoals Inchecken en</w:t>
+      </w:r>
+      <w:r>
+        <w:rPr>
+          <w:lang w:val="nl"/>
+        </w:rPr>
+        <w:t xml:space="preserve"> </w:t>
+      </w:r>
+      <w:r>
+        <w:rPr>
+          <w:lang w:val="nl"/>
+        </w:rPr>
+        <w:t xml:space="preserve">Beoordelen):</w:t>
+      </w:r>
+    </w:p>
+    <w:tbl>
+      <w:tblPr>
+        <w:tblStyle w:val="Table"/>
+        <w:tblW w:type="auto" w:w="0"/>
+        <w:tblLook w:firstRow="1" w:lastRow="0" w:firstColumn="0" w:lastColumn="0" w:noHBand="0" w:noVBand="0" w:val="0020"/>
+      </w:tblPr>
+      <w:tblGrid>
+        <w:gridCol w:w="1320"/>
+        <w:gridCol w:w="1320"/>
+        <w:gridCol w:w="1320"/>
+        <w:gridCol w:w="1320"/>
+        <w:gridCol w:w="1320"/>
+        <w:gridCol w:w="1320"/>
+      </w:tblGrid>
+      <w:tr>
+        <w:trPr>
+          <w:tblHeader w:val="on"/>
+        </w:trPr>
+        <w:tc>
+          <w:tcPr/>
+          <w:p>
+            <w:pPr>
+              <w:pStyle w:val="Compact"/>
+            </w:pPr>
+            <w:r>
+              <w:rPr>
+                <w:lang w:val="nl"/>
+              </w:rPr>
+              <w:t xml:space="preserve">Onderdeel</w:t>
             </w:r>
           </w:p>
         </w:tc>
@@ -43964,7 +44037,7 @@
               <w:rPr>
                 <w:lang w:val="nl"/>
               </w:rPr>
-              <w:t xml:space="preserve">l b</w:t>
+              <w:t xml:space="preserve">Begeleider</w:t>
             </w:r>
           </w:p>
         </w:tc>
@@ -43978,7 +44051,7 @@
               <w:rPr>
                 <w:lang w:val="nl"/>
               </w:rPr>
-              <w:t xml:space="preserve">–</w:t>
+              <w:t xml:space="preserve">Bestuur</w:t>
             </w:r>
           </w:p>
         </w:tc>
@@ -43992,7 +44065,35 @@
               <w:rPr>
                 <w:lang w:val="nl"/>
               </w:rPr>
-              <w:t xml:space="preserve">alles</w:t>
+              <w:t xml:space="preserve">Penningmeester</w:t>
+            </w:r>
+          </w:p>
+        </w:tc>
+        <w:tc>
+          <w:tcPr/>
+          <w:p>
+            <w:pPr>
+              <w:pStyle w:val="Compact"/>
+            </w:pPr>
+            <w:r>
+              <w:rPr>
+                <w:lang w:val="nl"/>
+              </w:rPr>
+              <w:t xml:space="preserve">Planner</w:t>
+            </w:r>
+          </w:p>
+        </w:tc>
+        <w:tc>
+          <w:tcPr/>
+          <w:p>
+            <w:pPr>
+              <w:pStyle w:val="Compact"/>
+            </w:pPr>
+            <w:r>
+              <w:rPr>
+                <w:lang w:val="nl"/>
+              </w:rPr>
+              <w:t xml:space="preserve">Admin</w:t>
             </w:r>
           </w:p>
         </w:tc>
@@ -44008,7 +44109,7 @@
               <w:rPr>
                 <w:lang w:val="nl"/>
               </w:rPr>
-              <w:t xml:space="preserve">Loondossiers (ID, bankpas, loonheffing)</w:t>
+              <w:t xml:space="preserve">Sollicitanten</w:t>
             </w:r>
           </w:p>
         </w:tc>
@@ -44036,7 +44137,7 @@
               <w:rPr>
                 <w:lang w:val="nl"/>
               </w:rPr>
-              <w:t xml:space="preserve">–</w:t>
+              <w:t xml:space="preserve">l b v</w:t>
             </w:r>
           </w:p>
         </w:tc>
@@ -44050,7 +44151,21 @@
               <w:rPr>
                 <w:lang w:val="nl"/>
               </w:rPr>
-              <w:t xml:space="preserve">l b v</w:t>
+              <w:t xml:space="preserve">l</w:t>
+            </w:r>
+          </w:p>
+        </w:tc>
+        <w:tc>
+          <w:tcPr/>
+          <w:p>
+            <w:pPr>
+              <w:pStyle w:val="Compact"/>
+            </w:pPr>
+            <w:r>
+              <w:rPr>
+                <w:lang w:val="nl"/>
+              </w:rPr>
+              <w:t xml:space="preserve">–</w:t>
             </w:r>
           </w:p>
         </w:tc>
@@ -44080,7 +44195,7 @@
               <w:rPr>
                 <w:lang w:val="nl"/>
               </w:rPr>
-              <w:t xml:space="preserve">Beschikbaarheid</w:t>
+              <w:t xml:space="preserve">Landingspagina's</w:t>
             </w:r>
           </w:p>
         </w:tc>
@@ -44108,7 +44223,21 @@
               <w:rPr>
                 <w:lang w:val="nl"/>
               </w:rPr>
-              <w:t xml:space="preserve">l b</w:t>
+              <w:t xml:space="preserve">l b v</w:t>
+            </w:r>
+          </w:p>
+        </w:tc>
+        <w:tc>
+          <w:tcPr/>
+          <w:p>
+            <w:pPr>
+              <w:pStyle w:val="Compact"/>
+            </w:pPr>
+            <w:r>
+              <w:rPr>
+                <w:lang w:val="nl"/>
+              </w:rPr>
+              <w:t xml:space="preserve">–</w:t>
             </w:r>
           </w:p>
         </w:tc>
@@ -44152,7 +44281,7 @@
               <w:rPr>
                 <w:lang w:val="nl"/>
               </w:rPr>
-              <w:t xml:space="preserve">Dekking</w:t>
+              <w:t xml:space="preserve">Kennismakingsformulier</w:t>
             </w:r>
           </w:p>
         </w:tc>
@@ -44166,7 +44295,7 @@
               <w:rPr>
                 <w:lang w:val="nl"/>
               </w:rPr>
-              <w:t xml:space="preserve">l</w:t>
+              <w:t xml:space="preserve">–</w:t>
             </w:r>
           </w:p>
         </w:tc>
@@ -44180,7 +44309,21 @@
               <w:rPr>
                 <w:lang w:val="nl"/>
               </w:rPr>
-              <w:t xml:space="preserve">l</w:t>
+              <w:t xml:space="preserve">l b</w:t>
+            </w:r>
+          </w:p>
+        </w:tc>
+        <w:tc>
+          <w:tcPr/>
+          <w:p>
+            <w:pPr>
+              <w:pStyle w:val="Compact"/>
+            </w:pPr>
+            <w:r>
+              <w:rPr>
+                <w:lang w:val="nl"/>
+              </w:rPr>
+              <w:t xml:space="preserve">–</w:t>
             </w:r>
           </w:p>
         </w:tc>
@@ -44224,7 +44367,7 @@
               <w:rPr>
                 <w:lang w:val="nl"/>
               </w:rPr>
-              <w:t xml:space="preserve">Loonplanning</w:t>
+              <w:t xml:space="preserve">Selectiedag</w:t>
             </w:r>
           </w:p>
         </w:tc>
@@ -44238,7 +44381,7 @@
               <w:rPr>
                 <w:lang w:val="nl"/>
               </w:rPr>
-              <w:t xml:space="preserve">–</w:t>
+              <w:t xml:space="preserve">l</w:t>
             </w:r>
           </w:p>
         </w:tc>
@@ -44266,7 +44409,21 @@
               <w:rPr>
                 <w:lang w:val="nl"/>
               </w:rPr>
-              <w:t xml:space="preserve">l b</w:t>
+              <w:t xml:space="preserve">–</w:t>
+            </w:r>
+          </w:p>
+        </w:tc>
+        <w:tc>
+          <w:tcPr/>
+          <w:p>
+            <w:pPr>
+              <w:pStyle w:val="Compact"/>
+            </w:pPr>
+            <w:r>
+              <w:rPr>
+                <w:lang w:val="nl"/>
+              </w:rPr>
+              <w:t xml:space="preserve">–</w:t>
             </w:r>
           </w:p>
         </w:tc>
@@ -44296,7 +44453,7 @@
               <w:rPr>
                 <w:lang w:val="nl"/>
               </w:rPr>
-              <w:t xml:space="preserve">Berichten &amp; sjablonen</w:t>
+              <w:t xml:space="preserve">Trainingsweekend</w:t>
             </w:r>
           </w:p>
         </w:tc>
@@ -44310,7 +44467,7 @@
               <w:rPr>
                 <w:lang w:val="nl"/>
               </w:rPr>
-              <w:t xml:space="preserve">–</w:t>
+              <w:t xml:space="preserve">l</w:t>
             </w:r>
           </w:p>
         </w:tc>
@@ -44325,6 +44482,20 @@
                 <w:lang w:val="nl"/>
               </w:rPr>
               <w:t xml:space="preserve">l b</w:t>
+            </w:r>
+          </w:p>
+        </w:tc>
+        <w:tc>
+          <w:tcPr/>
+          <w:p>
+            <w:pPr>
+              <w:pStyle w:val="Compact"/>
+            </w:pPr>
+            <w:r>
+              <w:rPr>
+                <w:lang w:val="nl"/>
+              </w:rPr>
+              <w:t xml:space="preserve">–</w:t>
             </w:r>
           </w:p>
         </w:tc>
@@ -44368,7 +44539,7 @@
               <w:rPr>
                 <w:lang w:val="nl"/>
               </w:rPr>
-              <w:t xml:space="preserve">Seizoen</w:t>
+              <w:t xml:space="preserve">Ondertekeningen</w:t>
             </w:r>
           </w:p>
         </w:tc>
@@ -44397,6 +44568,20 @@
                 <w:lang w:val="nl"/>
               </w:rPr>
               <w:t xml:space="preserve">l b</w:t>
+            </w:r>
+          </w:p>
+        </w:tc>
+        <w:tc>
+          <w:tcPr/>
+          <w:p>
+            <w:pPr>
+              <w:pStyle w:val="Compact"/>
+            </w:pPr>
+            <w:r>
+              <w:rPr>
+                <w:lang w:val="nl"/>
+              </w:rPr>
+              <w:t xml:space="preserve">–</w:t>
             </w:r>
           </w:p>
         </w:tc>
@@ -44440,7 +44625,7 @@
               <w:rPr>
                 <w:lang w:val="nl"/>
               </w:rPr>
-              <w:t xml:space="preserve">Instellingen</w:t>
+              <w:t xml:space="preserve">Loondossiers (ID, bankpas, loonheffing)</w:t>
             </w:r>
           </w:p>
         </w:tc>
@@ -44468,7 +44653,21 @@
               <w:rPr>
                 <w:lang w:val="nl"/>
               </w:rPr>
-              <w:t xml:space="preserve">l b</w:t>
+              <w:t xml:space="preserve">–</w:t>
+            </w:r>
+          </w:p>
+        </w:tc>
+        <w:tc>
+          <w:tcPr/>
+          <w:p>
+            <w:pPr>
+              <w:pStyle w:val="Compact"/>
+            </w:pPr>
+            <w:r>
+              <w:rPr>
+                <w:lang w:val="nl"/>
+              </w:rPr>
+              <w:t xml:space="preserve">l b v</w:t>
             </w:r>
           </w:p>
         </w:tc>
@@ -44512,7 +44711,7 @@
               <w:rPr>
                 <w:lang w:val="nl"/>
               </w:rPr>
-              <w:t xml:space="preserve">Beheerders &amp; rollen</w:t>
+              <w:t xml:space="preserve">Beschikbaarheid</w:t>
             </w:r>
           </w:p>
         </w:tc>
@@ -44540,7 +44739,7 @@
               <w:rPr>
                 <w:lang w:val="nl"/>
               </w:rPr>
-              <w:t xml:space="preserve">–</w:t>
+              <w:t xml:space="preserve">l b</w:t>
             </w:r>
           </w:p>
         </w:tc>
@@ -44555,6 +44754,20 @@
                 <w:lang w:val="nl"/>
               </w:rPr>
               <w:t xml:space="preserve">–</w:t>
+            </w:r>
+          </w:p>
+        </w:tc>
+        <w:tc>
+          <w:tcPr/>
+          <w:p>
+            <w:pPr>
+              <w:pStyle w:val="Compact"/>
+            </w:pPr>
+            <w:r>
+              <w:rPr>
+                <w:lang w:val="nl"/>
+              </w:rPr>
+              <w:t xml:space="preserve">l</w:t>
             </w:r>
           </w:p>
         </w:tc>
@@ -44584,7 +44797,7 @@
               <w:rPr>
                 <w:lang w:val="nl"/>
               </w:rPr>
-              <w:t xml:space="preserve">Systeem, updates &amp; logs</w:t>
+              <w:t xml:space="preserve">Dekking</w:t>
             </w:r>
           </w:p>
         </w:tc>
@@ -44598,7 +44811,7 @@
               <w:rPr>
                 <w:lang w:val="nl"/>
               </w:rPr>
-              <w:t xml:space="preserve">–</w:t>
+              <w:t xml:space="preserve">l</w:t>
             </w:r>
           </w:p>
         </w:tc>
@@ -44612,7 +44825,7 @@
               <w:rPr>
                 <w:lang w:val="nl"/>
               </w:rPr>
-              <w:t xml:space="preserve">–</w:t>
+              <w:t xml:space="preserve">l</w:t>
             </w:r>
           </w:p>
         </w:tc>
@@ -44627,6 +44840,20 @@
                 <w:lang w:val="nl"/>
               </w:rPr>
               <w:t xml:space="preserve">–</w:t>
+            </w:r>
+          </w:p>
+        </w:tc>
+        <w:tc>
+          <w:tcPr/>
+          <w:p>
+            <w:pPr>
+              <w:pStyle w:val="Compact"/>
+            </w:pPr>
+            <w:r>
+              <w:rPr>
+                <w:lang w:val="nl"/>
+              </w:rPr>
+              <w:t xml:space="preserve">l</w:t>
             </w:r>
           </w:p>
         </w:tc>
@@ -44656,7 +44883,7 @@
               <w:rPr>
                 <w:lang w:val="nl"/>
               </w:rPr>
-              <w:t xml:space="preserve">Logboek (alle logs)</w:t>
+              <w:t xml:space="preserve">Loonplanning</w:t>
             </w:r>
           </w:p>
         </w:tc>
@@ -44684,7 +44911,7 @@
               <w:rPr>
                 <w:lang w:val="nl"/>
               </w:rPr>
-              <w:t xml:space="preserve">–</w:t>
+              <w:t xml:space="preserve">l b</w:t>
             </w:r>
           </w:p>
         </w:tc>
@@ -44698,7 +44925,7 @@
               <w:rPr>
                 <w:lang w:val="nl"/>
               </w:rPr>
-              <w:t xml:space="preserve">–</w:t>
+              <w:t xml:space="preserve">l b</w:t>
             </w:r>
           </w:p>
         </w:tc>
@@ -44712,6 +44939,536 @@
               <w:rPr>
                 <w:lang w:val="nl"/>
               </w:rPr>
+              <w:t xml:space="preserve">–</w:t>
+            </w:r>
+          </w:p>
+        </w:tc>
+        <w:tc>
+          <w:tcPr/>
+          <w:p>
+            <w:pPr>
+              <w:pStyle w:val="Compact"/>
+            </w:pPr>
+            <w:r>
+              <w:rPr>
+                <w:lang w:val="nl"/>
+              </w:rPr>
+              <w:t xml:space="preserve">alles</w:t>
+            </w:r>
+          </w:p>
+        </w:tc>
+      </w:tr>
+      <w:tr>
+        <w:tc>
+          <w:tcPr/>
+          <w:p>
+            <w:pPr>
+              <w:pStyle w:val="Compact"/>
+            </w:pPr>
+            <w:r>
+              <w:rPr>
+                <w:lang w:val="nl"/>
+              </w:rPr>
+              <w:t xml:space="preserve">Berichten &amp; sjablonen</w:t>
+            </w:r>
+          </w:p>
+        </w:tc>
+        <w:tc>
+          <w:tcPr/>
+          <w:p>
+            <w:pPr>
+              <w:pStyle w:val="Compact"/>
+            </w:pPr>
+            <w:r>
+              <w:rPr>
+                <w:lang w:val="nl"/>
+              </w:rPr>
+              <w:t xml:space="preserve">–</w:t>
+            </w:r>
+          </w:p>
+        </w:tc>
+        <w:tc>
+          <w:tcPr/>
+          <w:p>
+            <w:pPr>
+              <w:pStyle w:val="Compact"/>
+            </w:pPr>
+            <w:r>
+              <w:rPr>
+                <w:lang w:val="nl"/>
+              </w:rPr>
+              <w:t xml:space="preserve">l b</w:t>
+            </w:r>
+          </w:p>
+        </w:tc>
+        <w:tc>
+          <w:tcPr/>
+          <w:p>
+            <w:pPr>
+              <w:pStyle w:val="Compact"/>
+            </w:pPr>
+            <w:r>
+              <w:rPr>
+                <w:lang w:val="nl"/>
+              </w:rPr>
+              <w:t xml:space="preserve">–</w:t>
+            </w:r>
+          </w:p>
+        </w:tc>
+        <w:tc>
+          <w:tcPr/>
+          <w:p>
+            <w:pPr>
+              <w:pStyle w:val="Compact"/>
+            </w:pPr>
+            <w:r>
+              <w:rPr>
+                <w:lang w:val="nl"/>
+              </w:rPr>
+              <w:t xml:space="preserve">–</w:t>
+            </w:r>
+          </w:p>
+        </w:tc>
+        <w:tc>
+          <w:tcPr/>
+          <w:p>
+            <w:pPr>
+              <w:pStyle w:val="Compact"/>
+            </w:pPr>
+            <w:r>
+              <w:rPr>
+                <w:lang w:val="nl"/>
+              </w:rPr>
+              <w:t xml:space="preserve">alles</w:t>
+            </w:r>
+          </w:p>
+        </w:tc>
+      </w:tr>
+      <w:tr>
+        <w:tc>
+          <w:tcPr/>
+          <w:p>
+            <w:pPr>
+              <w:pStyle w:val="Compact"/>
+            </w:pPr>
+            <w:r>
+              <w:rPr>
+                <w:lang w:val="nl"/>
+              </w:rPr>
+              <w:t xml:space="preserve">Seizoen</w:t>
+            </w:r>
+          </w:p>
+        </w:tc>
+        <w:tc>
+          <w:tcPr/>
+          <w:p>
+            <w:pPr>
+              <w:pStyle w:val="Compact"/>
+            </w:pPr>
+            <w:r>
+              <w:rPr>
+                <w:lang w:val="nl"/>
+              </w:rPr>
+              <w:t xml:space="preserve">–</w:t>
+            </w:r>
+          </w:p>
+        </w:tc>
+        <w:tc>
+          <w:tcPr/>
+          <w:p>
+            <w:pPr>
+              <w:pStyle w:val="Compact"/>
+            </w:pPr>
+            <w:r>
+              <w:rPr>
+                <w:lang w:val="nl"/>
+              </w:rPr>
+              <w:t xml:space="preserve">l b</w:t>
+            </w:r>
+          </w:p>
+        </w:tc>
+        <w:tc>
+          <w:tcPr/>
+          <w:p>
+            <w:pPr>
+              <w:pStyle w:val="Compact"/>
+            </w:pPr>
+            <w:r>
+              <w:rPr>
+                <w:lang w:val="nl"/>
+              </w:rPr>
+              <w:t xml:space="preserve">–</w:t>
+            </w:r>
+          </w:p>
+        </w:tc>
+        <w:tc>
+          <w:tcPr/>
+          <w:p>
+            <w:pPr>
+              <w:pStyle w:val="Compact"/>
+            </w:pPr>
+            <w:r>
+              <w:rPr>
+                <w:lang w:val="nl"/>
+              </w:rPr>
+              <w:t xml:space="preserve">–</w:t>
+            </w:r>
+          </w:p>
+        </w:tc>
+        <w:tc>
+          <w:tcPr/>
+          <w:p>
+            <w:pPr>
+              <w:pStyle w:val="Compact"/>
+            </w:pPr>
+            <w:r>
+              <w:rPr>
+                <w:lang w:val="nl"/>
+              </w:rPr>
+              <w:t xml:space="preserve">alles</w:t>
+            </w:r>
+          </w:p>
+        </w:tc>
+      </w:tr>
+      <w:tr>
+        <w:tc>
+          <w:tcPr/>
+          <w:p>
+            <w:pPr>
+              <w:pStyle w:val="Compact"/>
+            </w:pPr>
+            <w:r>
+              <w:rPr>
+                <w:lang w:val="nl"/>
+              </w:rPr>
+              <w:t xml:space="preserve">Instellingen</w:t>
+            </w:r>
+          </w:p>
+        </w:tc>
+        <w:tc>
+          <w:tcPr/>
+          <w:p>
+            <w:pPr>
+              <w:pStyle w:val="Compact"/>
+            </w:pPr>
+            <w:r>
+              <w:rPr>
+                <w:lang w:val="nl"/>
+              </w:rPr>
+              <w:t xml:space="preserve">–</w:t>
+            </w:r>
+          </w:p>
+        </w:tc>
+        <w:tc>
+          <w:tcPr/>
+          <w:p>
+            <w:pPr>
+              <w:pStyle w:val="Compact"/>
+            </w:pPr>
+            <w:r>
+              <w:rPr>
+                <w:lang w:val="nl"/>
+              </w:rPr>
+              <w:t xml:space="preserve">l b</w:t>
+            </w:r>
+          </w:p>
+        </w:tc>
+        <w:tc>
+          <w:tcPr/>
+          <w:p>
+            <w:pPr>
+              <w:pStyle w:val="Compact"/>
+            </w:pPr>
+            <w:r>
+              <w:rPr>
+                <w:lang w:val="nl"/>
+              </w:rPr>
+              <w:t xml:space="preserve">–</w:t>
+            </w:r>
+          </w:p>
+        </w:tc>
+        <w:tc>
+          <w:tcPr/>
+          <w:p>
+            <w:pPr>
+              <w:pStyle w:val="Compact"/>
+            </w:pPr>
+            <w:r>
+              <w:rPr>
+                <w:lang w:val="nl"/>
+              </w:rPr>
+              <w:t xml:space="preserve">–</w:t>
+            </w:r>
+          </w:p>
+        </w:tc>
+        <w:tc>
+          <w:tcPr/>
+          <w:p>
+            <w:pPr>
+              <w:pStyle w:val="Compact"/>
+            </w:pPr>
+            <w:r>
+              <w:rPr>
+                <w:lang w:val="nl"/>
+              </w:rPr>
+              <w:t xml:space="preserve">alles</w:t>
+            </w:r>
+          </w:p>
+        </w:tc>
+      </w:tr>
+      <w:tr>
+        <w:tc>
+          <w:tcPr/>
+          <w:p>
+            <w:pPr>
+              <w:pStyle w:val="Compact"/>
+            </w:pPr>
+            <w:r>
+              <w:rPr>
+                <w:lang w:val="nl"/>
+              </w:rPr>
+              <w:t xml:space="preserve">Accounts &amp; rollen</w:t>
+            </w:r>
+          </w:p>
+        </w:tc>
+        <w:tc>
+          <w:tcPr/>
+          <w:p>
+            <w:pPr>
+              <w:pStyle w:val="Compact"/>
+            </w:pPr>
+            <w:r>
+              <w:rPr>
+                <w:lang w:val="nl"/>
+              </w:rPr>
+              <w:t xml:space="preserve">–</w:t>
+            </w:r>
+          </w:p>
+        </w:tc>
+        <w:tc>
+          <w:tcPr/>
+          <w:p>
+            <w:pPr>
+              <w:pStyle w:val="Compact"/>
+            </w:pPr>
+            <w:r>
+              <w:rPr>
+                <w:lang w:val="nl"/>
+              </w:rPr>
+              <w:t xml:space="preserve">–</w:t>
+            </w:r>
+          </w:p>
+        </w:tc>
+        <w:tc>
+          <w:tcPr/>
+          <w:p>
+            <w:pPr>
+              <w:pStyle w:val="Compact"/>
+            </w:pPr>
+            <w:r>
+              <w:rPr>
+                <w:lang w:val="nl"/>
+              </w:rPr>
+              <w:t xml:space="preserve">–</w:t>
+            </w:r>
+          </w:p>
+        </w:tc>
+        <w:tc>
+          <w:tcPr/>
+          <w:p>
+            <w:pPr>
+              <w:pStyle w:val="Compact"/>
+            </w:pPr>
+            <w:r>
+              <w:rPr>
+                <w:lang w:val="nl"/>
+              </w:rPr>
+              <w:t xml:space="preserve">–</w:t>
+            </w:r>
+          </w:p>
+        </w:tc>
+        <w:tc>
+          <w:tcPr/>
+          <w:p>
+            <w:pPr>
+              <w:pStyle w:val="Compact"/>
+            </w:pPr>
+            <w:r>
+              <w:rPr>
+                <w:lang w:val="nl"/>
+              </w:rPr>
+              <w:t xml:space="preserve">alles</w:t>
+            </w:r>
+          </w:p>
+        </w:tc>
+      </w:tr>
+      <w:tr>
+        <w:tc>
+          <w:tcPr/>
+          <w:p>
+            <w:pPr>
+              <w:pStyle w:val="Compact"/>
+            </w:pPr>
+            <w:r>
+              <w:rPr>
+                <w:lang w:val="nl"/>
+              </w:rPr>
+              <w:t xml:space="preserve">Systeem, updates &amp; logs</w:t>
+            </w:r>
+          </w:p>
+        </w:tc>
+        <w:tc>
+          <w:tcPr/>
+          <w:p>
+            <w:pPr>
+              <w:pStyle w:val="Compact"/>
+            </w:pPr>
+            <w:r>
+              <w:rPr>
+                <w:lang w:val="nl"/>
+              </w:rPr>
+              <w:t xml:space="preserve">–</w:t>
+            </w:r>
+          </w:p>
+        </w:tc>
+        <w:tc>
+          <w:tcPr/>
+          <w:p>
+            <w:pPr>
+              <w:pStyle w:val="Compact"/>
+            </w:pPr>
+            <w:r>
+              <w:rPr>
+                <w:lang w:val="nl"/>
+              </w:rPr>
+              <w:t xml:space="preserve">–</w:t>
+            </w:r>
+          </w:p>
+        </w:tc>
+        <w:tc>
+          <w:tcPr/>
+          <w:p>
+            <w:pPr>
+              <w:pStyle w:val="Compact"/>
+            </w:pPr>
+            <w:r>
+              <w:rPr>
+                <w:lang w:val="nl"/>
+              </w:rPr>
+              <w:t xml:space="preserve">–</w:t>
+            </w:r>
+          </w:p>
+        </w:tc>
+        <w:tc>
+          <w:tcPr/>
+          <w:p>
+            <w:pPr>
+              <w:pStyle w:val="Compact"/>
+            </w:pPr>
+            <w:r>
+              <w:rPr>
+                <w:lang w:val="nl"/>
+              </w:rPr>
+              <w:t xml:space="preserve">–</w:t>
+            </w:r>
+          </w:p>
+        </w:tc>
+        <w:tc>
+          <w:tcPr/>
+          <w:p>
+            <w:pPr>
+              <w:pStyle w:val="Compact"/>
+            </w:pPr>
+            <w:r>
+              <w:rPr>
+                <w:lang w:val="nl"/>
+              </w:rPr>
+              <w:t xml:space="preserve">alles</w:t>
+            </w:r>
+          </w:p>
+        </w:tc>
+      </w:tr>
+      <w:tr>
+        <w:tc>
+          <w:tcPr/>
+          <w:p>
+            <w:pPr>
+              <w:pStyle w:val="Compact"/>
+            </w:pPr>
+            <w:r>
+              <w:rPr>
+                <w:lang w:val="nl"/>
+              </w:rPr>
+              <w:t xml:space="preserve">Logboek (alle logs)</w:t>
+            </w:r>
+          </w:p>
+        </w:tc>
+        <w:tc>
+          <w:tcPr/>
+          <w:p>
+            <w:pPr>
+              <w:pStyle w:val="Compact"/>
+            </w:pPr>
+            <w:r>
+              <w:rPr>
+                <w:lang w:val="nl"/>
+              </w:rPr>
+              <w:t xml:space="preserve">–</w:t>
+            </w:r>
+          </w:p>
+        </w:tc>
+        <w:tc>
+          <w:tcPr/>
+          <w:p>
+            <w:pPr>
+              <w:pStyle w:val="Compact"/>
+            </w:pPr>
+            <w:r>
+              <w:rPr>
+                <w:lang w:val="nl"/>
+              </w:rPr>
+              <w:t xml:space="preserve">–</w:t>
+            </w:r>
+          </w:p>
+        </w:tc>
+        <w:tc>
+          <w:tcPr/>
+          <w:p>
+            <w:pPr>
+              <w:pStyle w:val="Compact"/>
+            </w:pPr>
+            <w:r>
+              <w:rPr>
+                <w:lang w:val="nl"/>
+              </w:rPr>
+              <w:t xml:space="preserve">–</w:t>
+            </w:r>
+          </w:p>
+        </w:tc>
+        <w:tc>
+          <w:tcPr/>
+          <w:p>
+            <w:pPr>
+              <w:pStyle w:val="Compact"/>
+            </w:pPr>
+            <w:r>
+              <w:rPr>
+                <w:lang w:val="nl"/>
+              </w:rPr>
+              <w:t xml:space="preserve">–</w:t>
+            </w:r>
+          </w:p>
+        </w:tc>
+        <w:tc>
+          <w:tcPr/>
+          <w:p>
+            <w:pPr>
+              <w:pStyle w:val="Compact"/>
+            </w:pPr>
+            <w:r>
+              <w:rPr>
+                <w:lang w:val="nl"/>
+              </w:rPr>
               <w:t xml:space="preserve">alles</w:t>
             </w:r>
           </w:p>
@@ -44793,37 +45550,88 @@
         <w:rPr>
           <w:lang w:val="nl"/>
         </w:rPr>
-        <w:t xml:space="preserve">Wat Selectiedag lezen voor de begeleider betekent: groepen bekijken, inchecken, cijfers en</w:t>
-      </w:r>
-      <w:r>
-        <w:rPr>
-          <w:lang w:val="nl"/>
-        </w:rPr>
-        <w:t xml:space="preserve"> </w:t>
-      </w:r>
-      <w:r>
-        <w:rPr>
-          <w:lang w:val="nl"/>
-        </w:rPr>
-        <w:t xml:space="preserve">observaties geven en de eigen observaties verwijderen. Bewerken (bestuur) voegt de tabletcode, de</w:t>
-      </w:r>
-      <w:r>
-        <w:rPr>
-          <w:lang w:val="nl"/>
-        </w:rPr>
-        <w:t xml:space="preserve"> </w:t>
-      </w:r>
-      <w:r>
-        <w:rPr>
-          <w:lang w:val="nl"/>
-        </w:rPr>
-        <w:t xml:space="preserve">groepsindeling, de nabespreking, de bellijst en het besluit na het trainingsweekend toe.</w:t>
-      </w:r>
-    </w:p>
-    <w:p>
-      <w:pPr>
-        <w:pStyle w:val="BodyText"/>
-      </w:pPr>
+        <w:t xml:space="preserve">Taken bestaan sinds versie 2.141. Tot je de matrix de eerste keer opslaat, volgt elke taak het oude</w:t>
+      </w:r>
+      <w:r>
+        <w:rPr>
+          <w:lang w:val="nl"/>
+        </w:rPr>
+        <w:t xml:space="preserve"> </w:t>
+      </w:r>
+      <w:r>
+        <w:rPr>
+          <w:lang w:val="nl"/>
+        </w:rPr>
+        <w:t xml:space="preserve">recht, dus niemand kan meer of minder dan daarvoor. Zet je één taak met basis "bewerken" uit</w:t>
+      </w:r>
+      <w:r>
+        <w:rPr>
+          <w:lang w:val="nl"/>
+        </w:rPr>
+        <w:t xml:space="preserve"> </w:t>
+      </w:r>
+      <w:r>
+        <w:rPr>
+          <w:lang w:val="nl"/>
+        </w:rPr>
+        <w:t xml:space="preserve">(bijvoorbeeld</w:t>
+      </w:r>
+      <w:r>
+        <w:rPr>
+          <w:lang w:val="nl"/>
+        </w:rPr>
+        <w:t xml:space="preserve"> </w:t>
+      </w:r>
+      <w:r>
+        <w:rPr>
+          <w:b/>
+          <w:bCs/>
+          <w:lang w:val="nl"/>
+        </w:rPr>
+        <w:t xml:space="preserve">Definitief maken</w:t>
+      </w:r>
+      <w:r>
+        <w:rPr>
+          <w:lang w:val="nl"/>
+        </w:rPr>
+        <w:t xml:space="preserve"> </w:t>
+      </w:r>
+      <w:r>
+        <w:rPr>
+          <w:lang w:val="nl"/>
+        </w:rPr>
+        <w:t xml:space="preserve">bij de loonplanning), dan telt dat onderdeel voor schermen die</w:t>
+      </w:r>
+      <w:r>
+        <w:rPr>
+          <w:lang w:val="nl"/>
+        </w:rPr>
+        <w:t xml:space="preserve"> </w:t>
+      </w:r>
+      <w:r>
+        <w:rPr>
+          <w:lang w:val="nl"/>
+        </w:rPr>
+        <w:t xml:space="preserve">nog op het oude bewerkrecht controleren als "niet bewerken": streng, zodat een losse taak nooit</w:t>
+      </w:r>
+      <w:r>
+        <w:rPr>
+          <w:lang w:val="nl"/>
+        </w:rPr>
+        <w:t xml:space="preserve"> </w:t>
+      </w:r>
+      <w:r>
+        <w:rPr>
+          <w:lang w:val="nl"/>
+        </w:rPr>
+        <w:t xml:space="preserve">meer opent dan bedoeld.</w:t>
+      </w:r>
+      <w:r>
+        <w:rPr>
+          <w:lang w:val="nl"/>
+        </w:rPr>
+        <w:t xml:space="preserve"> </w:t>
+      </w:r>
       <w:r>
         <w:rPr>
           <w:lang w:val="nl"/>

</xml_diff>

<commit_message>
2.159.0 Na de selectiedag: naar de bellijst in plaats van direct uitnodigen
- bh_fase_actie(): link naar de bellijst (bh_bellijst_route()), dossierkop en lijstrij
- Bulkactie uitnodigen_tw weg (ook server-side), api_fase zonder snelle uitnodiging
</commit_message>
<xml_diff>
--- a/docs/handleiding/word/handleiding_beheer.docx
+++ b/docs/handleiding/word/handleiding_beheer.docx
@@ -16688,7 +16688,19 @@
                 <w:bCs/>
                 <w:lang w:val="nl"/>
               </w:rPr>
-              <w:t xml:space="preserve">Uitnodigen weekend</w:t>
+              <w:t xml:space="preserve">Bellijst</w:t>
+            </w:r>
+            <w:r>
+              <w:rPr>
+                <w:lang w:val="nl"/>
+              </w:rPr>
+              <w:t xml:space="preserve"> </w:t>
+            </w:r>
+            <w:r>
+              <w:rPr>
+                <w:lang w:val="nl"/>
+              </w:rPr>
+              <w:t xml:space="preserve">(opent de bellijst bij deze persoon)</w:t>
             </w:r>
           </w:p>
         </w:tc>
@@ -16734,6 +16746,62 @@
         <w:rPr>
           <w:lang w:val="nl"/>
         </w:rPr>
+        <w:t xml:space="preserve">Na de selectiedag nodig je niet uit vanaf de lijst: eerst bel je, en op de bellijst voer je het</w:t>
+      </w:r>
+      <w:r>
+        <w:rPr>
+          <w:lang w:val="nl"/>
+        </w:rPr>
+        <w:t xml:space="preserve"> </w:t>
+      </w:r>
+      <w:r>
+        <w:rPr>
+          <w:lang w:val="nl"/>
+        </w:rPr>
+        <w:t xml:space="preserve">besluit door (door naar het weekend of afwijzen). Zo gaat er geen uitnodiging uit vóór het telefoontje.</w:t>
+      </w:r>
+      <w:r>
+        <w:rPr>
+          <w:lang w:val="nl"/>
+        </w:rPr>
+        <w:t xml:space="preserve"> </w:t>
+      </w:r>
+      <w:r>
+        <w:rPr>
+          <w:lang w:val="nl"/>
+        </w:rPr>
+        <w:t xml:space="preserve">Staat de module Selectiedag uit (dan is er geen bellijst), dan is de knop weer</w:t>
+      </w:r>
+      <w:r>
+        <w:rPr>
+          <w:lang w:val="nl"/>
+        </w:rPr>
+        <w:t xml:space="preserve"> </w:t>
+      </w:r>
+      <w:r>
+        <w:rPr>
+          <w:b/>
+          <w:bCs/>
+          <w:lang w:val="nl"/>
+        </w:rPr>
+        <w:t xml:space="preserve">Uitnodigen weekend</w:t>
+      </w:r>
+      <w:r>
+        <w:rPr>
+          <w:lang w:val="nl"/>
+        </w:rPr>
+        <w:t xml:space="preserve">.</w:t>
+      </w:r>
+      <w:r>
+        <w:rPr>
+          <w:lang w:val="nl"/>
+        </w:rPr>
+        <w:t xml:space="preserve"> </w:t>
+      </w:r>
+      <w:r>
+        <w:rPr>
+          <w:lang w:val="nl"/>
+        </w:rPr>
         <w:t xml:space="preserve">In de andere fases wacht het systeem op de sollicitant of op de selectiedag, en is er dus niets</w:t>
       </w:r>
       <w:r>
@@ -16957,7 +17025,7 @@
           <w:bCs/>
           <w:lang w:val="nl"/>
         </w:rPr>
-        <w:t xml:space="preserve">Uitnodigen trainingsweekend</w:t>
+        <w:t xml:space="preserve">Aannemen</w:t>
       </w:r>
       <w:r>
         <w:rPr>
@@ -16977,7 +17045,7 @@
           <w:bCs/>
           <w:lang w:val="nl"/>
         </w:rPr>
-        <w:t xml:space="preserve">Aannemen</w:t>
+        <w:t xml:space="preserve">Afwijzen</w:t>
       </w:r>
       <w:r>
         <w:rPr>
@@ -16997,7 +17065,7 @@
           <w:bCs/>
           <w:lang w:val="nl"/>
         </w:rPr>
-        <w:t xml:space="preserve">Afwijzen</w:t>
+        <w:t xml:space="preserve">Herinnering</w:t>
       </w:r>
       <w:r>
         <w:rPr>
@@ -17017,26 +17085,6 @@
           <w:bCs/>
           <w:lang w:val="nl"/>
         </w:rPr>
-        <w:t xml:space="preserve">Herinnering</w:t>
-      </w:r>
-      <w:r>
-        <w:rPr>
-          <w:lang w:val="nl"/>
-        </w:rPr>
-        <w:t xml:space="preserve">,</w:t>
-      </w:r>
-      <w:r>
-        <w:rPr>
-          <w:lang w:val="nl"/>
-        </w:rPr>
-        <w:t xml:space="preserve"> </w:t>
-      </w:r>
-      <w:r>
-        <w:rPr>
-          <w:b/>
-          <w:bCs/>
-          <w:lang w:val="nl"/>
-        </w:rPr>
         <w:t xml:space="preserve">Bericht</w:t>
       </w:r>
       <w:r>
@@ -17069,19 +17117,45 @@
         <w:rPr>
           <w:lang w:val="nl"/>
         </w:rPr>
-        <w:t xml:space="preserve">. Een uitnodigknop verschijnt alleen als iedereen in je selectie in</w:t>
-      </w:r>
-      <w:r>
-        <w:rPr>
-          <w:lang w:val="nl"/>
-        </w:rPr>
-        <w:t xml:space="preserve"> </w:t>
-      </w:r>
-      <w:r>
-        <w:rPr>
-          <w:lang w:val="nl"/>
-        </w:rPr>
-        <w:t xml:space="preserve">de juiste fase staat (Aangemeld voor de selectiedag, Selectiedag geweest voor het trainingsweekend).</w:t>
+        <w:t xml:space="preserve">.</w:t>
+      </w:r>
+      <w:r>
+        <w:rPr>
+          <w:lang w:val="nl"/>
+        </w:rPr>
+        <w:t xml:space="preserve"> </w:t>
+      </w:r>
+      <w:r>
+        <w:rPr>
+          <w:b/>
+          <w:bCs/>
+          <w:lang w:val="nl"/>
+        </w:rPr>
+        <w:t xml:space="preserve">Uitnodigen selectiedag</w:t>
+      </w:r>
+      <w:r>
+        <w:rPr>
+          <w:lang w:val="nl"/>
+        </w:rPr>
+        <w:t xml:space="preserve"> </w:t>
+      </w:r>
+      <w:r>
+        <w:rPr>
+          <w:lang w:val="nl"/>
+        </w:rPr>
+        <w:t xml:space="preserve">verschijnt alleen als iedereen in je selectie op Aangemeld staat.</w:t>
+      </w:r>
+      <w:r>
+        <w:rPr>
+          <w:lang w:val="nl"/>
+        </w:rPr>
+        <w:t xml:space="preserve"> </w:t>
+      </w:r>
+      <w:r>
+        <w:rPr>
+          <w:lang w:val="nl"/>
+        </w:rPr>
+        <w:t xml:space="preserve">Uitnodigen voor het trainingsweekend gaat via de bellijst, niet via de bulkbalk.</w:t>
       </w:r>
     </w:p>
     <w:p>
@@ -18648,6 +18722,52 @@
         <w:rPr>
           <w:lang w:val="nl"/>
         </w:rPr>
+        <w:t xml:space="preserve"> </w:t>
+      </w:r>
+      <w:r>
+        <w:rPr>
+          <w:lang w:val="nl"/>
+        </w:rPr>
+        <w:t xml:space="preserve">of</w:t>
+      </w:r>
+      <w:r>
+        <w:rPr>
+          <w:lang w:val="nl"/>
+        </w:rPr>
+        <w:t xml:space="preserve"> </w:t>
+      </w:r>
+      <w:r>
+        <w:rPr>
+          <w:b/>
+          <w:bCs/>
+          <w:lang w:val="nl"/>
+        </w:rPr>
+        <w:t xml:space="preserve">Aannemen</w:t>
+      </w:r>
+      <w:r>
+        <w:rPr>
+          <w:lang w:val="nl"/>
+        </w:rPr>
+        <w:t xml:space="preserve">, afhankelijk van de fase; na de selectiedag</w:t>
+      </w:r>
+      <w:r>
+        <w:rPr>
+          <w:lang w:val="nl"/>
+        </w:rPr>
+        <w:t xml:space="preserve"> </w:t>
+      </w:r>
+      <w:r>
+        <w:rPr>
+          <w:b/>
+          <w:bCs/>
+          <w:lang w:val="nl"/>
+        </w:rPr>
+        <w:t xml:space="preserve">Naar de bellijst</w:t>
+      </w:r>
+      <w:r>
+        <w:rPr>
+          <w:lang w:val="nl"/>
+        </w:rPr>
         <w:t xml:space="preserve">,</w:t>
       </w:r>
       <w:r>
@@ -18658,43 +18778,9 @@
       </w:r>
       <w:r>
         <w:rPr>
-          <w:b/>
-          <w:bCs/>
-          <w:lang w:val="nl"/>
-        </w:rPr>
-        <w:t xml:space="preserve">Uitnodigen trainingsweekend</w:t>
-      </w:r>
-      <w:r>
-        <w:rPr>
-          <w:lang w:val="nl"/>
-        </w:rPr>
-        <w:t xml:space="preserve"> </w:t>
-      </w:r>
-      <w:r>
-        <w:rPr>
-          <w:lang w:val="nl"/>
-        </w:rPr>
-        <w:t xml:space="preserve">of</w:t>
-      </w:r>
-      <w:r>
-        <w:rPr>
-          <w:lang w:val="nl"/>
-        </w:rPr>
-        <w:t xml:space="preserve"> </w:t>
-      </w:r>
-      <w:r>
-        <w:rPr>
-          <w:b/>
-          <w:bCs/>
-          <w:lang w:val="nl"/>
-        </w:rPr>
-        <w:t xml:space="preserve">Aannemen</w:t>
-      </w:r>
-      <w:r>
-        <w:rPr>
-          <w:lang w:val="nl"/>
-        </w:rPr>
-        <w:t xml:space="preserve">, afhankelijk van de fase),</w:t>
+          <w:lang w:val="nl"/>
+        </w:rPr>
+        <w:t xml:space="preserve">want daar bel je en voer je het besluit door),</w:t>
       </w:r>
       <w:r>
         <w:rPr>
@@ -22986,7 +23072,7 @@
               <w:rPr>
                 <w:lang w:val="nl"/>
               </w:rPr>
-              <w:t xml:space="preserve">Doorvoeren van Door op de bellijst, of</w:t>
+              <w:t xml:space="preserve">Doorvoeren van Door op de bellijst (nadat je gebeld hebt). Alleen zonder de module Selectiedag:</w:t>
             </w:r>
             <w:r>
               <w:rPr>
@@ -23012,33 +23098,7 @@
               <w:rPr>
                 <w:lang w:val="nl"/>
               </w:rPr>
-              <w:t xml:space="preserve">(lijst) /</w:t>
-            </w:r>
-            <w:r>
-              <w:rPr>
-                <w:lang w:val="nl"/>
-              </w:rPr>
-              <w:t xml:space="preserve"> </w:t>
-            </w:r>
-            <w:r>
-              <w:rPr>
-                <w:b/>
-                <w:bCs/>
-                <w:lang w:val="nl"/>
-              </w:rPr>
-              <w:t xml:space="preserve">Uitnodigen trainingsweekend</w:t>
-            </w:r>
-            <w:r>
-              <w:rPr>
-                <w:lang w:val="nl"/>
-              </w:rPr>
-              <w:t xml:space="preserve"> </w:t>
-            </w:r>
-            <w:r>
-              <w:rPr>
-                <w:lang w:val="nl"/>
-              </w:rPr>
-              <w:t xml:space="preserve">(dossier of bulk).</w:t>
+              <w:t xml:space="preserve">in de lijst of het dossier.</w:t>
             </w:r>
           </w:p>
         </w:tc>

</xml_diff>

<commit_message>
2.161.1: logica in WhatsApp- en sms-berichten
- Tekengrens van de korte tekst geldt voor de langste variant (sjabloon_langste_lengte,
  sjabloon_kort_controle; links geschat op 60 tekens). Veld-maxlength ruimer, controle op de server.
- Losse {{ of }}: geweigerd bij opslaan, leeg veld + fout bij opmaken, en melding_verzend_item stuurt
  geen korte tekst met {{ of }} naar WhatsApp of sms (e-mail blijft terugval).
- wa_verstuur_res: json_encode met JSON_INVALID_UTF8_SUBSTITUTE, geen lege of onleesbare aanvraag.
- berichten.js: logica-tags in het WhatsApp-voorbeeld als code, variabelen voor opmaak gematcht.
</commit_message>
<xml_diff>
--- a/docs/handleiding/word/handleiding_beheer.docx
+++ b/docs/handleiding/word/handleiding_beheer.docx
@@ -40883,6 +40883,215 @@
           <w:lang w:val="nl"/>
         </w:rPr>
         <w:t xml:space="preserve">.</w:t>
+      </w:r>
+    </w:p>
+    <w:p>
+      <w:pPr>
+        <w:pStyle w:val="BodyText"/>
+      </w:pPr>
+      <w:r>
+        <w:rPr>
+          <w:b/>
+          <w:bCs/>
+          <w:lang w:val="nl"/>
+        </w:rPr>
+        <w:t xml:space="preserve">In WhatsApp en sms.</w:t>
+      </w:r>
+      <w:r>
+        <w:rPr>
+          <w:lang w:val="nl"/>
+        </w:rPr>
+        <w:t xml:space="preserve"> </w:t>
+      </w:r>
+      <w:r>
+        <w:rPr>
+          <w:lang w:val="nl"/>
+        </w:rPr>
+        <w:t xml:space="preserve">De logica in de korte tekst wordt per ontvanger uitgerekend vóórdat het</w:t>
+      </w:r>
+      <w:r>
+        <w:rPr>
+          <w:lang w:val="nl"/>
+        </w:rPr>
+        <w:t xml:space="preserve"> </w:t>
+      </w:r>
+      <w:r>
+        <w:rPr>
+          <w:lang w:val="nl"/>
+        </w:rPr>
+        <w:t xml:space="preserve">bericht de deur uitgaat: WhatsApp en sms krijgen alleen de eindtekst, nooit</w:t>
+      </w:r>
+      <w:r>
+        <w:rPr>
+          <w:lang w:val="nl"/>
+        </w:rPr>
+        <w:t xml:space="preserve"> </w:t>
+      </w:r>
+      <w:r>
+        <w:rPr>
+          <w:rStyle w:val="VerbatimChar"/>
+          <w:lang w:val="nl"/>
+        </w:rPr>
+        <w:t xml:space="preserve">{{als …}}</w:t>
+      </w:r>
+      <w:r>
+        <w:rPr>
+          <w:lang w:val="nl"/>
+        </w:rPr>
+        <w:t xml:space="preserve">. Het</w:t>
+      </w:r>
+      <w:r>
+        <w:rPr>
+          <w:lang w:val="nl"/>
+        </w:rPr>
+        <w:t xml:space="preserve"> </w:t>
+      </w:r>
+      <w:r>
+        <w:rPr>
+          <w:lang w:val="nl"/>
+        </w:rPr>
+        <w:t xml:space="preserve">maximum (400 tekens bij een sjabloon, 1000 bij een zelf geschreven bericht) geldt voor de</w:t>
+      </w:r>
+      <w:r>
+        <w:rPr>
+          <w:lang w:val="nl"/>
+        </w:rPr>
+        <w:t xml:space="preserve"> </w:t>
+      </w:r>
+      <w:r>
+        <w:rPr>
+          <w:b/>
+          <w:bCs/>
+          <w:lang w:val="nl"/>
+        </w:rPr>
+        <w:t xml:space="preserve">langste</w:t>
+      </w:r>
+      <w:r>
+        <w:rPr>
+          <w:b/>
+          <w:bCs/>
+          <w:lang w:val="nl"/>
+        </w:rPr>
+        <w:t xml:space="preserve"> </w:t>
+      </w:r>
+      <w:r>
+        <w:rPr>
+          <w:b/>
+          <w:bCs/>
+          <w:lang w:val="nl"/>
+        </w:rPr>
+        <w:t xml:space="preserve">variant</w:t>
+      </w:r>
+      <w:r>
+        <w:rPr>
+          <w:lang w:val="nl"/>
+        </w:rPr>
+        <w:t xml:space="preserve">, niet voor de tekst met logica erin; links tellen daarbij als 60 tekens. Is de langste</w:t>
+      </w:r>
+      <w:r>
+        <w:rPr>
+          <w:lang w:val="nl"/>
+        </w:rPr>
+        <w:t xml:space="preserve"> </w:t>
+      </w:r>
+      <w:r>
+        <w:rPr>
+          <w:lang w:val="nl"/>
+        </w:rPr>
+        <w:t xml:space="preserve">variant te lang, dan wordt niet opgeslagen of verstuurd (anders zou WhatsApp hem afkappen met</w:t>
+      </w:r>
+      <w:r>
+        <w:rPr>
+          <w:lang w:val="nl"/>
+        </w:rPr>
+        <w:t xml:space="preserve"> </w:t>
+      </w:r>
+      <w:r>
+        <w:rPr>
+          <w:lang w:val="nl"/>
+        </w:rPr>
+        <w:t xml:space="preserve">"..."). In het WhatsApp-voorbeeld onder het tekstveld staat de logica grijs gestippeld met alle</w:t>
+      </w:r>
+      <w:r>
+        <w:rPr>
+          <w:lang w:val="nl"/>
+        </w:rPr>
+        <w:t xml:space="preserve"> </w:t>
+      </w:r>
+      <w:r>
+        <w:rPr>
+          <w:lang w:val="nl"/>
+        </w:rPr>
+        <w:t xml:space="preserve">takken; wat één persoon krijgt zie je met</w:t>
+      </w:r>
+      <w:r>
+        <w:rPr>
+          <w:lang w:val="nl"/>
+        </w:rPr>
+        <w:t xml:space="preserve"> </w:t>
+      </w:r>
+      <w:r>
+        <w:rPr>
+          <w:b/>
+          <w:bCs/>
+          <w:lang w:val="nl"/>
+        </w:rPr>
+        <w:t xml:space="preserve">Voorbeeld</w:t>
+      </w:r>
+      <w:r>
+        <w:rPr>
+          <w:lang w:val="nl"/>
+        </w:rPr>
+        <w:t xml:space="preserve">. Blijft er toch iets als</w:t>
+      </w:r>
+      <w:r>
+        <w:rPr>
+          <w:lang w:val="nl"/>
+        </w:rPr>
+        <w:t xml:space="preserve"> </w:t>
+      </w:r>
+      <w:r>
+        <w:rPr>
+          <w:rStyle w:val="VerbatimChar"/>
+          <w:lang w:val="nl"/>
+        </w:rPr>
+        <w:t xml:space="preserve">{{</w:t>
+      </w:r>
+      <w:r>
+        <w:rPr>
+          <w:lang w:val="nl"/>
+        </w:rPr>
+        <w:t xml:space="preserve"> </w:t>
+      </w:r>
+      <w:r>
+        <w:rPr>
+          <w:lang w:val="nl"/>
+        </w:rPr>
+        <w:t xml:space="preserve">in de</w:t>
+      </w:r>
+      <w:r>
+        <w:rPr>
+          <w:lang w:val="nl"/>
+        </w:rPr>
+        <w:t xml:space="preserve"> </w:t>
+      </w:r>
+      <w:r>
+        <w:rPr>
+          <w:lang w:val="nl"/>
+        </w:rPr>
+        <w:t xml:space="preserve">eindtekst staan, dan gaat het bericht niet via WhatsApp of sms (wel per e-mail als die als</w:t>
+      </w:r>
+      <w:r>
+        <w:rPr>
+          <w:lang w:val="nl"/>
+        </w:rPr>
+        <w:t xml:space="preserve"> </w:t>
+      </w:r>
+      <w:r>
+        <w:rPr>
+          <w:lang w:val="nl"/>
+        </w:rPr>
+        <w:t xml:space="preserve">terugval gepland is) en staat de reden in het log.</w:t>
       </w:r>
     </w:p>
     <w:p>

</xml_diff>

<commit_message>
2.161.2: automatische berichten pas vanaf 07:00
- melding_automatisch_nu()/melding_automatisch_vanaf() (instelling melding.auto_vanaf_uur, standaard 7).
- cron_groepen(): herinneringen (incl. geplande berichten) en auto_invite wachten tot dat uur;
  opruimtaken draaien gewoon. "Nu draaien" en alles wat een mens of de sollicitant zelf in gang zet
  blijft direct. Bewust geen eindtijd (besluit Lucas).
- Veld in Instellingen › Uitnodigen & herinneren › Grenzen (veldenlijst = whitelist).
</commit_message>
<xml_diff>
--- a/docs/handleiding/word/handleiding_beheer.docx
+++ b/docs/handleiding/word/handleiding_beheer.docx
@@ -41777,7 +41777,110 @@
         <w:rPr>
           <w:lang w:val="nl"/>
         </w:rPr>
-        <w:t xml:space="preserve">Onder de regels staan nog vier instellingen:</w:t>
+        <w:t xml:space="preserve">Onder de regels staan nog vijf instellingen:</w:t>
+      </w:r>
+    </w:p>
+    <w:p>
+      <w:pPr>
+        <w:pStyle w:val="Compact"/>
+        <w:numPr>
+          <w:ilvl w:val="0"/>
+          <w:numId w:val="1085"/>
+        </w:numPr>
+      </w:pPr>
+      <w:r>
+        <w:rPr>
+          <w:b/>
+          <w:bCs/>
+          <w:lang w:val="nl"/>
+        </w:rPr>
+        <w:t xml:space="preserve">Automatische berichten vanaf (uur)</w:t>
+      </w:r>
+      <w:r>
+        <w:rPr>
+          <w:lang w:val="nl"/>
+        </w:rPr>
+        <w:t xml:space="preserve">, standaard 7: herinneringen, geplande berichten en</w:t>
+      </w:r>
+      <w:r>
+        <w:rPr>
+          <w:lang w:val="nl"/>
+        </w:rPr>
+        <w:t xml:space="preserve"> </w:t>
+      </w:r>
+      <w:r>
+        <w:rPr>
+          <w:lang w:val="nl"/>
+        </w:rPr>
+        <w:t xml:space="preserve">automatisch uitnodigen gaan niet eerder de deur uit dan 07:00. Een herinnering die op een dag aan</w:t>
+      </w:r>
+      <w:r>
+        <w:rPr>
+          <w:lang w:val="nl"/>
+        </w:rPr>
+        <w:t xml:space="preserve"> </w:t>
+      </w:r>
+      <w:r>
+        <w:rPr>
+          <w:lang w:val="nl"/>
+        </w:rPr>
+        <w:t xml:space="preserve">de beurt is, komt dus 's ochtends aan en niet net na middernacht. 0 = de hele dag. Er is bewust</w:t>
+      </w:r>
+      <w:r>
+        <w:rPr>
+          <w:lang w:val="nl"/>
+        </w:rPr>
+        <w:t xml:space="preserve"> </w:t>
+      </w:r>
+      <w:r>
+        <w:rPr>
+          <w:lang w:val="nl"/>
+        </w:rPr>
+        <w:t xml:space="preserve">geen eindtijd: wat na 07:00 aan de beurt raakt, gaat meteen. Wat je zelf in gang zet (fase</w:t>
+      </w:r>
+      <w:r>
+        <w:rPr>
+          <w:lang w:val="nl"/>
+        </w:rPr>
+        <w:t xml:space="preserve"> </w:t>
+      </w:r>
+      <w:r>
+        <w:rPr>
+          <w:lang w:val="nl"/>
+        </w:rPr>
+        <w:t xml:space="preserve">omzetten, handmatig bericht,</w:t>
+      </w:r>
+      <w:r>
+        <w:rPr>
+          <w:lang w:val="nl"/>
+        </w:rPr>
+        <w:t xml:space="preserve"> </w:t>
+      </w:r>
+      <w:r>
+        <w:rPr>
+          <w:b/>
+          <w:bCs/>
+          <w:lang w:val="nl"/>
+        </w:rPr>
+        <w:t xml:space="preserve">Nu draaien</w:t>
+      </w:r>
+      <w:r>
+        <w:rPr>
+          <w:lang w:val="nl"/>
+        </w:rPr>
+        <w:t xml:space="preserve">) en een inlogcode of bevestiging na iets wat de</w:t>
+      </w:r>
+      <w:r>
+        <w:rPr>
+          <w:lang w:val="nl"/>
+        </w:rPr>
+        <w:t xml:space="preserve"> </w:t>
+      </w:r>
+      <w:r>
+        <w:rPr>
+          <w:lang w:val="nl"/>
+        </w:rPr>
+        <w:t xml:space="preserve">sollicitant zelf doet, gaat altijd direct.</w:t>
       </w:r>
     </w:p>
     <w:p>

</xml_diff>